<commit_message>
Surat Perintah Penahanan; Surat Perintah Penangguhan Penahanan; Surat Perintah Pencabutan Penangguhan Penahanan; Surat Permintaan Perpanjangan Penahanan
</commit_message>
<xml_diff>
--- a/public/word-template/surat_perintah_penahanan.docx
+++ b/public/word-template/surat_perintah_penahanan.docx
@@ -9,7 +9,6 @@
         <w:tblBorders>
           <w:top w:val="none" w:sz="0" w:space="0" w:color="auto"/>
           <w:left w:val="none" w:sz="0" w:space="0" w:color="auto"/>
-          <w:bottom w:val="none" w:sz="0" w:space="0" w:color="auto"/>
           <w:right w:val="none" w:sz="0" w:space="0" w:color="auto"/>
           <w:insideH w:val="none" w:sz="0" w:space="0" w:color="auto"/>
           <w:insideV w:val="none" w:sz="0" w:space="0" w:color="auto"/>
@@ -47,63 +46,21 @@
                 <w:rFonts w:ascii="Arial Narrow" w:hAnsi="Arial Narrow"/>
               </w:rPr>
               <w:br/>
-              <w:t>DAERAH ${</w:t>
-            </w:r>
-            <w:proofErr w:type="spellStart"/>
-            <w:r>
-              <w:rPr>
-                <w:rFonts w:ascii="Arial Narrow" w:hAnsi="Arial Narrow"/>
-              </w:rPr>
-              <w:t>daerahPoliceFullName</w:t>
-            </w:r>
-            <w:proofErr w:type="spellEnd"/>
-            <w:r>
-              <w:rPr>
-                <w:rFonts w:ascii="Arial Narrow" w:hAnsi="Arial Narrow"/>
-              </w:rPr>
-              <w:t>}</w:t>
+              <w:t>DAERAH ${daerahPoliceFullName}</w:t>
             </w:r>
             <w:r>
               <w:rPr>
                 <w:rFonts w:ascii="Arial Narrow" w:hAnsi="Arial Narrow"/>
               </w:rPr>
               <w:br/>
-              <w:t>${</w:t>
-            </w:r>
-            <w:proofErr w:type="spellStart"/>
-            <w:r>
-              <w:rPr>
-                <w:rFonts w:ascii="Arial Narrow" w:hAnsi="Arial Narrow"/>
-              </w:rPr>
-              <w:t>resorPoliceFullName</w:t>
-            </w:r>
-            <w:proofErr w:type="spellEnd"/>
-            <w:r>
-              <w:rPr>
-                <w:rFonts w:ascii="Arial Narrow" w:hAnsi="Arial Narrow"/>
-              </w:rPr>
-              <w:t>}</w:t>
+              <w:t>${resorPoliceFullName}</w:t>
             </w:r>
             <w:r>
               <w:rPr>
                 <w:rFonts w:ascii="Arial Narrow" w:hAnsi="Arial Narrow"/>
               </w:rPr>
               <w:br/>
-              <w:t>${</w:t>
-            </w:r>
-            <w:proofErr w:type="spellStart"/>
-            <w:r>
-              <w:rPr>
-                <w:rFonts w:ascii="Arial Narrow" w:hAnsi="Arial Narrow"/>
-              </w:rPr>
-              <w:t>resorPoliceAddress</w:t>
-            </w:r>
-            <w:proofErr w:type="spellEnd"/>
-            <w:r>
-              <w:rPr>
-                <w:rFonts w:ascii="Arial Narrow" w:hAnsi="Arial Narrow"/>
-              </w:rPr>
-              <w:t>}</w:t>
+              <w:t>${resorPoliceAddress}</w:t>
             </w:r>
           </w:p>
         </w:tc>
@@ -150,7 +107,7 @@
           <w:noProof/>
         </w:rPr>
         <w:drawing>
-          <wp:inline distT="0" distB="0" distL="0" distR="0" wp14:anchorId="7944377A" wp14:editId="4690BCFC">
+          <wp:inline distT="0" distB="0" distL="0" distR="0" wp14:anchorId="7944377A" wp14:editId="2CD6D9AA">
             <wp:extent cx="738127" cy="690404"/>
             <wp:effectExtent l="0" t="0" r="5080" b="0"/>
             <wp:docPr id="6" name="Picture 6"/>
@@ -310,27 +267,11 @@
                       <w:rFonts w:ascii="Arial Narrow" w:hAnsi="Arial Narrow"/>
                     </w:rPr>
                   </w:pPr>
-                  <w:proofErr w:type="spellStart"/>
-                  <w:proofErr w:type="gramStart"/>
                   <w:r>
                     <w:rPr>
                       <w:rFonts w:ascii="Arial Narrow" w:hAnsi="Arial Narrow"/>
                     </w:rPr>
-                    <w:t>Nomor</w:t>
-                  </w:r>
-                  <w:proofErr w:type="spellEnd"/>
-                  <w:r>
-                    <w:rPr>
-                      <w:rFonts w:ascii="Arial Narrow" w:hAnsi="Arial Narrow"/>
-                    </w:rPr>
-                    <w:t xml:space="preserve"> :</w:t>
-                  </w:r>
-                  <w:proofErr w:type="gramEnd"/>
-                  <w:r>
-                    <w:rPr>
-                      <w:rFonts w:ascii="Arial Narrow" w:hAnsi="Arial Narrow"/>
-                    </w:rPr>
-                    <w:t xml:space="preserve"> </w:t>
+                    <w:t xml:space="preserve">Nomor : </w:t>
                   </w:r>
                   <w:r>
                     <w:rPr>
@@ -338,14 +279,12 @@
                     </w:rPr>
                     <w:t>${</w:t>
                   </w:r>
-                  <w:proofErr w:type="spellStart"/>
                   <w:r>
                     <w:rPr>
                       <w:rFonts w:ascii="Arial Narrow" w:hAnsi="Arial Narrow"/>
                     </w:rPr>
                     <w:t>documentNumber</w:t>
                   </w:r>
-                  <w:proofErr w:type="spellEnd"/>
                   <w:r>
                     <w:rPr>
                       <w:rFonts w:ascii="Arial Narrow" w:hAnsi="Arial Narrow"/>
@@ -395,14 +334,12 @@
                 <w:rFonts w:ascii="Arial Narrow" w:hAnsi="Arial Narrow"/>
               </w:rPr>
             </w:pPr>
-            <w:proofErr w:type="spellStart"/>
             <w:r>
               <w:rPr>
                 <w:rFonts w:ascii="Arial Narrow" w:hAnsi="Arial Narrow"/>
               </w:rPr>
               <w:t>Pertimbangan</w:t>
             </w:r>
-            <w:proofErr w:type="spellEnd"/>
           </w:p>
         </w:tc>
         <w:tc>
@@ -435,845 +372,72 @@
                 <w:rFonts w:ascii="Arial Narrow" w:hAnsi="Arial Narrow"/>
               </w:rPr>
             </w:pPr>
-            <w:proofErr w:type="spellStart"/>
-            <w:r>
-              <w:rPr>
-                <w:rFonts w:ascii="Arial Narrow" w:hAnsi="Arial Narrow"/>
-              </w:rPr>
-              <w:t>bahwa</w:t>
-            </w:r>
-            <w:proofErr w:type="spellEnd"/>
-            <w:r>
-              <w:rPr>
-                <w:rFonts w:ascii="Arial Narrow" w:hAnsi="Arial Narrow"/>
-              </w:rPr>
-              <w:t xml:space="preserve"> </w:t>
-            </w:r>
-            <w:proofErr w:type="spellStart"/>
-            <w:r>
-              <w:rPr>
-                <w:rFonts w:ascii="Arial Narrow" w:hAnsi="Arial Narrow"/>
-              </w:rPr>
-              <w:t>dalam</w:t>
-            </w:r>
-            <w:proofErr w:type="spellEnd"/>
-            <w:r>
-              <w:rPr>
-                <w:rFonts w:ascii="Arial Narrow" w:hAnsi="Arial Narrow"/>
-              </w:rPr>
-              <w:t xml:space="preserve"> </w:t>
-            </w:r>
-            <w:proofErr w:type="spellStart"/>
-            <w:r>
-              <w:rPr>
-                <w:rFonts w:ascii="Arial Narrow" w:hAnsi="Arial Narrow"/>
-              </w:rPr>
-              <w:t>rangka</w:t>
-            </w:r>
-            <w:proofErr w:type="spellEnd"/>
-            <w:r>
-              <w:rPr>
-                <w:rFonts w:ascii="Arial Narrow" w:hAnsi="Arial Narrow"/>
-              </w:rPr>
-              <w:t xml:space="preserve"> </w:t>
-            </w:r>
-            <w:proofErr w:type="spellStart"/>
-            <w:r>
-              <w:rPr>
-                <w:rFonts w:ascii="Arial Narrow" w:hAnsi="Arial Narrow"/>
-              </w:rPr>
-              <w:t>kepentingan</w:t>
-            </w:r>
-            <w:proofErr w:type="spellEnd"/>
-            <w:r>
-              <w:rPr>
-                <w:rFonts w:ascii="Arial Narrow" w:hAnsi="Arial Narrow"/>
-              </w:rPr>
-              <w:t xml:space="preserve"> </w:t>
-            </w:r>
-            <w:proofErr w:type="spellStart"/>
-            <w:r>
-              <w:rPr>
-                <w:rFonts w:ascii="Arial Narrow" w:hAnsi="Arial Narrow"/>
-              </w:rPr>
-              <w:t>penyidikan</w:t>
-            </w:r>
-            <w:proofErr w:type="spellEnd"/>
-            <w:r>
-              <w:rPr>
-                <w:rFonts w:ascii="Arial Narrow" w:hAnsi="Arial Narrow"/>
-              </w:rPr>
-              <w:t xml:space="preserve"> dan </w:t>
-            </w:r>
-            <w:proofErr w:type="spellStart"/>
-            <w:r>
-              <w:rPr>
-                <w:rFonts w:ascii="Arial Narrow" w:hAnsi="Arial Narrow"/>
-              </w:rPr>
-              <w:t>berdasarkan</w:t>
-            </w:r>
-            <w:proofErr w:type="spellEnd"/>
-            <w:r>
-              <w:rPr>
-                <w:rFonts w:ascii="Arial Narrow" w:hAnsi="Arial Narrow"/>
-              </w:rPr>
-              <w:t xml:space="preserve"> </w:t>
-            </w:r>
-            <w:proofErr w:type="spellStart"/>
-            <w:r>
-              <w:rPr>
-                <w:rFonts w:ascii="Arial Narrow" w:hAnsi="Arial Narrow"/>
-              </w:rPr>
-              <w:t>hasil</w:t>
-            </w:r>
-            <w:proofErr w:type="spellEnd"/>
-            <w:r>
-              <w:rPr>
-                <w:rFonts w:ascii="Arial Narrow" w:hAnsi="Arial Narrow"/>
-              </w:rPr>
-              <w:t xml:space="preserve"> </w:t>
-            </w:r>
-            <w:proofErr w:type="spellStart"/>
-            <w:r>
-              <w:rPr>
-                <w:rFonts w:ascii="Arial Narrow" w:hAnsi="Arial Narrow"/>
-              </w:rPr>
-              <w:t>pemeriksaan</w:t>
-            </w:r>
-            <w:proofErr w:type="spellEnd"/>
-            <w:r>
-              <w:rPr>
-                <w:rFonts w:ascii="Arial Narrow" w:hAnsi="Arial Narrow"/>
-              </w:rPr>
-              <w:t xml:space="preserve">, </w:t>
-            </w:r>
-            <w:proofErr w:type="spellStart"/>
-            <w:r>
-              <w:rPr>
-                <w:rFonts w:ascii="Arial Narrow" w:hAnsi="Arial Narrow"/>
-              </w:rPr>
-              <w:t>tersangk</w:t>
-            </w:r>
-            <w:r>
-              <w:rPr>
-                <w:rFonts w:ascii="Arial Narrow" w:hAnsi="Arial Narrow"/>
-              </w:rPr>
-              <w:t>a</w:t>
-            </w:r>
-            <w:proofErr w:type="spellEnd"/>
-            <w:r>
-              <w:rPr>
-                <w:rFonts w:ascii="Arial Narrow" w:hAnsi="Arial Narrow"/>
-              </w:rPr>
-              <w:t xml:space="preserve"> </w:t>
-            </w:r>
-            <w:proofErr w:type="spellStart"/>
-            <w:r>
-              <w:rPr>
-                <w:rFonts w:ascii="Arial Narrow" w:hAnsi="Arial Narrow"/>
-              </w:rPr>
-              <w:t>diduga</w:t>
-            </w:r>
-            <w:proofErr w:type="spellEnd"/>
-            <w:r>
-              <w:rPr>
-                <w:rFonts w:ascii="Arial Narrow" w:hAnsi="Arial Narrow"/>
-              </w:rPr>
-              <w:t xml:space="preserve"> </w:t>
-            </w:r>
-            <w:proofErr w:type="spellStart"/>
-            <w:r>
-              <w:rPr>
-                <w:rFonts w:ascii="Arial Narrow" w:hAnsi="Arial Narrow"/>
-              </w:rPr>
-              <w:t>melakukan</w:t>
-            </w:r>
-            <w:proofErr w:type="spellEnd"/>
-            <w:r>
-              <w:rPr>
-                <w:rFonts w:ascii="Arial Narrow" w:hAnsi="Arial Narrow"/>
-              </w:rPr>
-              <w:t xml:space="preserve"> </w:t>
-            </w:r>
-            <w:proofErr w:type="spellStart"/>
-            <w:r>
-              <w:rPr>
-                <w:rFonts w:ascii="Arial Narrow" w:hAnsi="Arial Narrow"/>
-              </w:rPr>
-              <w:t>tindak</w:t>
-            </w:r>
-            <w:proofErr w:type="spellEnd"/>
-            <w:r>
-              <w:rPr>
-                <w:rFonts w:ascii="Arial Narrow" w:hAnsi="Arial Narrow"/>
-              </w:rPr>
-              <w:t xml:space="preserve"> </w:t>
-            </w:r>
-            <w:proofErr w:type="spellStart"/>
-            <w:r>
-              <w:rPr>
-                <w:rFonts w:ascii="Arial Narrow" w:hAnsi="Arial Narrow"/>
-              </w:rPr>
-              <w:t>pidana</w:t>
-            </w:r>
-            <w:proofErr w:type="spellEnd"/>
-            <w:r>
-              <w:rPr>
-                <w:rFonts w:ascii="Arial Narrow" w:hAnsi="Arial Narrow"/>
-              </w:rPr>
-              <w:t xml:space="preserve"> </w:t>
-            </w:r>
-            <w:proofErr w:type="spellStart"/>
-            <w:r>
-              <w:rPr>
-                <w:rFonts w:ascii="Arial Narrow" w:hAnsi="Arial Narrow"/>
-              </w:rPr>
-              <w:t>berdasarkan</w:t>
-            </w:r>
-            <w:proofErr w:type="spellEnd"/>
-            <w:r>
-              <w:rPr>
-                <w:rFonts w:ascii="Arial Narrow" w:hAnsi="Arial Narrow"/>
-              </w:rPr>
-              <w:t xml:space="preserve"> minimal 2 (dua) </w:t>
-            </w:r>
-            <w:proofErr w:type="spellStart"/>
-            <w:r>
-              <w:rPr>
-                <w:rFonts w:ascii="Arial Narrow" w:hAnsi="Arial Narrow"/>
-              </w:rPr>
-              <w:t>alat</w:t>
-            </w:r>
-            <w:proofErr w:type="spellEnd"/>
-            <w:r>
-              <w:rPr>
-                <w:rFonts w:ascii="Arial Narrow" w:hAnsi="Arial Narrow"/>
-              </w:rPr>
-              <w:t xml:space="preserve"> </w:t>
-            </w:r>
-            <w:proofErr w:type="spellStart"/>
-            <w:r>
-              <w:rPr>
-                <w:rFonts w:ascii="Arial Narrow" w:hAnsi="Arial Narrow"/>
-              </w:rPr>
-              <w:t>bukti</w:t>
-            </w:r>
-            <w:proofErr w:type="spellEnd"/>
-            <w:r>
-              <w:rPr>
-                <w:rFonts w:ascii="Arial Narrow" w:hAnsi="Arial Narrow"/>
-              </w:rPr>
-              <w:t xml:space="preserve"> yang </w:t>
-            </w:r>
-            <w:proofErr w:type="spellStart"/>
-            <w:r>
-              <w:rPr>
-                <w:rFonts w:ascii="Arial Narrow" w:hAnsi="Arial Narrow"/>
-              </w:rPr>
-              <w:t>sah</w:t>
-            </w:r>
-            <w:proofErr w:type="spellEnd"/>
-            <w:r>
-              <w:rPr>
-                <w:rFonts w:ascii="Arial Narrow" w:hAnsi="Arial Narrow"/>
-              </w:rPr>
-              <w:t xml:space="preserve">, </w:t>
-            </w:r>
-            <w:proofErr w:type="spellStart"/>
-            <w:r>
-              <w:rPr>
-                <w:rFonts w:ascii="Arial Narrow" w:hAnsi="Arial Narrow"/>
-              </w:rPr>
-              <w:t>jika</w:t>
-            </w:r>
-            <w:proofErr w:type="spellEnd"/>
-            <w:r>
-              <w:rPr>
-                <w:rFonts w:ascii="Arial Narrow" w:hAnsi="Arial Narrow"/>
-              </w:rPr>
-              <w:t xml:space="preserve"> </w:t>
-            </w:r>
-            <w:proofErr w:type="spellStart"/>
-            <w:r>
-              <w:rPr>
-                <w:rFonts w:ascii="Arial Narrow" w:hAnsi="Arial Narrow"/>
-              </w:rPr>
-              <w:t>tersangka</w:t>
-            </w:r>
-            <w:proofErr w:type="spellEnd"/>
-            <w:r>
-              <w:rPr>
-                <w:rFonts w:ascii="Arial Narrow" w:hAnsi="Arial Narrow"/>
-              </w:rPr>
-              <w:t xml:space="preserve">: </w:t>
-            </w:r>
-            <w:proofErr w:type="spellStart"/>
-            <w:r>
-              <w:rPr>
-                <w:rFonts w:ascii="Arial Narrow" w:hAnsi="Arial Narrow"/>
-              </w:rPr>
-              <w:t>mengabaikan</w:t>
-            </w:r>
-            <w:proofErr w:type="spellEnd"/>
-            <w:r>
-              <w:rPr>
-                <w:rFonts w:ascii="Arial Narrow" w:hAnsi="Arial Narrow"/>
-              </w:rPr>
-              <w:t xml:space="preserve"> </w:t>
-            </w:r>
-            <w:proofErr w:type="spellStart"/>
-            <w:r>
-              <w:rPr>
-                <w:rFonts w:ascii="Arial Narrow" w:hAnsi="Arial Narrow"/>
-              </w:rPr>
-              <w:t>panggilan</w:t>
-            </w:r>
-            <w:proofErr w:type="spellEnd"/>
-            <w:r>
-              <w:rPr>
-                <w:rFonts w:ascii="Arial Narrow" w:hAnsi="Arial Narrow"/>
-              </w:rPr>
-              <w:t xml:space="preserve"> </w:t>
-            </w:r>
-            <w:proofErr w:type="spellStart"/>
-            <w:r>
-              <w:rPr>
-                <w:rFonts w:ascii="Arial Narrow" w:hAnsi="Arial Narrow"/>
-              </w:rPr>
-              <w:t>penyidik</w:t>
-            </w:r>
-            <w:proofErr w:type="spellEnd"/>
-            <w:r>
-              <w:rPr>
-                <w:rFonts w:ascii="Arial Narrow" w:hAnsi="Arial Narrow"/>
-              </w:rPr>
-              <w:t xml:space="preserve"> </w:t>
-            </w:r>
-            <w:proofErr w:type="spellStart"/>
-            <w:r>
-              <w:rPr>
-                <w:rFonts w:ascii="Arial Narrow" w:hAnsi="Arial Narrow"/>
-              </w:rPr>
-              <w:t>sebanyak</w:t>
-            </w:r>
-            <w:proofErr w:type="spellEnd"/>
-            <w:r>
-              <w:rPr>
-                <w:rFonts w:ascii="Arial Narrow" w:hAnsi="Arial Narrow"/>
-              </w:rPr>
-              <w:t xml:space="preserve"> 2 (dua) kali </w:t>
-            </w:r>
-            <w:proofErr w:type="spellStart"/>
-            <w:r>
-              <w:rPr>
-                <w:rFonts w:ascii="Arial Narrow" w:hAnsi="Arial Narrow"/>
-              </w:rPr>
-              <w:t>berturut-turut</w:t>
-            </w:r>
-            <w:proofErr w:type="spellEnd"/>
-            <w:r>
-              <w:rPr>
-                <w:rFonts w:ascii="Arial Narrow" w:hAnsi="Arial Narrow"/>
-              </w:rPr>
-              <w:t xml:space="preserve"> </w:t>
-            </w:r>
-            <w:proofErr w:type="spellStart"/>
-            <w:r>
-              <w:rPr>
-                <w:rFonts w:ascii="Arial Narrow" w:hAnsi="Arial Narrow"/>
-              </w:rPr>
-              <w:t>tanpa</w:t>
-            </w:r>
-            <w:proofErr w:type="spellEnd"/>
-            <w:r>
-              <w:rPr>
-                <w:rFonts w:ascii="Arial Narrow" w:hAnsi="Arial Narrow"/>
-              </w:rPr>
-              <w:t xml:space="preserve"> </w:t>
-            </w:r>
-            <w:proofErr w:type="spellStart"/>
-            <w:r>
-              <w:rPr>
-                <w:rFonts w:ascii="Arial Narrow" w:hAnsi="Arial Narrow"/>
-              </w:rPr>
-              <w:t>alasan</w:t>
-            </w:r>
-            <w:proofErr w:type="spellEnd"/>
-            <w:r>
-              <w:rPr>
-                <w:rFonts w:ascii="Arial Narrow" w:hAnsi="Arial Narrow"/>
-              </w:rPr>
-              <w:t xml:space="preserve"> yang </w:t>
-            </w:r>
-            <w:proofErr w:type="spellStart"/>
-            <w:r>
-              <w:rPr>
-                <w:rFonts w:ascii="Arial Narrow" w:hAnsi="Arial Narrow"/>
-              </w:rPr>
-              <w:t>sah</w:t>
-            </w:r>
-            <w:proofErr w:type="spellEnd"/>
-            <w:r>
-              <w:rPr>
-                <w:rFonts w:ascii="Arial Narrow" w:hAnsi="Arial Narrow"/>
-              </w:rPr>
-              <w:t xml:space="preserve"> </w:t>
-            </w:r>
-            <w:proofErr w:type="spellStart"/>
-            <w:r>
-              <w:rPr>
-                <w:rFonts w:ascii="Arial Narrow" w:hAnsi="Arial Narrow"/>
-              </w:rPr>
-              <w:t>atau</w:t>
-            </w:r>
-            <w:proofErr w:type="spellEnd"/>
-            <w:r>
-              <w:rPr>
-                <w:rFonts w:ascii="Arial Narrow" w:hAnsi="Arial Narrow"/>
-              </w:rPr>
-              <w:t xml:space="preserve"> </w:t>
-            </w:r>
-            <w:proofErr w:type="spellStart"/>
-            <w:r>
-              <w:rPr>
-                <w:rFonts w:ascii="Arial Narrow" w:hAnsi="Arial Narrow"/>
-              </w:rPr>
-              <w:t>memberikan</w:t>
-            </w:r>
-            <w:proofErr w:type="spellEnd"/>
-            <w:r>
-              <w:rPr>
-                <w:rFonts w:ascii="Arial Narrow" w:hAnsi="Arial Narrow"/>
-              </w:rPr>
-              <w:t xml:space="preserve"> </w:t>
-            </w:r>
-            <w:proofErr w:type="spellStart"/>
-            <w:r>
-              <w:rPr>
-                <w:rFonts w:ascii="Arial Narrow" w:hAnsi="Arial Narrow"/>
-              </w:rPr>
-              <w:t>informasi</w:t>
-            </w:r>
-            <w:proofErr w:type="spellEnd"/>
-            <w:r>
-              <w:rPr>
-                <w:rFonts w:ascii="Arial Narrow" w:hAnsi="Arial Narrow"/>
-              </w:rPr>
-              <w:t xml:space="preserve"> </w:t>
-            </w:r>
-            <w:proofErr w:type="spellStart"/>
-            <w:r>
-              <w:rPr>
-                <w:rFonts w:ascii="Arial Narrow" w:hAnsi="Arial Narrow"/>
-              </w:rPr>
-              <w:t>tidak</w:t>
-            </w:r>
-            <w:proofErr w:type="spellEnd"/>
-            <w:r>
-              <w:rPr>
-                <w:rFonts w:ascii="Arial Narrow" w:hAnsi="Arial Narrow"/>
-              </w:rPr>
-              <w:t xml:space="preserve"> </w:t>
-            </w:r>
-            <w:proofErr w:type="spellStart"/>
-            <w:r>
-              <w:rPr>
-                <w:rFonts w:ascii="Arial Narrow" w:hAnsi="Arial Narrow"/>
-              </w:rPr>
-              <w:t>sesuai</w:t>
-            </w:r>
-            <w:proofErr w:type="spellEnd"/>
-            <w:r>
-              <w:rPr>
-                <w:rFonts w:ascii="Arial Narrow" w:hAnsi="Arial Narrow"/>
-              </w:rPr>
-              <w:t xml:space="preserve"> </w:t>
-            </w:r>
-            <w:proofErr w:type="spellStart"/>
-            <w:r>
-              <w:rPr>
-                <w:rFonts w:ascii="Arial Narrow" w:hAnsi="Arial Narrow"/>
-              </w:rPr>
-              <w:t>fakta</w:t>
-            </w:r>
-            <w:proofErr w:type="spellEnd"/>
-            <w:r>
-              <w:rPr>
-                <w:rFonts w:ascii="Arial Narrow" w:hAnsi="Arial Narrow"/>
-              </w:rPr>
-              <w:t xml:space="preserve"> pada </w:t>
-            </w:r>
-            <w:proofErr w:type="spellStart"/>
-            <w:r>
-              <w:rPr>
-                <w:rFonts w:ascii="Arial Narrow" w:hAnsi="Arial Narrow"/>
-              </w:rPr>
-              <w:t>saat</w:t>
-            </w:r>
-            <w:proofErr w:type="spellEnd"/>
-            <w:r>
-              <w:rPr>
-                <w:rFonts w:ascii="Arial Narrow" w:hAnsi="Arial Narrow"/>
-              </w:rPr>
-              <w:t xml:space="preserve"> </w:t>
-            </w:r>
-            <w:proofErr w:type="spellStart"/>
-            <w:r>
-              <w:rPr>
-                <w:rFonts w:ascii="Arial Narrow" w:hAnsi="Arial Narrow"/>
-              </w:rPr>
-              <w:t>pemeriksaan</w:t>
-            </w:r>
-            <w:proofErr w:type="spellEnd"/>
-            <w:r>
-              <w:rPr>
-                <w:rFonts w:ascii="Arial Narrow" w:hAnsi="Arial Narrow"/>
-              </w:rPr>
-              <w:t xml:space="preserve"> </w:t>
-            </w:r>
-            <w:proofErr w:type="spellStart"/>
-            <w:r>
-              <w:rPr>
-                <w:rFonts w:ascii="Arial Narrow" w:hAnsi="Arial Narrow"/>
-              </w:rPr>
-              <w:t>atau</w:t>
-            </w:r>
-            <w:proofErr w:type="spellEnd"/>
-            <w:r>
-              <w:rPr>
-                <w:rFonts w:ascii="Arial Narrow" w:hAnsi="Arial Narrow"/>
-              </w:rPr>
-              <w:t xml:space="preserve"> </w:t>
-            </w:r>
-            <w:proofErr w:type="spellStart"/>
-            <w:r>
-              <w:rPr>
-                <w:rFonts w:ascii="Arial Narrow" w:hAnsi="Arial Narrow"/>
-              </w:rPr>
-              <w:t>menghambat</w:t>
-            </w:r>
-            <w:proofErr w:type="spellEnd"/>
-            <w:r>
-              <w:rPr>
-                <w:rFonts w:ascii="Arial Narrow" w:hAnsi="Arial Narrow"/>
-              </w:rPr>
-              <w:t xml:space="preserve"> pros</w:t>
-            </w:r>
-            <w:r>
-              <w:rPr>
-                <w:rFonts w:ascii="Arial Narrow" w:hAnsi="Arial Narrow"/>
-              </w:rPr>
-              <w:t xml:space="preserve">es </w:t>
-            </w:r>
-            <w:proofErr w:type="spellStart"/>
-            <w:r>
-              <w:rPr>
-                <w:rFonts w:ascii="Arial Narrow" w:hAnsi="Arial Narrow"/>
-              </w:rPr>
-              <w:t>pemeriksaan</w:t>
-            </w:r>
-            <w:proofErr w:type="spellEnd"/>
-            <w:r>
-              <w:rPr>
-                <w:rFonts w:ascii="Arial Narrow" w:hAnsi="Arial Narrow"/>
-              </w:rPr>
-              <w:t xml:space="preserve"> </w:t>
-            </w:r>
-            <w:proofErr w:type="spellStart"/>
-            <w:r>
-              <w:rPr>
-                <w:rFonts w:ascii="Arial Narrow" w:hAnsi="Arial Narrow"/>
-              </w:rPr>
-              <w:t>atau</w:t>
-            </w:r>
-            <w:proofErr w:type="spellEnd"/>
-            <w:r>
-              <w:rPr>
-                <w:rFonts w:ascii="Arial Narrow" w:hAnsi="Arial Narrow"/>
-              </w:rPr>
-              <w:t xml:space="preserve"> </w:t>
-            </w:r>
-            <w:proofErr w:type="spellStart"/>
-            <w:r>
-              <w:rPr>
-                <w:rFonts w:ascii="Arial Narrow" w:hAnsi="Arial Narrow"/>
-              </w:rPr>
-              <w:t>berupaya</w:t>
-            </w:r>
-            <w:proofErr w:type="spellEnd"/>
-            <w:r>
-              <w:rPr>
-                <w:rFonts w:ascii="Arial Narrow" w:hAnsi="Arial Narrow"/>
-              </w:rPr>
-              <w:t xml:space="preserve"> </w:t>
-            </w:r>
-            <w:proofErr w:type="spellStart"/>
-            <w:r>
-              <w:rPr>
-                <w:rFonts w:ascii="Arial Narrow" w:hAnsi="Arial Narrow"/>
-              </w:rPr>
-              <w:t>melarikan</w:t>
-            </w:r>
-            <w:proofErr w:type="spellEnd"/>
-            <w:r>
-              <w:rPr>
-                <w:rFonts w:ascii="Arial Narrow" w:hAnsi="Arial Narrow"/>
-              </w:rPr>
-              <w:t xml:space="preserve"> </w:t>
-            </w:r>
-            <w:proofErr w:type="spellStart"/>
-            <w:r>
-              <w:rPr>
-                <w:rFonts w:ascii="Arial Narrow" w:hAnsi="Arial Narrow"/>
-              </w:rPr>
-              <w:t>diri</w:t>
-            </w:r>
-            <w:proofErr w:type="spellEnd"/>
-            <w:r>
-              <w:rPr>
-                <w:rFonts w:ascii="Arial Narrow" w:hAnsi="Arial Narrow"/>
-              </w:rPr>
-              <w:t xml:space="preserve"> </w:t>
-            </w:r>
-            <w:proofErr w:type="spellStart"/>
-            <w:r>
-              <w:rPr>
-                <w:rFonts w:ascii="Arial Narrow" w:hAnsi="Arial Narrow"/>
-              </w:rPr>
-              <w:t>atau</w:t>
-            </w:r>
-            <w:proofErr w:type="spellEnd"/>
-            <w:r>
-              <w:rPr>
-                <w:rFonts w:ascii="Arial Narrow" w:hAnsi="Arial Narrow"/>
-              </w:rPr>
-              <w:t xml:space="preserve"> </w:t>
-            </w:r>
-            <w:proofErr w:type="spellStart"/>
-            <w:r>
-              <w:rPr>
-                <w:rFonts w:ascii="Arial Narrow" w:hAnsi="Arial Narrow"/>
-              </w:rPr>
-              <w:t>berupaya</w:t>
-            </w:r>
-            <w:proofErr w:type="spellEnd"/>
-            <w:r>
-              <w:rPr>
-                <w:rFonts w:ascii="Arial Narrow" w:hAnsi="Arial Narrow"/>
-              </w:rPr>
-              <w:t xml:space="preserve"> </w:t>
-            </w:r>
-            <w:proofErr w:type="spellStart"/>
-            <w:r>
-              <w:rPr>
-                <w:rFonts w:ascii="Arial Narrow" w:hAnsi="Arial Narrow"/>
-              </w:rPr>
-              <w:t>merusak</w:t>
-            </w:r>
-            <w:proofErr w:type="spellEnd"/>
-            <w:r>
-              <w:rPr>
-                <w:rFonts w:ascii="Arial Narrow" w:hAnsi="Arial Narrow"/>
-              </w:rPr>
-              <w:t xml:space="preserve"> dan </w:t>
-            </w:r>
-            <w:proofErr w:type="spellStart"/>
-            <w:r>
-              <w:rPr>
-                <w:rFonts w:ascii="Arial Narrow" w:hAnsi="Arial Narrow"/>
-              </w:rPr>
-              <w:t>menghilangkan</w:t>
-            </w:r>
-            <w:proofErr w:type="spellEnd"/>
-            <w:r>
-              <w:rPr>
-                <w:rFonts w:ascii="Arial Narrow" w:hAnsi="Arial Narrow"/>
-              </w:rPr>
-              <w:t xml:space="preserve"> </w:t>
-            </w:r>
-            <w:proofErr w:type="spellStart"/>
-            <w:r>
-              <w:rPr>
-                <w:rFonts w:ascii="Arial Narrow" w:hAnsi="Arial Narrow"/>
-              </w:rPr>
-              <w:t>barang</w:t>
-            </w:r>
-            <w:proofErr w:type="spellEnd"/>
-            <w:r>
-              <w:rPr>
-                <w:rFonts w:ascii="Arial Narrow" w:hAnsi="Arial Narrow"/>
-              </w:rPr>
-              <w:t xml:space="preserve"> </w:t>
-            </w:r>
-            <w:proofErr w:type="spellStart"/>
-            <w:r>
-              <w:rPr>
-                <w:rFonts w:ascii="Arial Narrow" w:hAnsi="Arial Narrow"/>
-              </w:rPr>
-              <w:t>bukti</w:t>
-            </w:r>
-            <w:proofErr w:type="spellEnd"/>
-            <w:r>
-              <w:rPr>
-                <w:rFonts w:ascii="Arial Narrow" w:hAnsi="Arial Narrow"/>
-              </w:rPr>
-              <w:t xml:space="preserve"> </w:t>
-            </w:r>
-            <w:proofErr w:type="spellStart"/>
-            <w:r>
-              <w:rPr>
-                <w:rFonts w:ascii="Arial Narrow" w:hAnsi="Arial Narrow"/>
-              </w:rPr>
-              <w:t>atau</w:t>
-            </w:r>
-            <w:proofErr w:type="spellEnd"/>
-            <w:r>
-              <w:rPr>
-                <w:rFonts w:ascii="Arial Narrow" w:hAnsi="Arial Narrow"/>
-              </w:rPr>
-              <w:t xml:space="preserve"> </w:t>
-            </w:r>
-            <w:proofErr w:type="spellStart"/>
-            <w:r>
-              <w:rPr>
-                <w:rFonts w:ascii="Arial Narrow" w:hAnsi="Arial Narrow"/>
-              </w:rPr>
-              <w:t>melakukan</w:t>
-            </w:r>
-            <w:proofErr w:type="spellEnd"/>
-            <w:r>
-              <w:rPr>
-                <w:rFonts w:ascii="Arial Narrow" w:hAnsi="Arial Narrow"/>
-              </w:rPr>
-              <w:t xml:space="preserve"> </w:t>
-            </w:r>
-            <w:proofErr w:type="spellStart"/>
-            <w:r>
-              <w:rPr>
-                <w:rFonts w:ascii="Arial Narrow" w:hAnsi="Arial Narrow"/>
-              </w:rPr>
-              <w:t>ulang</w:t>
-            </w:r>
-            <w:proofErr w:type="spellEnd"/>
-            <w:r>
-              <w:rPr>
-                <w:rFonts w:ascii="Arial Narrow" w:hAnsi="Arial Narrow"/>
-              </w:rPr>
-              <w:t xml:space="preserve"> </w:t>
-            </w:r>
-            <w:proofErr w:type="spellStart"/>
-            <w:r>
-              <w:rPr>
-                <w:rFonts w:ascii="Arial Narrow" w:hAnsi="Arial Narrow"/>
-              </w:rPr>
-              <w:t>tindak</w:t>
-            </w:r>
-            <w:proofErr w:type="spellEnd"/>
-            <w:r>
-              <w:rPr>
-                <w:rFonts w:ascii="Arial Narrow" w:hAnsi="Arial Narrow"/>
-              </w:rPr>
-              <w:t xml:space="preserve"> </w:t>
-            </w:r>
-            <w:proofErr w:type="spellStart"/>
-            <w:r>
-              <w:rPr>
-                <w:rFonts w:ascii="Arial Narrow" w:hAnsi="Arial Narrow"/>
-              </w:rPr>
-              <w:t>pidana</w:t>
-            </w:r>
-            <w:proofErr w:type="spellEnd"/>
-            <w:r>
-              <w:rPr>
-                <w:rFonts w:ascii="Arial Narrow" w:hAnsi="Arial Narrow"/>
-              </w:rPr>
-              <w:t xml:space="preserve"> </w:t>
-            </w:r>
-            <w:proofErr w:type="spellStart"/>
-            <w:r>
-              <w:rPr>
-                <w:rFonts w:ascii="Arial Narrow" w:hAnsi="Arial Narrow"/>
-              </w:rPr>
-              <w:t>atau</w:t>
-            </w:r>
-            <w:proofErr w:type="spellEnd"/>
-            <w:r>
-              <w:rPr>
-                <w:rFonts w:ascii="Arial Narrow" w:hAnsi="Arial Narrow"/>
-              </w:rPr>
-              <w:t xml:space="preserve"> </w:t>
-            </w:r>
-            <w:proofErr w:type="spellStart"/>
-            <w:r>
-              <w:rPr>
-                <w:rFonts w:ascii="Arial Narrow" w:hAnsi="Arial Narrow"/>
-              </w:rPr>
-              <w:t>terancam</w:t>
-            </w:r>
-            <w:proofErr w:type="spellEnd"/>
-            <w:r>
-              <w:rPr>
-                <w:rFonts w:ascii="Arial Narrow" w:hAnsi="Arial Narrow"/>
-              </w:rPr>
-              <w:t xml:space="preserve"> </w:t>
-            </w:r>
-            <w:proofErr w:type="spellStart"/>
-            <w:r>
-              <w:rPr>
-                <w:rFonts w:ascii="Arial Narrow" w:hAnsi="Arial Narrow"/>
-              </w:rPr>
-              <w:t>keselamatannya</w:t>
-            </w:r>
-            <w:proofErr w:type="spellEnd"/>
-            <w:r>
-              <w:rPr>
-                <w:rFonts w:ascii="Arial Narrow" w:hAnsi="Arial Narrow"/>
-              </w:rPr>
-              <w:t xml:space="preserve"> </w:t>
-            </w:r>
-            <w:proofErr w:type="spellStart"/>
-            <w:r>
-              <w:rPr>
-                <w:rFonts w:ascii="Arial Narrow" w:hAnsi="Arial Narrow"/>
-              </w:rPr>
-              <w:t>atas</w:t>
-            </w:r>
-            <w:proofErr w:type="spellEnd"/>
-            <w:r>
-              <w:rPr>
-                <w:rFonts w:ascii="Arial Narrow" w:hAnsi="Arial Narrow"/>
-              </w:rPr>
-              <w:t xml:space="preserve"> </w:t>
-            </w:r>
-            <w:proofErr w:type="spellStart"/>
-            <w:r>
-              <w:rPr>
-                <w:rFonts w:ascii="Arial Narrow" w:hAnsi="Arial Narrow"/>
-              </w:rPr>
-              <w:t>persetujuaan</w:t>
-            </w:r>
-            <w:proofErr w:type="spellEnd"/>
-            <w:r>
-              <w:rPr>
-                <w:rFonts w:ascii="Arial Narrow" w:hAnsi="Arial Narrow"/>
-              </w:rPr>
-              <w:t xml:space="preserve"> </w:t>
-            </w:r>
-            <w:proofErr w:type="spellStart"/>
-            <w:r>
-              <w:rPr>
-                <w:rFonts w:ascii="Arial Narrow" w:hAnsi="Arial Narrow"/>
-              </w:rPr>
-              <w:t>atau</w:t>
-            </w:r>
-            <w:proofErr w:type="spellEnd"/>
-            <w:r>
-              <w:rPr>
-                <w:rFonts w:ascii="Arial Narrow" w:hAnsi="Arial Narrow"/>
-              </w:rPr>
-              <w:t xml:space="preserve"> </w:t>
-            </w:r>
-            <w:proofErr w:type="spellStart"/>
+            <w:r>
+              <w:rPr>
+                <w:rFonts w:ascii="Arial Narrow" w:hAnsi="Arial Narrow"/>
+              </w:rPr>
+              <w:t xml:space="preserve">bahwa dalam rangka kepentingan </w:t>
+            </w:r>
+            <w:r>
+              <w:rPr>
+                <w:rFonts w:ascii="Arial Narrow" w:hAnsi="Arial Narrow"/>
+              </w:rPr>
+              <w:t>penyidikan dan berdasarkan hasil pemeriksaan, tersangk</w:t>
+            </w:r>
+            <w:r>
+              <w:rPr>
+                <w:rFonts w:ascii="Arial Narrow" w:hAnsi="Arial Narrow"/>
+              </w:rPr>
+              <w:t xml:space="preserve">a diduga melakukan tindak pidana berdasarkan minimal 2 (dua) </w:t>
+            </w:r>
+            <w:r>
+              <w:rPr>
+                <w:rFonts w:ascii="Arial Narrow" w:hAnsi="Arial Narrow"/>
+              </w:rPr>
+              <w:t>alat bukti yang sah, jika tersangka: mengabaikan panggilan penyidik</w:t>
+            </w:r>
+            <w:r>
+              <w:rPr>
+                <w:rFonts w:ascii="Arial Narrow" w:hAnsi="Arial Narrow"/>
+              </w:rPr>
+              <w:t xml:space="preserve"> sebanyak 2 (dua) kali berturut-turut tanpa alasan yang sah atau memberikan informasi tidak sesuai fakta pada saat pemeriksaan atau menghambat pros</w:t>
+            </w:r>
+            <w:r>
+              <w:rPr>
+                <w:rFonts w:ascii="Arial Narrow" w:hAnsi="Arial Narrow"/>
+              </w:rPr>
+              <w:t xml:space="preserve">es pemeriksaan atau berupaya melarikan </w:t>
+            </w:r>
+            <w:r>
+              <w:rPr>
+                <w:rFonts w:ascii="Arial Narrow" w:hAnsi="Arial Narrow"/>
+              </w:rPr>
+              <w:t xml:space="preserve">diri atau berupaya merusak dan menghilangkan </w:t>
+            </w:r>
+            <w:r>
+              <w:rPr>
+                <w:rFonts w:ascii="Arial Narrow" w:hAnsi="Arial Narrow"/>
+              </w:rPr>
+              <w:t>barang bukti atau</w:t>
+            </w:r>
+            <w:r>
+              <w:rPr>
+                <w:rFonts w:ascii="Arial Narrow" w:hAnsi="Arial Narrow"/>
+              </w:rPr>
+              <w:t xml:space="preserve"> melakukan </w:t>
+            </w:r>
+            <w:r>
+              <w:rPr>
+                <w:rFonts w:ascii="Arial Narrow" w:hAnsi="Arial Narrow"/>
+              </w:rPr>
+              <w:t xml:space="preserve">ulang tindak pidana atau terancam keselamatannya atas persetujuaan </w:t>
+            </w:r>
+            <w:r>
+              <w:rPr>
+                <w:rFonts w:ascii="Arial Narrow" w:hAnsi="Arial Narrow"/>
+              </w:rPr>
+              <w:t xml:space="preserve">atau </w:t>
+            </w:r>
             <w:r>
               <w:rPr>
                 <w:rFonts w:ascii="Arial Narrow" w:hAnsi="Arial Narrow"/>
@@ -1284,419 +448,49 @@
               <w:rPr>
                 <w:rFonts w:ascii="Arial Narrow" w:hAnsi="Arial Narrow"/>
               </w:rPr>
-              <w:t>n</w:t>
-            </w:r>
-            <w:proofErr w:type="spellEnd"/>
-            <w:r>
-              <w:rPr>
-                <w:rFonts w:ascii="Arial Narrow" w:hAnsi="Arial Narrow"/>
-              </w:rPr>
-              <w:t xml:space="preserve"> </w:t>
-            </w:r>
-            <w:proofErr w:type="spellStart"/>
-            <w:r>
-              <w:rPr>
-                <w:rFonts w:ascii="Arial Narrow" w:hAnsi="Arial Narrow"/>
-              </w:rPr>
-              <w:t>tersangka</w:t>
-            </w:r>
-            <w:proofErr w:type="spellEnd"/>
-            <w:r>
-              <w:rPr>
-                <w:rFonts w:ascii="Arial Narrow" w:hAnsi="Arial Narrow"/>
-              </w:rPr>
-              <w:t xml:space="preserve"> </w:t>
-            </w:r>
-            <w:proofErr w:type="spellStart"/>
-            <w:r>
-              <w:rPr>
-                <w:rFonts w:ascii="Arial Narrow" w:hAnsi="Arial Narrow"/>
-              </w:rPr>
-              <w:t>atau</w:t>
-            </w:r>
-            <w:proofErr w:type="spellEnd"/>
-            <w:r>
-              <w:rPr>
-                <w:rFonts w:ascii="Arial Narrow" w:hAnsi="Arial Narrow"/>
-              </w:rPr>
-              <w:t xml:space="preserve"> </w:t>
-            </w:r>
-            <w:proofErr w:type="spellStart"/>
-            <w:r>
-              <w:rPr>
-                <w:rFonts w:ascii="Arial Narrow" w:hAnsi="Arial Narrow"/>
-              </w:rPr>
-              <w:t>mempengaruhi</w:t>
-            </w:r>
-            <w:proofErr w:type="spellEnd"/>
-            <w:r>
-              <w:rPr>
-                <w:rFonts w:ascii="Arial Narrow" w:hAnsi="Arial Narrow"/>
-              </w:rPr>
-              <w:t xml:space="preserve"> </w:t>
-            </w:r>
-            <w:proofErr w:type="spellStart"/>
-            <w:r>
-              <w:rPr>
-                <w:rFonts w:ascii="Arial Narrow" w:hAnsi="Arial Narrow"/>
-              </w:rPr>
-              <w:t>saksi</w:t>
-            </w:r>
-            <w:proofErr w:type="spellEnd"/>
-            <w:r>
-              <w:rPr>
-                <w:rFonts w:ascii="Arial Narrow" w:hAnsi="Arial Narrow"/>
-              </w:rPr>
-              <w:t xml:space="preserve"> </w:t>
-            </w:r>
-            <w:proofErr w:type="spellStart"/>
+              <w:t xml:space="preserve">n tersangka atau </w:t>
+            </w:r>
+            <w:r>
+              <w:rPr>
+                <w:rFonts w:ascii="Arial Narrow" w:hAnsi="Arial Narrow"/>
+              </w:rPr>
+              <w:t xml:space="preserve">mempengaruhi saksi </w:t>
+            </w:r>
             <w:r>
               <w:rPr>
                 <w:rFonts w:ascii="Arial Narrow" w:hAnsi="Arial Narrow"/>
               </w:rPr>
               <w:t>untuk</w:t>
             </w:r>
-            <w:proofErr w:type="spellEnd"/>
-            <w:r>
-              <w:rPr>
-                <w:rFonts w:ascii="Arial Narrow" w:hAnsi="Arial Narrow"/>
-              </w:rPr>
-              <w:t xml:space="preserve"> </w:t>
-            </w:r>
-            <w:proofErr w:type="spellStart"/>
-            <w:r>
-              <w:rPr>
-                <w:rFonts w:ascii="Arial Narrow" w:hAnsi="Arial Narrow"/>
-              </w:rPr>
-              <w:t>tidak</w:t>
-            </w:r>
-            <w:proofErr w:type="spellEnd"/>
-            <w:r>
-              <w:rPr>
-                <w:rFonts w:ascii="Arial Narrow" w:hAnsi="Arial Narrow"/>
-              </w:rPr>
-              <w:t xml:space="preserve"> </w:t>
-            </w:r>
-            <w:proofErr w:type="spellStart"/>
-            <w:r>
-              <w:rPr>
-                <w:rFonts w:ascii="Arial Narrow" w:hAnsi="Arial Narrow"/>
-              </w:rPr>
-              <w:t>mengatakan</w:t>
-            </w:r>
-            <w:proofErr w:type="spellEnd"/>
-            <w:r>
-              <w:rPr>
-                <w:rFonts w:ascii="Arial Narrow" w:hAnsi="Arial Narrow"/>
-              </w:rPr>
-              <w:t xml:space="preserve"> </w:t>
-            </w:r>
-            <w:proofErr w:type="spellStart"/>
-            <w:r>
-              <w:rPr>
-                <w:rFonts w:ascii="Arial Narrow" w:hAnsi="Arial Narrow"/>
-              </w:rPr>
-              <w:t>sebenarnya</w:t>
-            </w:r>
-            <w:proofErr w:type="spellEnd"/>
-            <w:r>
-              <w:rPr>
-                <w:rFonts w:ascii="Arial Narrow" w:hAnsi="Arial Narrow"/>
-              </w:rPr>
-              <w:t xml:space="preserve">, </w:t>
-            </w:r>
-            <w:proofErr w:type="spellStart"/>
-            <w:r>
-              <w:rPr>
-                <w:rFonts w:ascii="Arial Narrow" w:hAnsi="Arial Narrow"/>
-              </w:rPr>
-              <w:t>tersangka</w:t>
-            </w:r>
-            <w:proofErr w:type="spellEnd"/>
-            <w:r>
-              <w:rPr>
-                <w:rFonts w:ascii="Arial Narrow" w:hAnsi="Arial Narrow"/>
-              </w:rPr>
-              <w:t xml:space="preserve"> yang </w:t>
-            </w:r>
-            <w:proofErr w:type="spellStart"/>
-            <w:r>
-              <w:rPr>
-                <w:rFonts w:ascii="Arial Narrow" w:hAnsi="Arial Narrow"/>
-              </w:rPr>
-              <w:t>diduga</w:t>
-            </w:r>
-            <w:proofErr w:type="spellEnd"/>
-            <w:r>
-              <w:rPr>
-                <w:rFonts w:ascii="Arial Narrow" w:hAnsi="Arial Narrow"/>
-              </w:rPr>
-              <w:t xml:space="preserve"> </w:t>
-            </w:r>
-            <w:proofErr w:type="spellStart"/>
-            <w:r>
-              <w:rPr>
-                <w:rFonts w:ascii="Arial Narrow" w:hAnsi="Arial Narrow"/>
-              </w:rPr>
-              <w:t>melakukan</w:t>
-            </w:r>
-            <w:proofErr w:type="spellEnd"/>
-            <w:r>
-              <w:rPr>
-                <w:rFonts w:ascii="Arial Narrow" w:hAnsi="Arial Narrow"/>
-              </w:rPr>
-              <w:t xml:space="preserve"> </w:t>
-            </w:r>
-            <w:proofErr w:type="spellStart"/>
-            <w:r>
-              <w:rPr>
-                <w:rFonts w:ascii="Arial Narrow" w:hAnsi="Arial Narrow"/>
-              </w:rPr>
-              <w:t>tindak</w:t>
-            </w:r>
-            <w:proofErr w:type="spellEnd"/>
-            <w:r>
-              <w:rPr>
-                <w:rFonts w:ascii="Arial Narrow" w:hAnsi="Arial Narrow"/>
-              </w:rPr>
-              <w:t xml:space="preserve"> </w:t>
-            </w:r>
-            <w:proofErr w:type="spellStart"/>
-            <w:r>
-              <w:rPr>
-                <w:rFonts w:ascii="Arial Narrow" w:hAnsi="Arial Narrow"/>
-              </w:rPr>
-              <w:t>pidana</w:t>
-            </w:r>
-            <w:proofErr w:type="spellEnd"/>
-            <w:r>
-              <w:rPr>
-                <w:rFonts w:ascii="Arial Narrow" w:hAnsi="Arial Narrow"/>
-              </w:rPr>
-              <w:t xml:space="preserve"> </w:t>
-            </w:r>
-            <w:proofErr w:type="spellStart"/>
-            <w:r>
-              <w:rPr>
-                <w:rFonts w:ascii="Arial Narrow" w:hAnsi="Arial Narrow"/>
-              </w:rPr>
-              <w:t>atau</w:t>
-            </w:r>
-            <w:proofErr w:type="spellEnd"/>
-            <w:r>
-              <w:rPr>
-                <w:rFonts w:ascii="Arial Narrow" w:hAnsi="Arial Narrow"/>
-              </w:rPr>
-              <w:t xml:space="preserve"> </w:t>
-            </w:r>
-            <w:proofErr w:type="spellStart"/>
-            <w:r>
-              <w:rPr>
-                <w:rFonts w:ascii="Arial Narrow" w:hAnsi="Arial Narrow"/>
-              </w:rPr>
-              <w:t>melakukan</w:t>
-            </w:r>
-            <w:proofErr w:type="spellEnd"/>
-            <w:r>
-              <w:rPr>
-                <w:rFonts w:ascii="Arial Narrow" w:hAnsi="Arial Narrow"/>
-              </w:rPr>
-              <w:t xml:space="preserve"> </w:t>
-            </w:r>
-            <w:proofErr w:type="spellStart"/>
-            <w:r>
-              <w:rPr>
-                <w:rFonts w:ascii="Arial Narrow" w:hAnsi="Arial Narrow"/>
-              </w:rPr>
-              <w:t>percobaan</w:t>
-            </w:r>
-            <w:proofErr w:type="spellEnd"/>
-            <w:r>
-              <w:rPr>
-                <w:rFonts w:ascii="Arial Narrow" w:hAnsi="Arial Narrow"/>
-              </w:rPr>
-              <w:t xml:space="preserve"> </w:t>
-            </w:r>
-            <w:proofErr w:type="spellStart"/>
-            <w:r>
-              <w:rPr>
-                <w:rFonts w:ascii="Arial Narrow" w:hAnsi="Arial Narrow"/>
-              </w:rPr>
-              <w:t>atau</w:t>
-            </w:r>
-            <w:proofErr w:type="spellEnd"/>
-            <w:r>
-              <w:rPr>
-                <w:rFonts w:ascii="Arial Narrow" w:hAnsi="Arial Narrow"/>
-              </w:rPr>
-              <w:t xml:space="preserve"> </w:t>
-            </w:r>
-            <w:proofErr w:type="spellStart"/>
-            <w:r>
-              <w:rPr>
-                <w:rFonts w:ascii="Arial Narrow" w:hAnsi="Arial Narrow"/>
-              </w:rPr>
-              <w:t>pembantuan</w:t>
-            </w:r>
-            <w:proofErr w:type="spellEnd"/>
-            <w:r>
-              <w:rPr>
-                <w:rFonts w:ascii="Arial Narrow" w:hAnsi="Arial Narrow"/>
-              </w:rPr>
-              <w:t xml:space="preserve"> </w:t>
-            </w:r>
-            <w:proofErr w:type="spellStart"/>
-            <w:r>
-              <w:rPr>
-                <w:rFonts w:ascii="Arial Narrow" w:hAnsi="Arial Narrow"/>
-              </w:rPr>
-              <w:t>melakukan</w:t>
-            </w:r>
-            <w:proofErr w:type="spellEnd"/>
-            <w:r>
-              <w:rPr>
-                <w:rFonts w:ascii="Arial Narrow" w:hAnsi="Arial Narrow"/>
-              </w:rPr>
-              <w:t xml:space="preserve"> </w:t>
-            </w:r>
-            <w:proofErr w:type="spellStart"/>
-            <w:r>
-              <w:rPr>
-                <w:rFonts w:ascii="Arial Narrow" w:hAnsi="Arial Narrow"/>
-              </w:rPr>
-              <w:t>tindak</w:t>
-            </w:r>
-            <w:proofErr w:type="spellEnd"/>
-            <w:r>
-              <w:rPr>
-                <w:rFonts w:ascii="Arial Narrow" w:hAnsi="Arial Narrow"/>
-              </w:rPr>
-              <w:t xml:space="preserve"> </w:t>
-            </w:r>
-            <w:proofErr w:type="spellStart"/>
-            <w:r>
-              <w:rPr>
-                <w:rFonts w:ascii="Arial Narrow" w:hAnsi="Arial Narrow"/>
-              </w:rPr>
-              <w:t>pidana</w:t>
-            </w:r>
-            <w:proofErr w:type="spellEnd"/>
-            <w:r>
-              <w:rPr>
-                <w:rFonts w:ascii="Arial Narrow" w:hAnsi="Arial Narrow"/>
-              </w:rPr>
-              <w:t xml:space="preserve"> yang </w:t>
-            </w:r>
-            <w:proofErr w:type="spellStart"/>
-            <w:r>
-              <w:rPr>
-                <w:rFonts w:ascii="Arial Narrow" w:hAnsi="Arial Narrow"/>
-              </w:rPr>
-              <w:t>diancam</w:t>
-            </w:r>
-            <w:proofErr w:type="spellEnd"/>
-            <w:r>
-              <w:rPr>
-                <w:rFonts w:ascii="Arial Narrow" w:hAnsi="Arial Narrow"/>
-              </w:rPr>
-              <w:t xml:space="preserve"> </w:t>
-            </w:r>
-            <w:proofErr w:type="spellStart"/>
-            <w:r>
-              <w:rPr>
-                <w:rFonts w:ascii="Arial Narrow" w:hAnsi="Arial Narrow"/>
-              </w:rPr>
-              <w:t>dengan</w:t>
-            </w:r>
-            <w:proofErr w:type="spellEnd"/>
-            <w:r>
-              <w:rPr>
-                <w:rFonts w:ascii="Arial Narrow" w:hAnsi="Arial Narrow"/>
-              </w:rPr>
-              <w:t xml:space="preserve"> </w:t>
-            </w:r>
-            <w:proofErr w:type="spellStart"/>
-            <w:r>
-              <w:rPr>
-                <w:rFonts w:ascii="Arial Narrow" w:hAnsi="Arial Narrow"/>
-              </w:rPr>
-              <w:t>pidana</w:t>
-            </w:r>
-            <w:proofErr w:type="spellEnd"/>
-            <w:r>
-              <w:rPr>
-                <w:rFonts w:ascii="Arial Narrow" w:hAnsi="Arial Narrow"/>
-              </w:rPr>
-              <w:t xml:space="preserve"> </w:t>
-            </w:r>
-            <w:r>
-              <w:rPr>
-                <w:rFonts w:ascii="Arial Narrow" w:hAnsi="Arial Narrow"/>
-              </w:rPr>
-              <w:t xml:space="preserve">…. </w:t>
-            </w:r>
-            <w:proofErr w:type="spellStart"/>
-            <w:r>
-              <w:rPr>
-                <w:rFonts w:ascii="Arial Narrow" w:hAnsi="Arial Narrow"/>
-              </w:rPr>
-              <w:t>Tahun</w:t>
-            </w:r>
-            <w:proofErr w:type="spellEnd"/>
-            <w:r>
-              <w:rPr>
-                <w:rFonts w:ascii="Arial Narrow" w:hAnsi="Arial Narrow"/>
-              </w:rPr>
-              <w:t xml:space="preserve"> </w:t>
-            </w:r>
-            <w:proofErr w:type="spellStart"/>
-            <w:r>
-              <w:rPr>
-                <w:rFonts w:ascii="Arial Narrow" w:hAnsi="Arial Narrow"/>
-              </w:rPr>
-              <w:t>atau</w:t>
-            </w:r>
-            <w:proofErr w:type="spellEnd"/>
-            <w:r>
-              <w:rPr>
-                <w:rFonts w:ascii="Arial Narrow" w:hAnsi="Arial Narrow"/>
-              </w:rPr>
-              <w:t xml:space="preserve"> </w:t>
-            </w:r>
-            <w:proofErr w:type="spellStart"/>
-            <w:r>
-              <w:rPr>
-                <w:rFonts w:ascii="Arial Narrow" w:hAnsi="Arial Narrow"/>
-              </w:rPr>
-              <w:t>lebih</w:t>
-            </w:r>
-            <w:proofErr w:type="spellEnd"/>
-            <w:r>
-              <w:rPr>
-                <w:rFonts w:ascii="Arial Narrow" w:hAnsi="Arial Narrow"/>
-              </w:rPr>
-              <w:t xml:space="preserve"> </w:t>
-            </w:r>
-            <w:proofErr w:type="spellStart"/>
-            <w:r>
-              <w:rPr>
-                <w:rFonts w:ascii="Arial Narrow" w:hAnsi="Arial Narrow"/>
-              </w:rPr>
-              <w:t>atau</w:t>
-            </w:r>
-            <w:proofErr w:type="spellEnd"/>
-            <w:r>
-              <w:rPr>
-                <w:rFonts w:ascii="Arial Narrow" w:hAnsi="Arial Narrow"/>
-              </w:rPr>
-              <w:t xml:space="preserve"> </w:t>
-            </w:r>
-            <w:proofErr w:type="spellStart"/>
-            <w:r>
-              <w:rPr>
-                <w:rFonts w:ascii="Arial Narrow" w:hAnsi="Arial Narrow"/>
-              </w:rPr>
-              <w:t>ti</w:t>
+            <w:r>
+              <w:rPr>
+                <w:rFonts w:ascii="Arial Narrow" w:hAnsi="Arial Narrow"/>
+              </w:rPr>
+              <w:t xml:space="preserve"> tidak mengatakan sebenarnya, tersangka yang diduga </w:t>
+            </w:r>
+            <w:r>
+              <w:rPr>
+                <w:rFonts w:ascii="Arial Narrow" w:hAnsi="Arial Narrow"/>
+              </w:rPr>
+              <w:t xml:space="preserve">melakukan tindak pidana </w:t>
+            </w:r>
+            <w:r>
+              <w:rPr>
+                <w:rFonts w:ascii="Arial Narrow" w:hAnsi="Arial Narrow"/>
+              </w:rPr>
+              <w:t xml:space="preserve">atau melakukan percobaan </w:t>
+            </w:r>
+            <w:r>
+              <w:rPr>
+                <w:rFonts w:ascii="Arial Narrow" w:hAnsi="Arial Narrow"/>
+              </w:rPr>
+              <w:t xml:space="preserve">atau pembantuan melakukan tindak pidana yang diancam dengan pidana </w:t>
+            </w:r>
+            <w:r>
+              <w:rPr>
+                <w:rFonts w:ascii="Arial Narrow" w:hAnsi="Arial Narrow"/>
+              </w:rPr>
+              <w:t>…. Tahun atau lebih atau ti</w:t>
             </w:r>
             <w:r>
               <w:rPr>
@@ -1708,21 +502,7 @@
               <w:rPr>
                 <w:rFonts w:ascii="Arial Narrow" w:hAnsi="Arial Narrow"/>
               </w:rPr>
-              <w:t>k</w:t>
-            </w:r>
-            <w:proofErr w:type="spellEnd"/>
-            <w:r>
-              <w:rPr>
-                <w:rFonts w:ascii="Arial Narrow" w:hAnsi="Arial Narrow"/>
-              </w:rPr>
-              <w:t xml:space="preserve"> </w:t>
-            </w:r>
-            <w:proofErr w:type="spellStart"/>
-            <w:r>
-              <w:rPr>
-                <w:rFonts w:ascii="Arial Narrow" w:hAnsi="Arial Narrow"/>
-              </w:rPr>
-              <w:t>p</w:t>
+              <w:t>k p</w:t>
             </w:r>
             <w:r>
               <w:rPr>
@@ -1734,117 +514,19 @@
               <w:rPr>
                 <w:rFonts w:ascii="Arial Narrow" w:hAnsi="Arial Narrow"/>
               </w:rPr>
-              <w:t>dana</w:t>
-            </w:r>
-            <w:proofErr w:type="spellEnd"/>
-            <w:r>
-              <w:rPr>
-                <w:rFonts w:ascii="Arial Narrow" w:hAnsi="Arial Narrow"/>
-              </w:rPr>
-              <w:t xml:space="preserve"> yang </w:t>
-            </w:r>
-            <w:proofErr w:type="spellStart"/>
-            <w:r>
-              <w:rPr>
-                <w:rFonts w:ascii="Arial Narrow" w:hAnsi="Arial Narrow"/>
-              </w:rPr>
-              <w:t>diatur</w:t>
-            </w:r>
-            <w:proofErr w:type="spellEnd"/>
-            <w:r>
-              <w:rPr>
-                <w:rFonts w:ascii="Arial Narrow" w:hAnsi="Arial Narrow"/>
-              </w:rPr>
-              <w:t xml:space="preserve"> </w:t>
-            </w:r>
-            <w:proofErr w:type="spellStart"/>
-            <w:r>
-              <w:rPr>
-                <w:rFonts w:ascii="Arial Narrow" w:hAnsi="Arial Narrow"/>
-              </w:rPr>
-              <w:t>khusus</w:t>
-            </w:r>
-            <w:proofErr w:type="spellEnd"/>
-            <w:r>
-              <w:rPr>
-                <w:rFonts w:ascii="Arial Narrow" w:hAnsi="Arial Narrow"/>
-              </w:rPr>
-              <w:t xml:space="preserve"> </w:t>
-            </w:r>
-            <w:proofErr w:type="spellStart"/>
-            <w:r>
-              <w:rPr>
-                <w:rFonts w:ascii="Arial Narrow" w:hAnsi="Arial Narrow"/>
-              </w:rPr>
-              <w:t>sesuai</w:t>
-            </w:r>
-            <w:proofErr w:type="spellEnd"/>
-            <w:r>
-              <w:rPr>
-                <w:rFonts w:ascii="Arial Narrow" w:hAnsi="Arial Narrow"/>
-              </w:rPr>
-              <w:t xml:space="preserve"> </w:t>
-            </w:r>
-            <w:proofErr w:type="spellStart"/>
-            <w:r>
-              <w:rPr>
-                <w:rFonts w:ascii="Arial Narrow" w:hAnsi="Arial Narrow"/>
-              </w:rPr>
-              <w:t>dengan</w:t>
-            </w:r>
-            <w:proofErr w:type="spellEnd"/>
-            <w:r>
-              <w:rPr>
-                <w:rFonts w:ascii="Arial Narrow" w:hAnsi="Arial Narrow"/>
-              </w:rPr>
-              <w:t xml:space="preserve"> Pasal </w:t>
-            </w:r>
-            <w:r>
-              <w:rPr>
-                <w:rFonts w:ascii="Arial Narrow" w:hAnsi="Arial Narrow"/>
-              </w:rPr>
-              <w:t xml:space="preserve">100 </w:t>
-            </w:r>
-            <w:proofErr w:type="spellStart"/>
-            <w:r>
-              <w:rPr>
-                <w:rFonts w:ascii="Arial Narrow" w:hAnsi="Arial Narrow"/>
-              </w:rPr>
-              <w:t>ayat</w:t>
-            </w:r>
-            <w:proofErr w:type="spellEnd"/>
-            <w:r>
-              <w:rPr>
-                <w:rFonts w:ascii="Arial Narrow" w:hAnsi="Arial Narrow"/>
-              </w:rPr>
-              <w:t xml:space="preserve"> (2) </w:t>
-            </w:r>
-            <w:r>
-              <w:rPr>
-                <w:rFonts w:ascii="Arial Narrow" w:hAnsi="Arial Narrow"/>
-              </w:rPr>
-              <w:t xml:space="preserve">KUHAP, </w:t>
-            </w:r>
-            <w:proofErr w:type="spellStart"/>
-            <w:r>
-              <w:rPr>
-                <w:rFonts w:ascii="Arial Narrow" w:hAnsi="Arial Narrow"/>
-              </w:rPr>
-              <w:t>dipandang</w:t>
-            </w:r>
-            <w:proofErr w:type="spellEnd"/>
-            <w:r>
-              <w:rPr>
-                <w:rFonts w:ascii="Arial Narrow" w:hAnsi="Arial Narrow"/>
-              </w:rPr>
-              <w:t xml:space="preserve"> </w:t>
-            </w:r>
-            <w:proofErr w:type="spellStart"/>
-            <w:r>
-              <w:rPr>
-                <w:rFonts w:ascii="Arial Narrow" w:hAnsi="Arial Narrow"/>
-              </w:rPr>
-              <w:t>per</w:t>
+              <w:t xml:space="preserve">dana yang diatur khusus sesuai dengan Pasal </w:t>
+            </w:r>
+            <w:r>
+              <w:rPr>
+                <w:rFonts w:ascii="Arial Narrow" w:hAnsi="Arial Narrow"/>
+              </w:rPr>
+              <w:t xml:space="preserve">100 ayat (2) </w:t>
+            </w:r>
+            <w:r>
+              <w:rPr>
+                <w:rFonts w:ascii="Arial Narrow" w:hAnsi="Arial Narrow"/>
+              </w:rPr>
+              <w:t>KUHAP, dipandang per</w:t>
             </w:r>
             <w:r>
               <w:rPr>
@@ -1852,54 +534,11 @@
               </w:rPr>
               <w:t>lu</w:t>
             </w:r>
-            <w:proofErr w:type="spellEnd"/>
-            <w:r>
-              <w:rPr>
-                <w:rFonts w:ascii="Arial Narrow" w:hAnsi="Arial Narrow"/>
-              </w:rPr>
-              <w:t xml:space="preserve"> </w:t>
-            </w:r>
-            <w:proofErr w:type="spellStart"/>
-            <w:r>
-              <w:rPr>
-                <w:rFonts w:ascii="Arial Narrow" w:hAnsi="Arial Narrow"/>
-              </w:rPr>
-              <w:t>mengeluarkan</w:t>
-            </w:r>
-            <w:proofErr w:type="spellEnd"/>
-            <w:r>
-              <w:rPr>
-                <w:rFonts w:ascii="Arial Narrow" w:hAnsi="Arial Narrow"/>
-              </w:rPr>
-              <w:t xml:space="preserve"> </w:t>
-            </w:r>
-            <w:proofErr w:type="spellStart"/>
-            <w:r>
-              <w:rPr>
-                <w:rFonts w:ascii="Arial Narrow" w:hAnsi="Arial Narrow"/>
-              </w:rPr>
-              <w:t>surat</w:t>
-            </w:r>
-            <w:proofErr w:type="spellEnd"/>
-            <w:r>
-              <w:rPr>
-                <w:rFonts w:ascii="Arial Narrow" w:hAnsi="Arial Narrow"/>
-              </w:rPr>
-              <w:t xml:space="preserve"> </w:t>
-            </w:r>
-            <w:proofErr w:type="spellStart"/>
-            <w:r>
-              <w:rPr>
-                <w:rFonts w:ascii="Arial Narrow" w:hAnsi="Arial Narrow"/>
-              </w:rPr>
-              <w:t>perintah</w:t>
-            </w:r>
-            <w:proofErr w:type="spellEnd"/>
-            <w:r>
-              <w:rPr>
-                <w:rFonts w:ascii="Arial Narrow" w:hAnsi="Arial Narrow"/>
-              </w:rPr>
-              <w:t>.</w:t>
+            <w:r>
+              <w:rPr>
+                <w:rFonts w:ascii="Arial Narrow" w:hAnsi="Arial Narrow"/>
+              </w:rPr>
+              <w:t xml:space="preserve"> mengeluarkan surat perintah.</w:t>
             </w:r>
           </w:p>
         </w:tc>
@@ -1995,75 +634,11 @@
                 <w:rFonts w:ascii="Arial Narrow" w:hAnsi="Arial Narrow"/>
               </w:rPr>
             </w:pPr>
-            <w:proofErr w:type="spellStart"/>
-            <w:r>
-              <w:rPr>
-                <w:rFonts w:ascii="Arial Narrow" w:hAnsi="Arial Narrow"/>
-              </w:rPr>
-              <w:t>Undang-Undang</w:t>
-            </w:r>
-            <w:proofErr w:type="spellEnd"/>
-            <w:r>
-              <w:rPr>
-                <w:rFonts w:ascii="Arial Narrow" w:hAnsi="Arial Narrow"/>
-              </w:rPr>
-              <w:t xml:space="preserve"> </w:t>
-            </w:r>
-            <w:proofErr w:type="spellStart"/>
-            <w:r>
-              <w:rPr>
-                <w:rFonts w:ascii="Arial Narrow" w:hAnsi="Arial Narrow"/>
-              </w:rPr>
-              <w:t>Nomor</w:t>
-            </w:r>
-            <w:proofErr w:type="spellEnd"/>
-            <w:r>
-              <w:rPr>
-                <w:rFonts w:ascii="Arial Narrow" w:hAnsi="Arial Narrow"/>
-              </w:rPr>
-              <w:t xml:space="preserve"> 2 </w:t>
-            </w:r>
-            <w:proofErr w:type="spellStart"/>
-            <w:r>
-              <w:rPr>
-                <w:rFonts w:ascii="Arial Narrow" w:hAnsi="Arial Narrow"/>
-              </w:rPr>
-              <w:t>Tahun</w:t>
-            </w:r>
-            <w:proofErr w:type="spellEnd"/>
-            <w:r>
-              <w:rPr>
-                <w:rFonts w:ascii="Arial Narrow" w:hAnsi="Arial Narrow"/>
-              </w:rPr>
-              <w:t xml:space="preserve"> 2002 </w:t>
-            </w:r>
-            <w:proofErr w:type="spellStart"/>
-            <w:r>
-              <w:rPr>
-                <w:rFonts w:ascii="Arial Narrow" w:hAnsi="Arial Narrow"/>
-              </w:rPr>
-              <w:t>tentang</w:t>
-            </w:r>
-            <w:proofErr w:type="spellEnd"/>
-            <w:r>
-              <w:rPr>
-                <w:rFonts w:ascii="Arial Narrow" w:hAnsi="Arial Narrow"/>
-              </w:rPr>
-              <w:t xml:space="preserve"> </w:t>
-            </w:r>
-            <w:proofErr w:type="spellStart"/>
-            <w:r>
-              <w:rPr>
-                <w:rFonts w:ascii="Arial Narrow" w:hAnsi="Arial Narrow"/>
-              </w:rPr>
-              <w:t>Kepolisian</w:t>
-            </w:r>
-            <w:proofErr w:type="spellEnd"/>
-            <w:r>
-              <w:rPr>
-                <w:rFonts w:ascii="Arial Narrow" w:hAnsi="Arial Narrow"/>
-              </w:rPr>
-              <w:t xml:space="preserve"> Negara Republik Indonesia;</w:t>
+            <w:r>
+              <w:rPr>
+                <w:rFonts w:ascii="Arial Narrow" w:hAnsi="Arial Narrow"/>
+              </w:rPr>
+              <w:t>Undang-Undang Nomor 2 Tahun 2002 tentang Kepolisian Negara Republik Indonesia;</w:t>
             </w:r>
           </w:p>
         </w:tc>
@@ -2127,91 +702,7 @@
               <w:rPr>
                 <w:rFonts w:ascii="Arial Narrow" w:hAnsi="Arial Narrow"/>
               </w:rPr>
-              <w:t xml:space="preserve">Pasal 3 dan Pasal 618 </w:t>
-            </w:r>
-            <w:proofErr w:type="spellStart"/>
-            <w:r>
-              <w:rPr>
-                <w:rFonts w:ascii="Arial Narrow" w:hAnsi="Arial Narrow"/>
-              </w:rPr>
-              <w:t>Undang-undang</w:t>
-            </w:r>
-            <w:proofErr w:type="spellEnd"/>
-            <w:r>
-              <w:rPr>
-                <w:rFonts w:ascii="Arial Narrow" w:hAnsi="Arial Narrow"/>
-              </w:rPr>
-              <w:t xml:space="preserve"> </w:t>
-            </w:r>
-            <w:proofErr w:type="spellStart"/>
-            <w:r>
-              <w:rPr>
-                <w:rFonts w:ascii="Arial Narrow" w:hAnsi="Arial Narrow"/>
-              </w:rPr>
-              <w:t>Nomor</w:t>
-            </w:r>
-            <w:proofErr w:type="spellEnd"/>
-            <w:r>
-              <w:rPr>
-                <w:rFonts w:ascii="Arial Narrow" w:hAnsi="Arial Narrow"/>
-              </w:rPr>
-              <w:t xml:space="preserve"> 1 </w:t>
-            </w:r>
-            <w:proofErr w:type="spellStart"/>
-            <w:r>
-              <w:rPr>
-                <w:rFonts w:ascii="Arial Narrow" w:hAnsi="Arial Narrow"/>
-              </w:rPr>
-              <w:t>Tahun</w:t>
-            </w:r>
-            <w:proofErr w:type="spellEnd"/>
-            <w:r>
-              <w:rPr>
-                <w:rFonts w:ascii="Arial Narrow" w:hAnsi="Arial Narrow"/>
-              </w:rPr>
-              <w:t xml:space="preserve"> 2023 </w:t>
-            </w:r>
-            <w:proofErr w:type="spellStart"/>
-            <w:r>
-              <w:rPr>
-                <w:rFonts w:ascii="Arial Narrow" w:hAnsi="Arial Narrow"/>
-              </w:rPr>
-              <w:t>tentang</w:t>
-            </w:r>
-            <w:proofErr w:type="spellEnd"/>
-            <w:r>
-              <w:rPr>
-                <w:rFonts w:ascii="Arial Narrow" w:hAnsi="Arial Narrow"/>
-              </w:rPr>
-              <w:t xml:space="preserve"> Kitab </w:t>
-            </w:r>
-            <w:proofErr w:type="spellStart"/>
-            <w:r>
-              <w:rPr>
-                <w:rFonts w:ascii="Arial Narrow" w:hAnsi="Arial Narrow"/>
-              </w:rPr>
-              <w:t>Undang-Undang</w:t>
-            </w:r>
-            <w:proofErr w:type="spellEnd"/>
-            <w:r>
-              <w:rPr>
-                <w:rFonts w:ascii="Arial Narrow" w:hAnsi="Arial Narrow"/>
-              </w:rPr>
-              <w:t xml:space="preserve"> Hukum </w:t>
-            </w:r>
-            <w:proofErr w:type="spellStart"/>
-            <w:r>
-              <w:rPr>
-                <w:rFonts w:ascii="Arial Narrow" w:hAnsi="Arial Narrow"/>
-              </w:rPr>
-              <w:t>Pidana</w:t>
-            </w:r>
-            <w:proofErr w:type="spellEnd"/>
-            <w:r>
-              <w:rPr>
-                <w:rFonts w:ascii="Arial Narrow" w:hAnsi="Arial Narrow"/>
-              </w:rPr>
-              <w:t>;</w:t>
+              <w:t>Pasal 3 dan Pasal 618 Undang-undang Nomor 1 Tahun 2023 tentang Kitab Undang-Undang Hukum Pidana;</w:t>
             </w:r>
           </w:p>
         </w:tc>
@@ -2275,35 +766,7 @@
               <w:rPr>
                 <w:rFonts w:ascii="Arial Narrow" w:hAnsi="Arial Narrow"/>
               </w:rPr>
-              <w:t xml:space="preserve">Pasal 1 </w:t>
-            </w:r>
-            <w:proofErr w:type="spellStart"/>
-            <w:r>
-              <w:rPr>
-                <w:rFonts w:ascii="Arial Narrow" w:hAnsi="Arial Narrow"/>
-              </w:rPr>
-              <w:t>angka</w:t>
-            </w:r>
-            <w:proofErr w:type="spellEnd"/>
-            <w:r>
-              <w:rPr>
-                <w:rFonts w:ascii="Arial Narrow" w:hAnsi="Arial Narrow"/>
-              </w:rPr>
-              <w:t xml:space="preserve"> 14 dan </w:t>
-            </w:r>
-            <w:proofErr w:type="spellStart"/>
-            <w:r>
-              <w:rPr>
-                <w:rFonts w:ascii="Arial Narrow" w:hAnsi="Arial Narrow"/>
-              </w:rPr>
-              <w:t>angka</w:t>
-            </w:r>
-            <w:proofErr w:type="spellEnd"/>
-            <w:r>
-              <w:rPr>
-                <w:rFonts w:ascii="Arial Narrow" w:hAnsi="Arial Narrow"/>
-              </w:rPr>
-              <w:t xml:space="preserve"> 3</w:t>
+              <w:t>Pasal 1 angka 14 dan angka 3</w:t>
             </w:r>
             <w:r>
               <w:rPr>
@@ -2327,21 +790,7 @@
               <w:rPr>
                 <w:rFonts w:ascii="Arial Narrow" w:hAnsi="Arial Narrow"/>
               </w:rPr>
-              <w:t xml:space="preserve"> </w:t>
-            </w:r>
-            <w:proofErr w:type="spellStart"/>
-            <w:r>
-              <w:rPr>
-                <w:rFonts w:ascii="Arial Narrow" w:hAnsi="Arial Narrow"/>
-              </w:rPr>
-              <w:t>ayat</w:t>
-            </w:r>
-            <w:proofErr w:type="spellEnd"/>
-            <w:r>
-              <w:rPr>
-                <w:rFonts w:ascii="Arial Narrow" w:hAnsi="Arial Narrow"/>
-              </w:rPr>
-              <w:t xml:space="preserve"> (</w:t>
+              <w:t xml:space="preserve"> ayat (</w:t>
             </w:r>
             <w:r>
               <w:rPr>
@@ -2353,21 +802,7 @@
               <w:rPr>
                 <w:rFonts w:ascii="Arial Narrow" w:hAnsi="Arial Narrow"/>
               </w:rPr>
-              <w:t xml:space="preserve">) </w:t>
-            </w:r>
-            <w:proofErr w:type="spellStart"/>
-            <w:r>
-              <w:rPr>
-                <w:rFonts w:ascii="Arial Narrow" w:hAnsi="Arial Narrow"/>
-              </w:rPr>
-              <w:t>huruf</w:t>
-            </w:r>
-            <w:proofErr w:type="spellEnd"/>
-            <w:r>
-              <w:rPr>
-                <w:rFonts w:ascii="Arial Narrow" w:hAnsi="Arial Narrow"/>
-              </w:rPr>
-              <w:t xml:space="preserve"> </w:t>
+              <w:t xml:space="preserve">) huruf </w:t>
             </w:r>
             <w:r>
               <w:rPr>
@@ -2415,247 +850,37 @@
               <w:rPr>
                 <w:rFonts w:ascii="Arial Narrow" w:hAnsi="Arial Narrow"/>
               </w:rPr>
-              <w:t xml:space="preserve"> </w:t>
-            </w:r>
-            <w:proofErr w:type="spellStart"/>
-            <w:r>
-              <w:rPr>
-                <w:rFonts w:ascii="Arial Narrow" w:hAnsi="Arial Narrow"/>
-              </w:rPr>
-              <w:t>ayat</w:t>
-            </w:r>
-            <w:proofErr w:type="spellEnd"/>
-            <w:r>
-              <w:rPr>
-                <w:rFonts w:ascii="Arial Narrow" w:hAnsi="Arial Narrow"/>
-              </w:rPr>
-              <w:t xml:space="preserve"> (3)</w:t>
-            </w:r>
-            <w:r>
-              <w:rPr>
-                <w:rFonts w:ascii="Arial Narrow" w:hAnsi="Arial Narrow"/>
-              </w:rPr>
-              <w:t xml:space="preserve">, Pasal 89 </w:t>
-            </w:r>
-            <w:proofErr w:type="spellStart"/>
-            <w:r>
-              <w:rPr>
-                <w:rFonts w:ascii="Arial Narrow" w:hAnsi="Arial Narrow"/>
-              </w:rPr>
-              <w:t>huruf</w:t>
-            </w:r>
-            <w:proofErr w:type="spellEnd"/>
-            <w:r>
-              <w:rPr>
-                <w:rFonts w:ascii="Arial Narrow" w:hAnsi="Arial Narrow"/>
-              </w:rPr>
-              <w:t xml:space="preserve"> c, Pasal 99 </w:t>
-            </w:r>
-            <w:proofErr w:type="spellStart"/>
-            <w:r>
-              <w:rPr>
-                <w:rFonts w:ascii="Arial Narrow" w:hAnsi="Arial Narrow"/>
-              </w:rPr>
-              <w:t>ayat</w:t>
-            </w:r>
-            <w:proofErr w:type="spellEnd"/>
-            <w:r>
-              <w:rPr>
-                <w:rFonts w:ascii="Arial Narrow" w:hAnsi="Arial Narrow"/>
-              </w:rPr>
-              <w:t xml:space="preserve"> (1)</w:t>
-            </w:r>
-            <w:r>
-              <w:rPr>
-                <w:rFonts w:ascii="Arial Narrow" w:hAnsi="Arial Narrow"/>
-              </w:rPr>
-              <w:t xml:space="preserve"> dan </w:t>
-            </w:r>
-            <w:proofErr w:type="spellStart"/>
-            <w:r>
-              <w:rPr>
-                <w:rFonts w:ascii="Arial Narrow" w:hAnsi="Arial Narrow"/>
-              </w:rPr>
-              <w:t>ayat</w:t>
-            </w:r>
-            <w:proofErr w:type="spellEnd"/>
-            <w:r>
-              <w:rPr>
-                <w:rFonts w:ascii="Arial Narrow" w:hAnsi="Arial Narrow"/>
-              </w:rPr>
-              <w:t xml:space="preserve"> (2), Pasal 100, Pasal 101</w:t>
-            </w:r>
-            <w:r>
-              <w:rPr>
-                <w:rFonts w:ascii="Arial Narrow" w:hAnsi="Arial Narrow"/>
-              </w:rPr>
-              <w:t xml:space="preserve">, Pasal 102 </w:t>
-            </w:r>
-            <w:proofErr w:type="spellStart"/>
-            <w:r>
-              <w:rPr>
-                <w:rFonts w:ascii="Arial Narrow" w:hAnsi="Arial Narrow"/>
-              </w:rPr>
-              <w:t>ayat</w:t>
-            </w:r>
-            <w:proofErr w:type="spellEnd"/>
-            <w:r>
-              <w:rPr>
-                <w:rFonts w:ascii="Arial Narrow" w:hAnsi="Arial Narrow"/>
-              </w:rPr>
-              <w:t xml:space="preserve"> (1), Pasal 107, Pasal 108, Pasal 109, Pasal 156 </w:t>
-            </w:r>
-            <w:proofErr w:type="spellStart"/>
-            <w:r>
-              <w:rPr>
-                <w:rFonts w:ascii="Arial Narrow" w:hAnsi="Arial Narrow"/>
-              </w:rPr>
-              <w:t>ayat</w:t>
-            </w:r>
-            <w:proofErr w:type="spellEnd"/>
-            <w:r>
-              <w:rPr>
-                <w:rFonts w:ascii="Arial Narrow" w:hAnsi="Arial Narrow"/>
-              </w:rPr>
-              <w:t xml:space="preserve"> (1)</w:t>
-            </w:r>
-            <w:r>
-              <w:rPr>
-                <w:rFonts w:ascii="Arial Narrow" w:hAnsi="Arial Narrow"/>
-              </w:rPr>
-              <w:t xml:space="preserve"> </w:t>
-            </w:r>
-            <w:proofErr w:type="spellStart"/>
-            <w:r>
-              <w:rPr>
-                <w:rFonts w:ascii="Arial Narrow" w:hAnsi="Arial Narrow"/>
-              </w:rPr>
-              <w:t>huruf</w:t>
-            </w:r>
-            <w:proofErr w:type="spellEnd"/>
-            <w:r>
-              <w:rPr>
-                <w:rFonts w:ascii="Arial Narrow" w:hAnsi="Arial Narrow"/>
-              </w:rPr>
-              <w:t xml:space="preserve"> c dan</w:t>
-            </w:r>
-            <w:r>
-              <w:rPr>
-                <w:rFonts w:ascii="Arial Narrow" w:hAnsi="Arial Narrow"/>
-              </w:rPr>
-              <w:t xml:space="preserve"> </w:t>
-            </w:r>
-            <w:proofErr w:type="spellStart"/>
-            <w:r>
-              <w:rPr>
-                <w:rFonts w:ascii="Arial Narrow" w:hAnsi="Arial Narrow"/>
-              </w:rPr>
-              <w:t>dan</w:t>
-            </w:r>
-            <w:proofErr w:type="spellEnd"/>
-            <w:r>
-              <w:rPr>
-                <w:rFonts w:ascii="Arial Narrow" w:hAnsi="Arial Narrow"/>
-              </w:rPr>
-              <w:t xml:space="preserve"> Pasal 361 </w:t>
-            </w:r>
-            <w:proofErr w:type="spellStart"/>
-            <w:r>
-              <w:rPr>
-                <w:rFonts w:ascii="Arial Narrow" w:hAnsi="Arial Narrow"/>
-              </w:rPr>
-              <w:t>Undang</w:t>
-            </w:r>
-            <w:proofErr w:type="spellEnd"/>
-            <w:r>
-              <w:rPr>
-                <w:rFonts w:ascii="Arial Narrow" w:hAnsi="Arial Narrow"/>
-              </w:rPr>
-              <w:t xml:space="preserve"> </w:t>
-            </w:r>
-            <w:proofErr w:type="spellStart"/>
-            <w:r>
-              <w:rPr>
-                <w:rFonts w:ascii="Arial Narrow" w:hAnsi="Arial Narrow"/>
-              </w:rPr>
-              <w:t>Undang</w:t>
-            </w:r>
-            <w:proofErr w:type="spellEnd"/>
-            <w:r>
-              <w:rPr>
-                <w:rFonts w:ascii="Arial Narrow" w:hAnsi="Arial Narrow"/>
-              </w:rPr>
-              <w:t xml:space="preserve"> </w:t>
-            </w:r>
-            <w:proofErr w:type="spellStart"/>
-            <w:r>
-              <w:rPr>
-                <w:rFonts w:ascii="Arial Narrow" w:hAnsi="Arial Narrow"/>
-              </w:rPr>
-              <w:t>Nomor</w:t>
-            </w:r>
-            <w:proofErr w:type="spellEnd"/>
-            <w:r>
-              <w:rPr>
-                <w:rFonts w:ascii="Arial Narrow" w:hAnsi="Arial Narrow"/>
-              </w:rPr>
-              <w:t xml:space="preserve"> 20 </w:t>
-            </w:r>
-            <w:proofErr w:type="spellStart"/>
-            <w:r>
-              <w:rPr>
-                <w:rFonts w:ascii="Arial Narrow" w:hAnsi="Arial Narrow"/>
-              </w:rPr>
-              <w:t>Tahun</w:t>
-            </w:r>
-            <w:proofErr w:type="spellEnd"/>
-            <w:r>
-              <w:rPr>
-                <w:rFonts w:ascii="Arial Narrow" w:hAnsi="Arial Narrow"/>
-              </w:rPr>
-              <w:t xml:space="preserve"> 2025 </w:t>
-            </w:r>
-            <w:proofErr w:type="spellStart"/>
-            <w:r>
-              <w:rPr>
-                <w:rFonts w:ascii="Arial Narrow" w:hAnsi="Arial Narrow"/>
-              </w:rPr>
-              <w:t>tentang</w:t>
-            </w:r>
-            <w:proofErr w:type="spellEnd"/>
-            <w:r>
-              <w:rPr>
-                <w:rFonts w:ascii="Arial Narrow" w:hAnsi="Arial Narrow"/>
-              </w:rPr>
-              <w:t xml:space="preserve"> Kitab </w:t>
-            </w:r>
-            <w:proofErr w:type="spellStart"/>
-            <w:r>
-              <w:rPr>
-                <w:rFonts w:ascii="Arial Narrow" w:hAnsi="Arial Narrow"/>
-              </w:rPr>
-              <w:t>Undang-Undang</w:t>
-            </w:r>
-            <w:proofErr w:type="spellEnd"/>
-            <w:r>
-              <w:rPr>
-                <w:rFonts w:ascii="Arial Narrow" w:hAnsi="Arial Narrow"/>
-              </w:rPr>
-              <w:t xml:space="preserve"> Hukum Acara </w:t>
-            </w:r>
-            <w:proofErr w:type="spellStart"/>
-            <w:r>
-              <w:rPr>
-                <w:rFonts w:ascii="Arial Narrow" w:hAnsi="Arial Narrow"/>
-              </w:rPr>
-              <w:t>Pidana</w:t>
-            </w:r>
-            <w:proofErr w:type="spellEnd"/>
-            <w:r>
-              <w:rPr>
-                <w:rFonts w:ascii="Arial Narrow" w:hAnsi="Arial Narrow"/>
-              </w:rPr>
-              <w:t>;</w:t>
+              <w:t xml:space="preserve"> ayat (3)</w:t>
+            </w:r>
+            <w:r>
+              <w:rPr>
+                <w:rFonts w:ascii="Arial Narrow" w:hAnsi="Arial Narrow"/>
+              </w:rPr>
+              <w:t>, Pasal 89 huruf c, Pasal 99 ayat (1)</w:t>
+            </w:r>
+            <w:r>
+              <w:rPr>
+                <w:rFonts w:ascii="Arial Narrow" w:hAnsi="Arial Narrow"/>
+              </w:rPr>
+              <w:t xml:space="preserve"> dan ayat (2), Pasal 100, Pasal 101</w:t>
+            </w:r>
+            <w:r>
+              <w:rPr>
+                <w:rFonts w:ascii="Arial Narrow" w:hAnsi="Arial Narrow"/>
+              </w:rPr>
+              <w:t>, Pasal 102 ayat (1), Pasal 107, Pasal 108, Pasal 109, Pasal 156 ayat (1)</w:t>
+            </w:r>
+            <w:r>
+              <w:rPr>
+                <w:rFonts w:ascii="Arial Narrow" w:hAnsi="Arial Narrow"/>
+              </w:rPr>
+              <w:t xml:space="preserve"> huruf c dan</w:t>
+            </w:r>
+            <w:r>
+              <w:rPr>
+                <w:rFonts w:ascii="Arial Narrow" w:hAnsi="Arial Narrow"/>
+              </w:rPr>
+              <w:t xml:space="preserve"> dan Pasal 361 Undang Undang Nomor 20 Tahun 2025 tentang Kitab Undang-Undang Hukum Acara Pidana;</w:t>
             </w:r>
           </w:p>
         </w:tc>
@@ -2717,43 +942,11 @@
             </w:pPr>
             <w:r>
               <w:rPr>
-                <w:rFonts w:ascii="Arial Narrow" w:hAnsi="Arial Narrow"/>
-              </w:rPr>
-              <w:t>(</w:t>
-            </w:r>
-            <w:proofErr w:type="spellStart"/>
-            <w:r>
-              <w:rPr>
-                <w:rFonts w:ascii="Arial Narrow" w:hAnsi="Arial Narrow"/>
-              </w:rPr>
-              <w:t>Perundang</w:t>
-            </w:r>
-            <w:r>
-              <w:rPr>
-                <w:rFonts w:ascii="Arial Narrow" w:hAnsi="Arial Narrow"/>
-              </w:rPr>
-              <w:t>-undangan</w:t>
-            </w:r>
-            <w:proofErr w:type="spellEnd"/>
-            <w:r>
-              <w:rPr>
-                <w:rFonts w:ascii="Arial Narrow" w:hAnsi="Arial Narrow"/>
-              </w:rPr>
-              <w:t xml:space="preserve"> yang </w:t>
-            </w:r>
-            <w:proofErr w:type="spellStart"/>
-            <w:r>
-              <w:rPr>
-                <w:rFonts w:ascii="Arial Narrow" w:hAnsi="Arial Narrow"/>
-              </w:rPr>
-              <w:t>berkaitan</w:t>
-            </w:r>
-            <w:proofErr w:type="spellEnd"/>
-            <w:r>
-              <w:rPr>
-                <w:rFonts w:ascii="Arial Narrow" w:hAnsi="Arial Narrow"/>
-              </w:rPr>
-              <w:t>)</w:t>
+                <w:rFonts w:ascii="Arial Narrow" w:eastAsia="Times New Roman" w:hAnsi="Arial Narrow" w:cs="Arial"/>
+                <w:shd w:val="clear" w:color="auto" w:fill="FFFFFF"/>
+                <w:lang w:eastAsia="en-ID"/>
+              </w:rPr>
+              <w:t>Undang-undang Republik Indonesia Nomor 22 Tahun 2009 tentang Lalu Lintas dan Angkutan Jalan;</w:t>
             </w:r>
           </w:p>
         </w:tc>
@@ -2813,61 +1006,11 @@
                 <w:rFonts w:ascii="Arial Narrow" w:hAnsi="Arial Narrow"/>
               </w:rPr>
             </w:pPr>
-            <w:proofErr w:type="spellStart"/>
-            <w:r>
-              <w:rPr>
-                <w:rFonts w:ascii="Arial Narrow" w:hAnsi="Arial Narrow"/>
-              </w:rPr>
-              <w:t>Laporan</w:t>
-            </w:r>
-            <w:proofErr w:type="spellEnd"/>
-            <w:r>
-              <w:rPr>
-                <w:rFonts w:ascii="Arial Narrow" w:hAnsi="Arial Narrow"/>
-              </w:rPr>
-              <w:t xml:space="preserve"> Polisi Nomor: ${</w:t>
-            </w:r>
-            <w:proofErr w:type="spellStart"/>
-            <w:r>
-              <w:rPr>
-                <w:rFonts w:ascii="Arial Narrow" w:hAnsi="Arial Narrow"/>
-              </w:rPr>
-              <w:t>accidentNumber</w:t>
-            </w:r>
-            <w:proofErr w:type="spellEnd"/>
-            <w:r>
-              <w:rPr>
-                <w:rFonts w:ascii="Arial Narrow" w:hAnsi="Arial Narrow"/>
-              </w:rPr>
-              <w:t xml:space="preserve">} </w:t>
-            </w:r>
-            <w:proofErr w:type="spellStart"/>
-            <w:r>
-              <w:rPr>
-                <w:rFonts w:ascii="Arial Narrow" w:hAnsi="Arial Narrow"/>
-              </w:rPr>
-              <w:t>tanggal</w:t>
-            </w:r>
-            <w:proofErr w:type="spellEnd"/>
-            <w:r>
-              <w:rPr>
-                <w:rFonts w:ascii="Arial Narrow" w:hAnsi="Arial Narrow"/>
-              </w:rPr>
-              <w:t xml:space="preserve"> ${</w:t>
-            </w:r>
-            <w:proofErr w:type="spellStart"/>
-            <w:r>
-              <w:rPr>
-                <w:rFonts w:ascii="Arial Narrow" w:hAnsi="Arial Narrow"/>
-              </w:rPr>
-              <w:t>accidentDate</w:t>
-            </w:r>
-            <w:proofErr w:type="spellEnd"/>
-            <w:r>
-              <w:rPr>
-                <w:rFonts w:ascii="Arial Narrow" w:hAnsi="Arial Narrow"/>
-              </w:rPr>
-              <w:t>};</w:t>
+            <w:r>
+              <w:rPr>
+                <w:rFonts w:ascii="Arial Narrow" w:hAnsi="Arial Narrow"/>
+              </w:rPr>
+              <w:t>Laporan Polisi Nomor: ${accidentNumber} tanggal ${accidentDate};</w:t>
             </w:r>
           </w:p>
         </w:tc>
@@ -2939,47 +1082,35 @@
               </w:rPr>
               <w:t xml:space="preserve"> </w:t>
             </w:r>
-            <w:proofErr w:type="spellStart"/>
             <w:r>
               <w:rPr>
                 <w:rFonts w:ascii="Arial Narrow" w:hAnsi="Arial Narrow"/>
               </w:rPr>
               <w:t>Perintah</w:t>
             </w:r>
-            <w:proofErr w:type="spellEnd"/>
             <w:r>
               <w:rPr>
                 <w:rFonts w:ascii="Arial Narrow" w:hAnsi="Arial Narrow"/>
               </w:rPr>
               <w:t xml:space="preserve"> </w:t>
             </w:r>
-            <w:proofErr w:type="spellStart"/>
             <w:r>
               <w:rPr>
                 <w:rFonts w:ascii="Arial Narrow" w:hAnsi="Arial Narrow"/>
               </w:rPr>
               <w:t>Penyidikan</w:t>
             </w:r>
-            <w:proofErr w:type="spellEnd"/>
             <w:r>
               <w:rPr>
                 <w:rFonts w:ascii="Arial Narrow" w:hAnsi="Arial Narrow"/>
               </w:rPr>
               <w:t xml:space="preserve"> </w:t>
             </w:r>
-            <w:proofErr w:type="spellStart"/>
-            <w:r>
-              <w:rPr>
-                <w:rFonts w:ascii="Arial Narrow" w:hAnsi="Arial Narrow"/>
-              </w:rPr>
-              <w:t>Nomor</w:t>
-            </w:r>
-            <w:proofErr w:type="spellEnd"/>
-            <w:r>
-              <w:rPr>
-                <w:rFonts w:ascii="Arial Narrow" w:hAnsi="Arial Narrow"/>
-              </w:rPr>
-              <w:t>:</w:t>
+            <w:r>
+              <w:rPr>
+                <w:rFonts w:ascii="Arial Narrow" w:hAnsi="Arial Narrow"/>
+              </w:rPr>
+              <w:t>Nomor:</w:t>
             </w:r>
             <w:r>
               <w:rPr>
@@ -2991,14 +1122,7 @@
               <w:rPr>
                 <w:rFonts w:ascii="Arial Narrow" w:hAnsi="Arial Narrow"/>
               </w:rPr>
-              <w:t>${</w:t>
-            </w:r>
-            <w:proofErr w:type="spellStart"/>
-            <w:r>
-              <w:rPr>
-                <w:rFonts w:ascii="Arial Narrow" w:hAnsi="Arial Narrow"/>
-              </w:rPr>
-              <w:t>s</w:t>
+              <w:t>${s</w:t>
             </w:r>
             <w:r>
               <w:rPr>
@@ -3016,14 +1140,7 @@
               <w:rPr>
                 <w:rFonts w:ascii="Arial Narrow" w:hAnsi="Arial Narrow"/>
               </w:rPr>
-              <w:t>Number</w:t>
-            </w:r>
-            <w:proofErr w:type="spellEnd"/>
-            <w:r>
-              <w:rPr>
-                <w:rFonts w:ascii="Arial Narrow" w:hAnsi="Arial Narrow"/>
-              </w:rPr>
-              <w:t>}</w:t>
+              <w:t>Number}</w:t>
             </w:r>
             <w:r>
               <w:rPr>
@@ -3031,26 +1148,11 @@
               </w:rPr>
               <w:t xml:space="preserve"> </w:t>
             </w:r>
-            <w:proofErr w:type="spellStart"/>
-            <w:r>
-              <w:rPr>
-                <w:rFonts w:ascii="Arial Narrow" w:hAnsi="Arial Narrow"/>
-              </w:rPr>
-              <w:t>tanggal</w:t>
-            </w:r>
-            <w:proofErr w:type="spellEnd"/>
-            <w:r>
-              <w:rPr>
-                <w:rFonts w:ascii="Arial Narrow" w:hAnsi="Arial Narrow"/>
-              </w:rPr>
-              <w:t xml:space="preserve"> ${</w:t>
-            </w:r>
-            <w:proofErr w:type="spellStart"/>
-            <w:r>
-              <w:rPr>
-                <w:rFonts w:ascii="Arial Narrow" w:hAnsi="Arial Narrow"/>
-              </w:rPr>
-              <w:t>s</w:t>
+            <w:r>
+              <w:rPr>
+                <w:rFonts w:ascii="Arial Narrow" w:hAnsi="Arial Narrow"/>
+              </w:rPr>
+              <w:t>tanggal ${s</w:t>
             </w:r>
             <w:r>
               <w:rPr>
@@ -3058,7 +1160,6 @@
               </w:rPr>
               <w:t>uratPerintahPenyidikanDocumentDate</w:t>
             </w:r>
-            <w:proofErr w:type="spellEnd"/>
             <w:r>
               <w:rPr>
                 <w:rFonts w:ascii="Arial Narrow" w:hAnsi="Arial Narrow"/>
@@ -3141,61 +1242,47 @@
               </w:rPr>
               <w:t xml:space="preserve"> </w:t>
             </w:r>
-            <w:proofErr w:type="spellStart"/>
             <w:r>
               <w:rPr>
                 <w:rFonts w:ascii="Arial Narrow" w:hAnsi="Arial Narrow"/>
               </w:rPr>
               <w:t>Ketetapan</w:t>
             </w:r>
-            <w:proofErr w:type="spellEnd"/>
             <w:r>
               <w:rPr>
                 <w:rFonts w:ascii="Arial Narrow" w:hAnsi="Arial Narrow"/>
               </w:rPr>
               <w:t xml:space="preserve"> </w:t>
             </w:r>
-            <w:proofErr w:type="spellStart"/>
             <w:r>
               <w:rPr>
                 <w:rFonts w:ascii="Arial Narrow" w:hAnsi="Arial Narrow"/>
               </w:rPr>
               <w:t>Penetapan</w:t>
             </w:r>
-            <w:proofErr w:type="spellEnd"/>
             <w:r>
               <w:rPr>
                 <w:rFonts w:ascii="Arial Narrow" w:hAnsi="Arial Narrow"/>
               </w:rPr>
               <w:t xml:space="preserve"> </w:t>
             </w:r>
-            <w:proofErr w:type="spellStart"/>
             <w:r>
               <w:rPr>
                 <w:rFonts w:ascii="Arial Narrow" w:hAnsi="Arial Narrow"/>
               </w:rPr>
               <w:t>Tersangka</w:t>
             </w:r>
-            <w:proofErr w:type="spellEnd"/>
             <w:r>
               <w:rPr>
                 <w:rFonts w:ascii="Arial Narrow" w:hAnsi="Arial Narrow"/>
               </w:rPr>
               <w:t xml:space="preserve"> </w:t>
             </w:r>
-            <w:proofErr w:type="spellStart"/>
-            <w:r>
-              <w:rPr>
-                <w:rFonts w:ascii="Arial Narrow" w:hAnsi="Arial Narrow"/>
-              </w:rPr>
-              <w:t>Nomor</w:t>
-            </w:r>
-            <w:proofErr w:type="spellEnd"/>
-            <w:r>
-              <w:rPr>
-                <w:rFonts w:ascii="Arial Narrow" w:hAnsi="Arial Narrow"/>
-              </w:rPr>
-              <w:t>:</w:t>
+            <w:r>
+              <w:rPr>
+                <w:rFonts w:ascii="Arial Narrow" w:hAnsi="Arial Narrow"/>
+              </w:rPr>
+              <w:t>Nomor:</w:t>
             </w:r>
             <w:r>
               <w:rPr>
@@ -3207,21 +1294,7 @@
               <w:rPr>
                 <w:rFonts w:ascii="Arial Narrow" w:hAnsi="Arial Narrow"/>
               </w:rPr>
-              <w:t>${</w:t>
-            </w:r>
-            <w:proofErr w:type="spellStart"/>
-            <w:r>
-              <w:rPr>
-                <w:rFonts w:ascii="Arial Narrow" w:hAnsi="Arial Narrow"/>
-              </w:rPr>
-              <w:t>suratKetetapanPenetapanTersangkaDocumentNumber</w:t>
-            </w:r>
-            <w:proofErr w:type="spellEnd"/>
-            <w:r>
-              <w:rPr>
-                <w:rFonts w:ascii="Arial Narrow" w:hAnsi="Arial Narrow"/>
-              </w:rPr>
-              <w:t>}</w:t>
+              <w:t>${suratKetetapanPenetapanTersangkaDocumentNumber}</w:t>
             </w:r>
             <w:r>
               <w:rPr>
@@ -3229,14 +1302,12 @@
               </w:rPr>
               <w:t xml:space="preserve"> </w:t>
             </w:r>
-            <w:proofErr w:type="spellStart"/>
             <w:r>
               <w:rPr>
                 <w:rFonts w:ascii="Arial Narrow" w:hAnsi="Arial Narrow"/>
               </w:rPr>
               <w:t>tanggal</w:t>
             </w:r>
-            <w:proofErr w:type="spellEnd"/>
             <w:r>
               <w:rPr>
                 <w:rFonts w:ascii="Arial Narrow" w:hAnsi="Arial Narrow"/>
@@ -3247,21 +1318,7 @@
               <w:rPr>
                 <w:rFonts w:ascii="Arial Narrow" w:hAnsi="Arial Narrow"/>
               </w:rPr>
-              <w:t>${</w:t>
-            </w:r>
-            <w:proofErr w:type="spellStart"/>
-            <w:r>
-              <w:rPr>
-                <w:rFonts w:ascii="Arial Narrow" w:hAnsi="Arial Narrow"/>
-              </w:rPr>
-              <w:t>suratKetetapanPenetapanTersangkaDocumentDate</w:t>
-            </w:r>
-            <w:proofErr w:type="spellEnd"/>
-            <w:r>
-              <w:rPr>
-                <w:rFonts w:ascii="Arial Narrow" w:hAnsi="Arial Narrow"/>
-              </w:rPr>
-              <w:t>}</w:t>
+              <w:t>${suratKetetapanPenetapanTersangkaDocumentDate}</w:t>
             </w:r>
             <w:r>
               <w:rPr>
@@ -3269,14 +1326,12 @@
               </w:rPr>
               <w:t xml:space="preserve"> </w:t>
             </w:r>
-            <w:proofErr w:type="spellStart"/>
             <w:r>
               <w:rPr>
                 <w:rFonts w:ascii="Arial Narrow" w:hAnsi="Arial Narrow"/>
               </w:rPr>
               <w:t>atas</w:t>
             </w:r>
-            <w:proofErr w:type="spellEnd"/>
             <w:r>
               <w:rPr>
                 <w:rFonts w:ascii="Arial Narrow" w:hAnsi="Arial Narrow"/>
@@ -3293,22 +1348,7 @@
               <w:rPr>
                 <w:rFonts w:ascii="Arial Narrow" w:hAnsi="Arial Narrow"/>
               </w:rPr>
-              <w:t>${</w:t>
-            </w:r>
-            <w:proofErr w:type="spellStart"/>
-            <w:r>
-              <w:rPr>
-                <w:rFonts w:ascii="Arial Narrow" w:hAnsi="Arial Narrow"/>
-              </w:rPr>
-              <w:t>suspectName</w:t>
-            </w:r>
-            <w:proofErr w:type="spellEnd"/>
-            <w:proofErr w:type="gramStart"/>
-            <w:r>
-              <w:rPr>
-                <w:rFonts w:ascii="Arial Narrow" w:hAnsi="Arial Narrow"/>
-              </w:rPr>
-              <w:t>}</w:t>
+              <w:t>${suspectName}</w:t>
             </w:r>
             <w:r>
               <w:rPr>
@@ -3316,7 +1356,6 @@
               </w:rPr>
               <w:t xml:space="preserve"> .</w:t>
             </w:r>
-            <w:proofErr w:type="gramEnd"/>
           </w:p>
         </w:tc>
       </w:tr>
@@ -3348,14 +1387,12 @@
                 <w:rFonts w:ascii="Arial Narrow" w:hAnsi="Arial Narrow"/>
               </w:rPr>
             </w:pPr>
-            <w:proofErr w:type="spellStart"/>
             <w:r>
               <w:rPr>
                 <w:rFonts w:ascii="Arial Narrow" w:hAnsi="Arial Narrow"/>
               </w:rPr>
               <w:t>Kepada</w:t>
             </w:r>
-            <w:proofErr w:type="spellEnd"/>
           </w:p>
         </w:tc>
         <w:tc>
@@ -3391,55 +1428,9 @@
               <w:rPr>
                 <w:rFonts w:ascii="Arial Narrow" w:hAnsi="Arial Narrow"/>
               </w:rPr>
-              <w:t>${</w:t>
-            </w:r>
-            <w:proofErr w:type="spellStart"/>
-            <w:r>
-              <w:rPr>
-                <w:rFonts w:ascii="Arial Narrow" w:hAnsi="Arial Narrow"/>
-              </w:rPr>
-              <w:t>block_officers</w:t>
-            </w:r>
-            <w:proofErr w:type="spellEnd"/>
-            <w:r>
-              <w:rPr>
-                <w:rFonts w:ascii="Arial Narrow" w:hAnsi="Arial Narrow"/>
-              </w:rPr>
-              <w:t>}</w:t>
-            </w:r>
-          </w:p>
-        </w:tc>
-      </w:tr>
-      <w:tr>
-        <w:tc>
-          <w:tcPr>
-            <w:tcW w:w="1530" w:type="dxa"/>
-          </w:tcPr>
-          <w:p>
-            <w:pPr>
-              <w:rPr>
-                <w:rFonts w:ascii="Arial Narrow" w:hAnsi="Arial Narrow"/>
-              </w:rPr>
-            </w:pPr>
-          </w:p>
-        </w:tc>
-        <w:tc>
-          <w:tcPr>
-            <w:tcW w:w="360" w:type="dxa"/>
-          </w:tcPr>
-          <w:p>
-            <w:pPr>
-              <w:rPr>
-                <w:rFonts w:ascii="Arial Narrow" w:hAnsi="Arial Narrow"/>
-              </w:rPr>
-            </w:pPr>
-          </w:p>
-        </w:tc>
-        <w:tc>
-          <w:tcPr>
-            <w:tcW w:w="7222" w:type="dxa"/>
-            <w:gridSpan w:val="5"/>
-          </w:tcPr>
+              <w:t>${block_officers}</w:t>
+            </w:r>
+          </w:p>
           <w:tbl>
             <w:tblPr>
               <w:tblStyle w:val="TableGrid"/>
@@ -3546,43 +1537,7 @@
                       <w:bCs/>
                       <w:color w:val="000000"/>
                     </w:rPr>
-                    <w:t>${</w:t>
-                  </w:r>
-                  <w:proofErr w:type="spellStart"/>
-                  <w:r>
-                    <w:rPr>
-                      <w:rFonts w:ascii="Arial Narrow" w:eastAsia="Arial Narrow" w:hAnsi="Arial Narrow"/>
-                      <w:bCs/>
-                      <w:color w:val="000000"/>
-                    </w:rPr>
-                    <w:t>first_name</w:t>
-                  </w:r>
-                  <w:proofErr w:type="spellEnd"/>
-                  <w:r>
-                    <w:rPr>
-                      <w:rFonts w:ascii="Arial Narrow" w:eastAsia="Arial Narrow" w:hAnsi="Arial Narrow"/>
-                      <w:bCs/>
-                      <w:color w:val="000000"/>
-                    </w:rPr>
-                    <w:t>} ${</w:t>
-                  </w:r>
-                  <w:proofErr w:type="spellStart"/>
-                  <w:r>
-                    <w:rPr>
-                      <w:rFonts w:ascii="Arial Narrow" w:eastAsia="Arial Narrow" w:hAnsi="Arial Narrow"/>
-                      <w:bCs/>
-                      <w:color w:val="000000"/>
-                    </w:rPr>
-                    <w:t>last_name</w:t>
-                  </w:r>
-                  <w:proofErr w:type="spellEnd"/>
-                  <w:r>
-                    <w:rPr>
-                      <w:rFonts w:ascii="Arial Narrow" w:eastAsia="Arial Narrow" w:hAnsi="Arial Narrow"/>
-                      <w:bCs/>
-                      <w:color w:val="000000"/>
-                    </w:rPr>
-                    <w:t>}</w:t>
+                    <w:t>${first_name} ${last_name}</w:t>
                   </w:r>
                 </w:p>
               </w:tc>
@@ -3610,31 +1565,13 @@
                       <w:rFonts w:ascii="Arial Narrow" w:hAnsi="Arial Narrow"/>
                     </w:rPr>
                   </w:pPr>
-                  <w:proofErr w:type="spellStart"/>
                   <w:r>
                     <w:rPr>
                       <w:rFonts w:ascii="Arial Narrow" w:hAnsi="Arial Narrow"/>
                       <w:color w:val="000000"/>
                     </w:rPr>
-                    <w:t>Pangkat</w:t>
+                    <w:t>Pangkat/Nrp</w:t>
                   </w:r>
-                  <w:proofErr w:type="spellEnd"/>
-                  <w:r>
-                    <w:rPr>
-                      <w:rFonts w:ascii="Arial Narrow" w:hAnsi="Arial Narrow"/>
-                      <w:color w:val="000000"/>
-                    </w:rPr>
-                    <w:t>/</w:t>
-                  </w:r>
-                  <w:proofErr w:type="spellStart"/>
-                  <w:r>
-                    <w:rPr>
-                      <w:rFonts w:ascii="Arial Narrow" w:hAnsi="Arial Narrow"/>
-                      <w:color w:val="000000"/>
-                    </w:rPr>
-                    <w:t>Nrp</w:t>
-                  </w:r>
-                  <w:proofErr w:type="spellEnd"/>
                 </w:p>
               </w:tc>
               <w:tc>
@@ -3669,49 +1606,7 @@
                     <w:rPr>
                       <w:rFonts w:ascii="Arial Narrow" w:hAnsi="Arial Narrow"/>
                     </w:rPr>
-                    <w:t>${</w:t>
-                  </w:r>
-                  <w:proofErr w:type="spellStart"/>
-                  <w:r>
-                    <w:rPr>
-                      <w:rFonts w:ascii="Arial Narrow" w:hAnsi="Arial Narrow"/>
-                    </w:rPr>
-                    <w:t>rank_</w:t>
-                  </w:r>
-                  <w:proofErr w:type="gramStart"/>
-                  <w:r>
-                    <w:rPr>
-                      <w:rFonts w:ascii="Arial Narrow" w:hAnsi="Arial Narrow"/>
-                    </w:rPr>
-                    <w:t>id</w:t>
-                  </w:r>
-                  <w:proofErr w:type="spellEnd"/>
-                  <w:r>
-                    <w:rPr>
-                      <w:rFonts w:ascii="Arial Narrow" w:hAnsi="Arial Narrow"/>
-                    </w:rPr>
-                    <w:t>} /</w:t>
-                  </w:r>
-                  <w:proofErr w:type="gramEnd"/>
-                  <w:r>
-                    <w:rPr>
-                      <w:rFonts w:ascii="Arial Narrow" w:hAnsi="Arial Narrow"/>
-                    </w:rPr>
-                    <w:t xml:space="preserve"> ${</w:t>
-                  </w:r>
-                  <w:proofErr w:type="spellStart"/>
-                  <w:r>
-                    <w:rPr>
-                      <w:rFonts w:ascii="Arial Narrow" w:hAnsi="Arial Narrow"/>
-                    </w:rPr>
-                    <w:t>officer_id</w:t>
-                  </w:r>
-                  <w:proofErr w:type="spellEnd"/>
-                  <w:r>
-                    <w:rPr>
-                      <w:rFonts w:ascii="Arial Narrow" w:hAnsi="Arial Narrow"/>
-                    </w:rPr>
-                    <w:t>}</w:t>
+                    <w:t>${rank_id} / ${officer_id}</w:t>
                   </w:r>
                 </w:p>
               </w:tc>
@@ -3742,14 +1637,12 @@
                       <w:rFonts w:ascii="Arial Narrow" w:hAnsi="Arial Narrow"/>
                     </w:rPr>
                   </w:pPr>
-                  <w:proofErr w:type="spellStart"/>
                   <w:r>
                     <w:rPr>
                       <w:rFonts w:ascii="Arial Narrow" w:hAnsi="Arial Narrow"/>
                     </w:rPr>
                     <w:t>Jabatan</w:t>
                   </w:r>
-                  <w:proofErr w:type="spellEnd"/>
                 </w:p>
               </w:tc>
               <w:tc>
@@ -3835,27 +1728,11 @@
                 <w:rFonts w:ascii="Arial Narrow" w:hAnsi="Arial Narrow"/>
               </w:rPr>
             </w:pPr>
-            <w:proofErr w:type="gramStart"/>
-            <w:r>
-              <w:rPr>
-                <w:rFonts w:ascii="Arial Narrow" w:hAnsi="Arial Narrow"/>
-              </w:rPr>
-              <w:t>${/</w:t>
-            </w:r>
-            <w:proofErr w:type="spellStart"/>
-            <w:proofErr w:type="gramEnd"/>
-            <w:r>
-              <w:rPr>
-                <w:rFonts w:ascii="Arial Narrow" w:hAnsi="Arial Narrow"/>
-              </w:rPr>
-              <w:t>block_officers</w:t>
-            </w:r>
-            <w:proofErr w:type="spellEnd"/>
-            <w:r>
-              <w:rPr>
-                <w:rFonts w:ascii="Arial Narrow" w:hAnsi="Arial Narrow"/>
-              </w:rPr>
-              <w:t>}</w:t>
+            <w:r>
+              <w:rPr>
+                <w:rFonts w:ascii="Arial Narrow" w:hAnsi="Arial Narrow"/>
+              </w:rPr>
+              <w:t>${/block_officers}</w:t>
             </w:r>
           </w:p>
         </w:tc>
@@ -3888,14 +1765,12 @@
                 <w:rFonts w:ascii="Arial Narrow" w:hAnsi="Arial Narrow"/>
               </w:rPr>
             </w:pPr>
-            <w:proofErr w:type="spellStart"/>
             <w:r>
               <w:rPr>
                 <w:rFonts w:ascii="Arial Narrow" w:hAnsi="Arial Narrow"/>
               </w:rPr>
               <w:t>Untuk</w:t>
             </w:r>
-            <w:proofErr w:type="spellEnd"/>
           </w:p>
         </w:tc>
         <w:tc>
@@ -3945,61 +1820,11 @@
                 <w:rFonts w:ascii="Arial Narrow" w:hAnsi="Arial Narrow"/>
               </w:rPr>
             </w:pPr>
-            <w:proofErr w:type="spellStart"/>
-            <w:r>
-              <w:rPr>
-                <w:rFonts w:ascii="Arial Narrow" w:hAnsi="Arial Narrow"/>
-              </w:rPr>
-              <w:t>melakukan</w:t>
-            </w:r>
-            <w:proofErr w:type="spellEnd"/>
-            <w:r>
-              <w:rPr>
-                <w:rFonts w:ascii="Arial Narrow" w:hAnsi="Arial Narrow"/>
-              </w:rPr>
-              <w:t xml:space="preserve"> </w:t>
-            </w:r>
-            <w:proofErr w:type="spellStart"/>
-            <w:r>
-              <w:rPr>
-                <w:rFonts w:ascii="Arial Narrow" w:hAnsi="Arial Narrow"/>
-              </w:rPr>
-              <w:t>penahanan</w:t>
-            </w:r>
-            <w:proofErr w:type="spellEnd"/>
-            <w:r>
-              <w:rPr>
-                <w:rFonts w:ascii="Arial Narrow" w:hAnsi="Arial Narrow"/>
-              </w:rPr>
-              <w:t xml:space="preserve"> </w:t>
-            </w:r>
-            <w:proofErr w:type="spellStart"/>
-            <w:r>
-              <w:rPr>
-                <w:rFonts w:ascii="Arial Narrow" w:hAnsi="Arial Narrow"/>
-              </w:rPr>
-              <w:t>terhadap</w:t>
-            </w:r>
-            <w:proofErr w:type="spellEnd"/>
-            <w:r>
-              <w:rPr>
-                <w:rFonts w:ascii="Arial Narrow" w:hAnsi="Arial Narrow"/>
-              </w:rPr>
-              <w:t xml:space="preserve"> </w:t>
-            </w:r>
-            <w:proofErr w:type="spellStart"/>
-            <w:r>
-              <w:rPr>
-                <w:rFonts w:ascii="Arial Narrow" w:hAnsi="Arial Narrow"/>
-              </w:rPr>
-              <w:t>tersangka</w:t>
-            </w:r>
-            <w:proofErr w:type="spellEnd"/>
-            <w:r>
-              <w:rPr>
-                <w:rFonts w:ascii="Arial Narrow" w:hAnsi="Arial Narrow"/>
-              </w:rPr>
-              <w:t>:</w:t>
+            <w:r>
+              <w:rPr>
+                <w:rFonts w:ascii="Arial Narrow" w:hAnsi="Arial Narrow"/>
+              </w:rPr>
+              <w:t>melakukan penahanan terhadap tersangka:</w:t>
             </w:r>
           </w:p>
         </w:tc>
@@ -4112,7 +1937,6 @@
               </w:rPr>
               <w:t>${</w:t>
             </w:r>
-            <w:proofErr w:type="spellStart"/>
             <w:r>
               <w:rPr>
                 <w:rFonts w:ascii="Arial Narrow" w:eastAsia="Arial Narrow" w:hAnsi="Arial Narrow"/>
@@ -4120,7 +1944,6 @@
               </w:rPr>
               <w:t>suspectName</w:t>
             </w:r>
-            <w:proofErr w:type="spellEnd"/>
             <w:r>
               <w:rPr>
                 <w:rFonts w:ascii="Arial Narrow" w:eastAsia="Arial Narrow" w:hAnsi="Arial Narrow"/>
@@ -4196,28 +2019,12 @@
                 <w:rFonts w:ascii="Arial Narrow" w:hAnsi="Arial Narrow"/>
               </w:rPr>
             </w:pPr>
-            <w:proofErr w:type="spellStart"/>
-            <w:r>
-              <w:rPr>
-                <w:rFonts w:ascii="Arial Narrow" w:hAnsi="Arial Narrow"/>
-              </w:rPr>
-              <w:t>nomor</w:t>
-            </w:r>
-            <w:proofErr w:type="spellEnd"/>
-            <w:r>
-              <w:rPr>
-                <w:rFonts w:ascii="Arial Narrow" w:hAnsi="Arial Narrow"/>
-              </w:rPr>
-              <w:t xml:space="preserve"> </w:t>
-            </w:r>
-            <w:proofErr w:type="spellStart"/>
-            <w:r>
-              <w:rPr>
-                <w:rFonts w:ascii="Arial Narrow" w:hAnsi="Arial Narrow"/>
-              </w:rPr>
-              <w:t>identitas</w:t>
-            </w:r>
-            <w:proofErr w:type="spellEnd"/>
+            <w:r>
+              <w:rPr>
+                <w:rFonts w:ascii="Arial Narrow" w:hAnsi="Arial Narrow"/>
+              </w:rPr>
+              <w:t>nomor identitas</w:t>
+            </w:r>
           </w:p>
         </w:tc>
         <w:tc>
@@ -4255,7 +2062,6 @@
               </w:rPr>
               <w:t>${</w:t>
             </w:r>
-            <w:proofErr w:type="spellStart"/>
             <w:r>
               <w:rPr>
                 <w:rFonts w:ascii="Arial Narrow" w:eastAsia="Arial Narrow" w:hAnsi="Arial Narrow"/>
@@ -4263,7 +2069,6 @@
               </w:rPr>
               <w:t>suspectIdentityNumber</w:t>
             </w:r>
-            <w:proofErr w:type="spellEnd"/>
             <w:r>
               <w:rPr>
                 <w:rFonts w:ascii="Arial Narrow" w:eastAsia="Arial Narrow" w:hAnsi="Arial Narrow"/>
@@ -4339,42 +2144,12 @@
                 <w:rFonts w:ascii="Arial Narrow" w:hAnsi="Arial Narrow"/>
               </w:rPr>
             </w:pPr>
-            <w:proofErr w:type="spellStart"/>
-            <w:r>
-              <w:rPr>
-                <w:rFonts w:ascii="Arial Narrow" w:hAnsi="Arial Narrow"/>
-              </w:rPr>
-              <w:t>tempat</w:t>
-            </w:r>
-            <w:proofErr w:type="spellEnd"/>
-            <w:r>
-              <w:rPr>
-                <w:rFonts w:ascii="Arial Narrow" w:hAnsi="Arial Narrow"/>
-              </w:rPr>
-              <w:t>/</w:t>
-            </w:r>
-            <w:proofErr w:type="spellStart"/>
-            <w:r>
-              <w:rPr>
-                <w:rFonts w:ascii="Arial Narrow" w:hAnsi="Arial Narrow"/>
-              </w:rPr>
-              <w:t>tanggal</w:t>
-            </w:r>
-            <w:proofErr w:type="spellEnd"/>
-            <w:r>
-              <w:rPr>
-                <w:rFonts w:ascii="Arial Narrow" w:hAnsi="Arial Narrow"/>
-              </w:rPr>
-              <w:t xml:space="preserve"> </w:t>
-            </w:r>
-            <w:proofErr w:type="spellStart"/>
-            <w:r>
-              <w:rPr>
-                <w:rFonts w:ascii="Arial Narrow" w:hAnsi="Arial Narrow"/>
-              </w:rPr>
-              <w:t>lahir</w:t>
-            </w:r>
-            <w:proofErr w:type="spellEnd"/>
+            <w:r>
+              <w:rPr>
+                <w:rFonts w:ascii="Arial Narrow" w:hAnsi="Arial Narrow"/>
+              </w:rPr>
+              <w:t>tempat/tanggal lahir</w:t>
+            </w:r>
           </w:p>
         </w:tc>
         <w:tc>
@@ -4412,7 +2187,6 @@
               </w:rPr>
               <w:t>${</w:t>
             </w:r>
-            <w:proofErr w:type="spellStart"/>
             <w:r>
               <w:rPr>
                 <w:rFonts w:ascii="Arial Narrow" w:eastAsia="Arial Narrow" w:hAnsi="Arial Narrow"/>
@@ -4420,7 +2194,6 @@
               </w:rPr>
               <w:t>suspectBirthPlace</w:t>
             </w:r>
-            <w:proofErr w:type="spellEnd"/>
             <w:r>
               <w:rPr>
                 <w:rFonts w:ascii="Arial Narrow" w:eastAsia="Arial Narrow" w:hAnsi="Arial Narrow"/>
@@ -4442,7 +2215,6 @@
               </w:rPr>
               <w:t>${</w:t>
             </w:r>
-            <w:proofErr w:type="spellStart"/>
             <w:r>
               <w:rPr>
                 <w:rFonts w:ascii="Arial Narrow" w:eastAsia="Arial Narrow" w:hAnsi="Arial Narrow"/>
@@ -4450,7 +2222,6 @@
               </w:rPr>
               <w:t>suspectBirthDate</w:t>
             </w:r>
-            <w:proofErr w:type="spellEnd"/>
             <w:r>
               <w:rPr>
                 <w:rFonts w:ascii="Arial Narrow" w:eastAsia="Arial Narrow" w:hAnsi="Arial Narrow"/>
@@ -4526,28 +2297,12 @@
                 <w:rFonts w:ascii="Arial Narrow" w:hAnsi="Arial Narrow"/>
               </w:rPr>
             </w:pPr>
-            <w:proofErr w:type="spellStart"/>
-            <w:r>
-              <w:rPr>
-                <w:rFonts w:ascii="Arial Narrow" w:hAnsi="Arial Narrow"/>
-              </w:rPr>
-              <w:t>jenis</w:t>
-            </w:r>
-            <w:proofErr w:type="spellEnd"/>
-            <w:r>
-              <w:rPr>
-                <w:rFonts w:ascii="Arial Narrow" w:hAnsi="Arial Narrow"/>
-              </w:rPr>
-              <w:t xml:space="preserve"> </w:t>
-            </w:r>
-            <w:proofErr w:type="spellStart"/>
-            <w:r>
-              <w:rPr>
-                <w:rFonts w:ascii="Arial Narrow" w:hAnsi="Arial Narrow"/>
-              </w:rPr>
-              <w:t>kelamin</w:t>
-            </w:r>
-            <w:proofErr w:type="spellEnd"/>
+            <w:r>
+              <w:rPr>
+                <w:rFonts w:ascii="Arial Narrow" w:hAnsi="Arial Narrow"/>
+              </w:rPr>
+              <w:t>jenis kelamin</w:t>
+            </w:r>
           </w:p>
         </w:tc>
         <w:tc>
@@ -4585,7 +2340,6 @@
               </w:rPr>
               <w:t>${</w:t>
             </w:r>
-            <w:proofErr w:type="spellStart"/>
             <w:r>
               <w:rPr>
                 <w:rFonts w:ascii="Arial Narrow" w:eastAsia="Arial Narrow" w:hAnsi="Arial Narrow"/>
@@ -4593,7 +2347,6 @@
               </w:rPr>
               <w:t>suspectGenderName</w:t>
             </w:r>
-            <w:proofErr w:type="spellEnd"/>
             <w:r>
               <w:rPr>
                 <w:rFonts w:ascii="Arial Narrow" w:eastAsia="Arial Narrow" w:hAnsi="Arial Narrow"/>
@@ -4669,14 +2422,12 @@
                 <w:rFonts w:ascii="Arial Narrow" w:hAnsi="Arial Narrow"/>
               </w:rPr>
             </w:pPr>
-            <w:proofErr w:type="spellStart"/>
             <w:r>
               <w:rPr>
                 <w:rFonts w:ascii="Arial Narrow" w:hAnsi="Arial Narrow"/>
               </w:rPr>
               <w:t>pekerjaan</w:t>
             </w:r>
-            <w:proofErr w:type="spellEnd"/>
           </w:p>
         </w:tc>
         <w:tc>
@@ -4714,7 +2465,6 @@
               </w:rPr>
               <w:t>${</w:t>
             </w:r>
-            <w:proofErr w:type="spellStart"/>
             <w:r>
               <w:rPr>
                 <w:rFonts w:ascii="Arial Narrow" w:eastAsia="Arial Narrow" w:hAnsi="Arial Narrow"/>
@@ -4722,7 +2472,6 @@
               </w:rPr>
               <w:t>suspectJobName</w:t>
             </w:r>
-            <w:proofErr w:type="spellEnd"/>
             <w:r>
               <w:rPr>
                 <w:rFonts w:ascii="Arial Narrow" w:eastAsia="Arial Narrow" w:hAnsi="Arial Narrow"/>
@@ -4798,14 +2547,12 @@
                 <w:rFonts w:ascii="Arial Narrow" w:hAnsi="Arial Narrow"/>
               </w:rPr>
             </w:pPr>
-            <w:proofErr w:type="spellStart"/>
             <w:r>
               <w:rPr>
                 <w:rFonts w:ascii="Arial Narrow" w:hAnsi="Arial Narrow"/>
               </w:rPr>
               <w:t>kewarganegaraan</w:t>
             </w:r>
-            <w:proofErr w:type="spellEnd"/>
           </w:p>
         </w:tc>
         <w:tc>
@@ -4841,23 +2588,132 @@
                 <w:rFonts w:ascii="Arial Narrow" w:eastAsia="Arial Narrow" w:hAnsi="Arial Narrow"/>
                 <w:color w:val="000000"/>
               </w:rPr>
-              <w:t>${</w:t>
-            </w:r>
-            <w:proofErr w:type="spellStart"/>
+              <w:t>${suspectNationality};</w:t>
+            </w:r>
+          </w:p>
+        </w:tc>
+      </w:tr>
+      <w:tr>
+        <w:tc>
+          <w:tcPr>
+            <w:tcW w:w="1530" w:type="dxa"/>
+          </w:tcPr>
+          <w:p>
+            <w:pPr>
+              <w:rPr>
+                <w:rFonts w:ascii="Arial Narrow" w:hAnsi="Arial Narrow"/>
+              </w:rPr>
+            </w:pPr>
+          </w:p>
+        </w:tc>
+        <w:tc>
+          <w:tcPr>
+            <w:tcW w:w="360" w:type="dxa"/>
+          </w:tcPr>
+          <w:p>
+            <w:pPr>
+              <w:rPr>
+                <w:rFonts w:ascii="Arial Narrow" w:hAnsi="Arial Narrow"/>
+              </w:rPr>
+            </w:pPr>
+          </w:p>
+        </w:tc>
+        <w:tc>
+          <w:tcPr>
+            <w:tcW w:w="450" w:type="dxa"/>
+          </w:tcPr>
+          <w:p>
+            <w:pPr>
+              <w:rPr>
+                <w:rFonts w:ascii="Arial Narrow" w:hAnsi="Arial Narrow"/>
+              </w:rPr>
+            </w:pPr>
+          </w:p>
+        </w:tc>
+        <w:tc>
+          <w:tcPr>
+            <w:tcW w:w="450" w:type="dxa"/>
+          </w:tcPr>
+          <w:p>
+            <w:pPr>
+              <w:rPr>
+                <w:rFonts w:ascii="Arial Narrow" w:hAnsi="Arial Narrow"/>
+              </w:rPr>
+            </w:pPr>
+            <w:r>
+              <w:rPr>
+                <w:rFonts w:ascii="Arial Narrow" w:hAnsi="Arial Narrow"/>
+              </w:rPr>
+              <w:t>g.</w:t>
+            </w:r>
+          </w:p>
+        </w:tc>
+        <w:tc>
+          <w:tcPr>
+            <w:tcW w:w="1803" w:type="dxa"/>
+          </w:tcPr>
+          <w:p>
+            <w:pPr>
+              <w:rPr>
+                <w:rFonts w:ascii="Arial Narrow" w:hAnsi="Arial Narrow"/>
+              </w:rPr>
+            </w:pPr>
+            <w:r>
+              <w:rPr>
+                <w:rFonts w:ascii="Arial Narrow" w:hAnsi="Arial Narrow"/>
+              </w:rPr>
+              <w:t>alamat</w:t>
+            </w:r>
+          </w:p>
+        </w:tc>
+        <w:tc>
+          <w:tcPr>
+            <w:tcW w:w="272" w:type="dxa"/>
+          </w:tcPr>
+          <w:p>
+            <w:pPr>
+              <w:rPr>
+                <w:rFonts w:ascii="Arial Narrow" w:hAnsi="Arial Narrow"/>
+              </w:rPr>
+            </w:pPr>
+            <w:r>
+              <w:rPr>
+                <w:rFonts w:ascii="Arial Narrow" w:hAnsi="Arial Narrow"/>
+              </w:rPr>
+              <w:t>:</w:t>
+            </w:r>
+          </w:p>
+        </w:tc>
+        <w:tc>
+          <w:tcPr>
+            <w:tcW w:w="4247" w:type="dxa"/>
+          </w:tcPr>
+          <w:p>
+            <w:pPr>
+              <w:rPr>
+                <w:rFonts w:ascii="Arial Narrow" w:hAnsi="Arial Narrow"/>
+              </w:rPr>
+            </w:pPr>
             <w:r>
               <w:rPr>
                 <w:rFonts w:ascii="Arial Narrow" w:eastAsia="Arial Narrow" w:hAnsi="Arial Narrow"/>
                 <w:color w:val="000000"/>
               </w:rPr>
-              <w:t>suspectNationality</w:t>
-            </w:r>
-            <w:proofErr w:type="spellEnd"/>
+              <w:t>${</w:t>
+            </w:r>
             <w:r>
               <w:rPr>
                 <w:rFonts w:ascii="Arial Narrow" w:eastAsia="Arial Narrow" w:hAnsi="Arial Narrow"/>
                 <w:color w:val="000000"/>
               </w:rPr>
-              <w:t>};</w:t>
+              <w:t>suspect</w:t>
+            </w:r>
+            <w:r>
+              <w:rPr>
+                <w:rFonts w:ascii="Arial Narrow" w:eastAsia="Arial Narrow" w:hAnsi="Arial Narrow"/>
+                <w:color w:val="000000"/>
+              </w:rPr>
+              <w:t>FullAddress};</w:t>
             </w:r>
           </w:p>
         </w:tc>
@@ -4901,99 +2757,85 @@
         </w:tc>
         <w:tc>
           <w:tcPr>
-            <w:tcW w:w="450" w:type="dxa"/>
-          </w:tcPr>
-          <w:p>
-            <w:pPr>
-              <w:rPr>
-                <w:rFonts w:ascii="Arial Narrow" w:hAnsi="Arial Narrow"/>
-              </w:rPr>
-            </w:pPr>
-            <w:r>
-              <w:rPr>
-                <w:rFonts w:ascii="Arial Narrow" w:hAnsi="Arial Narrow"/>
-              </w:rPr>
-              <w:t>g.</w:t>
-            </w:r>
-          </w:p>
-        </w:tc>
-        <w:tc>
-          <w:tcPr>
-            <w:tcW w:w="1803" w:type="dxa"/>
-          </w:tcPr>
-          <w:p>
-            <w:pPr>
-              <w:rPr>
-                <w:rFonts w:ascii="Arial Narrow" w:hAnsi="Arial Narrow"/>
-              </w:rPr>
-            </w:pPr>
-            <w:proofErr w:type="spellStart"/>
-            <w:r>
-              <w:rPr>
-                <w:rFonts w:ascii="Arial Narrow" w:hAnsi="Arial Narrow"/>
-              </w:rPr>
-              <w:t>alamat</w:t>
-            </w:r>
-            <w:proofErr w:type="spellEnd"/>
-          </w:p>
-        </w:tc>
-        <w:tc>
-          <w:tcPr>
-            <w:tcW w:w="272" w:type="dxa"/>
-          </w:tcPr>
-          <w:p>
-            <w:pPr>
-              <w:rPr>
-                <w:rFonts w:ascii="Arial Narrow" w:hAnsi="Arial Narrow"/>
-              </w:rPr>
-            </w:pPr>
-            <w:r>
-              <w:rPr>
-                <w:rFonts w:ascii="Arial Narrow" w:hAnsi="Arial Narrow"/>
-              </w:rPr>
-              <w:t>:</w:t>
-            </w:r>
-          </w:p>
-        </w:tc>
-        <w:tc>
-          <w:tcPr>
-            <w:tcW w:w="4247" w:type="dxa"/>
-          </w:tcPr>
-          <w:p>
-            <w:pPr>
-              <w:rPr>
-                <w:rFonts w:ascii="Arial Narrow" w:hAnsi="Arial Narrow"/>
-              </w:rPr>
-            </w:pPr>
-            <w:r>
+            <w:tcW w:w="6772" w:type="dxa"/>
+            <w:gridSpan w:val="4"/>
+          </w:tcPr>
+          <w:p>
+            <w:pPr>
               <w:rPr>
                 <w:rFonts w:ascii="Arial Narrow" w:eastAsia="Arial Narrow" w:hAnsi="Arial Narrow"/>
                 <w:color w:val="000000"/>
               </w:rPr>
-              <w:t>${</w:t>
-            </w:r>
-            <w:proofErr w:type="spellStart"/>
+            </w:pPr>
             <w:r>
               <w:rPr>
                 <w:rFonts w:ascii="Arial Narrow" w:eastAsia="Arial Narrow" w:hAnsi="Arial Narrow"/>
                 <w:color w:val="000000"/>
               </w:rPr>
-              <w:t>suspect</w:t>
+              <w:t>karena diduga telah melakukan tindak pidana</w:t>
             </w:r>
             <w:r>
               <w:rPr>
                 <w:rFonts w:ascii="Arial Narrow" w:eastAsia="Arial Narrow" w:hAnsi="Arial Narrow"/>
                 <w:color w:val="000000"/>
               </w:rPr>
-              <w:t>FullAddress</w:t>
-            </w:r>
-            <w:proofErr w:type="spellEnd"/>
+              <w:t xml:space="preserve"> ${crimeDescription}</w:t>
+            </w:r>
             <w:r>
               <w:rPr>
                 <w:rFonts w:ascii="Arial Narrow" w:eastAsia="Arial Narrow" w:hAnsi="Arial Narrow"/>
                 <w:color w:val="000000"/>
               </w:rPr>
-              <w:t>};</w:t>
+              <w:t xml:space="preserve">, sebagaimana dimaksud dalam Pasal </w:t>
+            </w:r>
+            <w:r>
+              <w:rPr>
+                <w:rFonts w:ascii="Arial Narrow" w:eastAsia="Arial Narrow" w:hAnsi="Arial Narrow"/>
+                <w:color w:val="000000"/>
+              </w:rPr>
+              <w:t>${allegedArticles}</w:t>
+            </w:r>
+            <w:r>
+              <w:rPr>
+                <w:rFonts w:ascii="Arial Narrow" w:eastAsia="Arial Narrow" w:hAnsi="Arial Narrow"/>
+                <w:color w:val="000000"/>
+              </w:rPr>
+              <w:t xml:space="preserve">, yang terjadi di </w:t>
+            </w:r>
+            <w:r>
+              <w:rPr>
+                <w:rFonts w:ascii="Arial Narrow" w:hAnsi="Arial Narrow" w:cs="Arial"/>
+                <w:lang w:val="sv-SE"/>
+              </w:rPr>
+              <w:t>${tempat_kejadian}</w:t>
+            </w:r>
+            <w:r>
+              <w:rPr>
+                <w:rFonts w:ascii="Arial" w:hAnsi="Arial" w:cs="Arial"/>
+                <w:lang w:val="sv-SE"/>
+              </w:rPr>
+              <w:t xml:space="preserve"> </w:t>
+            </w:r>
+            <w:r>
+              <w:rPr>
+                <w:rFonts w:ascii="Arial Narrow" w:eastAsia="Arial Narrow" w:hAnsi="Arial Narrow"/>
+                <w:color w:val="000000"/>
+              </w:rPr>
+              <w:t>pada tanggal/kurun waktu</w:t>
+            </w:r>
+            <w:r>
+              <w:rPr>
+                <w:rFonts w:ascii="Arial Narrow" w:eastAsia="Arial Narrow" w:hAnsi="Arial Narrow"/>
+                <w:color w:val="000000"/>
+              </w:rPr>
+              <w:t xml:space="preserve"> ${kurun_waktu}</w:t>
+            </w:r>
+            <w:r>
+              <w:rPr>
+                <w:rFonts w:ascii="Arial Narrow" w:eastAsia="Arial Narrow" w:hAnsi="Arial Narrow"/>
+                <w:color w:val="000000"/>
+              </w:rPr>
+              <w:t xml:space="preserve"> ;</w:t>
             </w:r>
           </w:p>
         </w:tc>
@@ -5001,6 +2843,23 @@
       <w:tr>
         <w:tc>
           <w:tcPr>
+            <w:tcW w:w="9112" w:type="dxa"/>
+            <w:gridSpan w:val="7"/>
+          </w:tcPr>
+          <w:p>
+            <w:pPr>
+              <w:rPr>
+                <w:rFonts w:ascii="Arial Narrow" w:hAnsi="Arial Narrow"/>
+                <w:sz w:val="12"/>
+                <w:szCs w:val="12"/>
+              </w:rPr>
+            </w:pPr>
+          </w:p>
+        </w:tc>
+      </w:tr>
+      <w:tr>
+        <w:tc>
+          <w:tcPr>
             <w:tcW w:w="1530" w:type="dxa"/>
           </w:tcPr>
           <w:p>
@@ -5033,6 +2892,12 @@
                 <w:rFonts w:ascii="Arial Narrow" w:hAnsi="Arial Narrow"/>
               </w:rPr>
             </w:pPr>
+            <w:r>
+              <w:rPr>
+                <w:rFonts w:ascii="Arial Narrow" w:hAnsi="Arial Narrow"/>
+              </w:rPr>
+              <w:t>2.</w:t>
+            </w:r>
           </w:p>
         </w:tc>
         <w:tc>
@@ -5043,18 +2908,14 @@
           <w:p>
             <w:pPr>
               <w:rPr>
-                <w:rFonts w:ascii="Arial Narrow" w:eastAsia="Arial Narrow" w:hAnsi="Arial Narrow"/>
-                <w:color w:val="000000"/>
-                <w:lang w:val="it-IT"/>
-              </w:rPr>
-            </w:pPr>
-            <w:r>
-              <w:rPr>
-                <w:rFonts w:ascii="Arial Narrow" w:eastAsia="Arial Narrow" w:hAnsi="Arial Narrow"/>
-                <w:color w:val="000000"/>
-                <w:lang w:val="it-IT"/>
-              </w:rPr>
-              <w:t>karena diduga telah melakukan tindak pidana ...., sebagaimana dimaksud dalam Pasal … (atau Pasal KUHP Baru) …., yang terjadi di … pada tanggal/kurun waktu …. ;</w:t>
+                <w:rFonts w:ascii="Arial Narrow" w:hAnsi="Arial Narrow"/>
+              </w:rPr>
+            </w:pPr>
+            <w:r>
+              <w:rPr>
+                <w:rFonts w:ascii="Arial Narrow" w:hAnsi="Arial Narrow"/>
+              </w:rPr>
+              <w:t>menetapkan tersangka di:</w:t>
             </w:r>
           </w:p>
         </w:tc>
@@ -5062,18 +2923,59 @@
       <w:tr>
         <w:tc>
           <w:tcPr>
-            <w:tcW w:w="9112" w:type="dxa"/>
-            <w:gridSpan w:val="7"/>
-          </w:tcPr>
-          <w:p>
-            <w:pPr>
-              <w:rPr>
-                <w:rFonts w:ascii="Arial Narrow" w:hAnsi="Arial Narrow"/>
-                <w:sz w:val="12"/>
-                <w:szCs w:val="12"/>
-                <w:lang w:val="it-IT"/>
-              </w:rPr>
-            </w:pPr>
+            <w:tcW w:w="1530" w:type="dxa"/>
+          </w:tcPr>
+          <w:p>
+            <w:pPr>
+              <w:rPr>
+                <w:rFonts w:ascii="Arial Narrow" w:hAnsi="Arial Narrow"/>
+              </w:rPr>
+            </w:pPr>
+          </w:p>
+        </w:tc>
+        <w:tc>
+          <w:tcPr>
+            <w:tcW w:w="360" w:type="dxa"/>
+          </w:tcPr>
+          <w:p>
+            <w:pPr>
+              <w:rPr>
+                <w:rFonts w:ascii="Arial Narrow" w:hAnsi="Arial Narrow"/>
+              </w:rPr>
+            </w:pPr>
+          </w:p>
+        </w:tc>
+        <w:tc>
+          <w:tcPr>
+            <w:tcW w:w="450" w:type="dxa"/>
+          </w:tcPr>
+          <w:p>
+            <w:pPr>
+              <w:rPr>
+                <w:rFonts w:ascii="Arial Narrow" w:hAnsi="Arial Narrow"/>
+              </w:rPr>
+            </w:pPr>
+          </w:p>
+        </w:tc>
+        <w:tc>
+          <w:tcPr>
+            <w:tcW w:w="6772" w:type="dxa"/>
+            <w:gridSpan w:val="4"/>
+          </w:tcPr>
+          <w:p>
+            <w:pPr>
+              <w:rPr>
+                <w:rFonts w:ascii="Arial Narrow" w:hAnsi="Arial Narrow"/>
+                <w:lang w:val="fi-FI"/>
+              </w:rPr>
+            </w:pPr>
+            <w:r>
+              <w:rPr>
+                <w:rFonts w:ascii="Arial Narrow" w:hAnsi="Arial Narrow"/>
+                <w:lang w:val="fi-FI"/>
+              </w:rPr>
+              <w:t>${tempat_penahanan}</w:t>
+            </w:r>
           </w:p>
         </w:tc>
       </w:tr>
@@ -5086,7 +2988,7 @@
             <w:pPr>
               <w:rPr>
                 <w:rFonts w:ascii="Arial Narrow" w:hAnsi="Arial Narrow"/>
-                <w:lang w:val="it-IT"/>
+                <w:lang w:val="fi-FI"/>
               </w:rPr>
             </w:pPr>
           </w:p>
@@ -5099,7 +3001,7 @@
             <w:pPr>
               <w:rPr>
                 <w:rFonts w:ascii="Arial Narrow" w:hAnsi="Arial Narrow"/>
-                <w:lang w:val="it-IT"/>
+                <w:lang w:val="fi-FI"/>
               </w:rPr>
             </w:pPr>
           </w:p>
@@ -5118,7 +3020,7 @@
               <w:rPr>
                 <w:rFonts w:ascii="Arial Narrow" w:hAnsi="Arial Narrow"/>
               </w:rPr>
-              <w:t>2.</w:t>
+              <w:t>3.</w:t>
             </w:r>
           </w:p>
         </w:tc>
@@ -5131,35 +3033,36 @@
             <w:pPr>
               <w:rPr>
                 <w:rFonts w:ascii="Arial Narrow" w:hAnsi="Arial Narrow"/>
-              </w:rPr>
-            </w:pPr>
-            <w:proofErr w:type="spellStart"/>
-            <w:r>
-              <w:rPr>
-                <w:rFonts w:ascii="Arial Narrow" w:hAnsi="Arial Narrow"/>
-              </w:rPr>
-              <w:t>menetapkan</w:t>
-            </w:r>
-            <w:proofErr w:type="spellEnd"/>
-            <w:r>
-              <w:rPr>
-                <w:rFonts w:ascii="Arial Narrow" w:hAnsi="Arial Narrow"/>
-              </w:rPr>
-              <w:t xml:space="preserve"> </w:t>
-            </w:r>
-            <w:proofErr w:type="spellStart"/>
-            <w:r>
-              <w:rPr>
-                <w:rFonts w:ascii="Arial Narrow" w:hAnsi="Arial Narrow"/>
-              </w:rPr>
-              <w:t>tersangka</w:t>
-            </w:r>
-            <w:proofErr w:type="spellEnd"/>
-            <w:r>
-              <w:rPr>
-                <w:rFonts w:ascii="Arial Narrow" w:hAnsi="Arial Narrow"/>
-              </w:rPr>
-              <w:t xml:space="preserve"> di:</w:t>
+                <w:lang w:val="fi-FI"/>
+              </w:rPr>
+            </w:pPr>
+            <w:r>
+              <w:rPr>
+                <w:rFonts w:ascii="Arial Narrow" w:hAnsi="Arial Narrow"/>
+                <w:lang w:val="fi-FI"/>
+              </w:rPr>
+              <w:t>dalam waktu 1 (satu) har</w:t>
+            </w:r>
+            <w:r>
+              <w:rPr>
+                <w:rFonts w:ascii="Arial Narrow" w:hAnsi="Arial Narrow"/>
+                <w:lang w:val="fi-FI"/>
+              </w:rPr>
+              <w:t>i</w:t>
+            </w:r>
+            <w:r>
+              <w:rPr>
+                <w:rFonts w:ascii="Arial Narrow" w:hAnsi="Arial Narrow"/>
+                <w:lang w:val="fi-FI"/>
+              </w:rPr>
+              <w:t xml:space="preserve"> s</w:t>
+            </w:r>
+            <w:r>
+              <w:rPr>
+                <w:rFonts w:ascii="Arial Narrow" w:hAnsi="Arial Narrow"/>
+                <w:lang w:val="fi-FI"/>
+              </w:rPr>
+              <w:t>etelah perintah penahanan tersebut dijalankan, tersangka harus mulai diperiksa oleh penyidik;</w:t>
             </w:r>
           </w:p>
         </w:tc>
@@ -5173,6 +3076,7 @@
             <w:pPr>
               <w:rPr>
                 <w:rFonts w:ascii="Arial Narrow" w:hAnsi="Arial Narrow"/>
+                <w:lang w:val="fi-FI"/>
               </w:rPr>
             </w:pPr>
           </w:p>
@@ -5185,6 +3089,7 @@
             <w:pPr>
               <w:rPr>
                 <w:rFonts w:ascii="Arial Narrow" w:hAnsi="Arial Narrow"/>
+                <w:lang w:val="fi-FI"/>
               </w:rPr>
             </w:pPr>
           </w:p>
@@ -5199,51 +3104,48 @@
                 <w:rFonts w:ascii="Arial Narrow" w:hAnsi="Arial Narrow"/>
               </w:rPr>
             </w:pPr>
-          </w:p>
-        </w:tc>
-        <w:tc>
-          <w:tcPr>
-            <w:tcW w:w="450" w:type="dxa"/>
-          </w:tcPr>
-          <w:p>
-            <w:pPr>
-              <w:rPr>
-                <w:rFonts w:ascii="Arial Narrow" w:hAnsi="Arial Narrow"/>
-              </w:rPr>
-            </w:pPr>
-            <w:r>
-              <w:rPr>
-                <w:rFonts w:ascii="Arial Narrow" w:hAnsi="Arial Narrow"/>
-              </w:rPr>
-              <w:t>a.</w:t>
-            </w:r>
-          </w:p>
-        </w:tc>
-        <w:tc>
-          <w:tcPr>
-            <w:tcW w:w="6322" w:type="dxa"/>
-            <w:gridSpan w:val="3"/>
-          </w:tcPr>
-          <w:p>
-            <w:pPr>
-              <w:rPr>
-                <w:rFonts w:ascii="Arial Narrow" w:hAnsi="Arial Narrow"/>
-                <w:lang w:val="fi-FI"/>
-              </w:rPr>
-            </w:pPr>
-            <w:r>
-              <w:rPr>
-                <w:rFonts w:ascii="Arial Narrow" w:hAnsi="Arial Narrow"/>
-                <w:lang w:val="fi-FI"/>
-              </w:rPr>
-              <w:t>rumah tahanan Negara … cabang .. (Sa</w:t>
-            </w:r>
-            <w:r>
-              <w:rPr>
-                <w:rFonts w:ascii="Arial Narrow" w:hAnsi="Arial Narrow"/>
-                <w:lang w:val="fi-FI"/>
-              </w:rPr>
-              <w:t>tker);</w:t>
+            <w:r>
+              <w:rPr>
+                <w:rFonts w:ascii="Arial Narrow" w:hAnsi="Arial Narrow"/>
+              </w:rPr>
+              <w:t xml:space="preserve">4. </w:t>
+            </w:r>
+          </w:p>
+        </w:tc>
+        <w:tc>
+          <w:tcPr>
+            <w:tcW w:w="6772" w:type="dxa"/>
+            <w:gridSpan w:val="4"/>
+          </w:tcPr>
+          <w:p>
+            <w:pPr>
+              <w:rPr>
+                <w:rFonts w:ascii="Arial Narrow" w:hAnsi="Arial Narrow"/>
+              </w:rPr>
+            </w:pPr>
+            <w:r>
+              <w:rPr>
+                <w:rFonts w:ascii="Arial Narrow" w:hAnsi="Arial Narrow"/>
+              </w:rPr>
+              <w:t>dalam waktu paling lama 1 (satu) har</w:t>
+            </w:r>
+            <w:r>
+              <w:rPr>
+                <w:rFonts w:ascii="Arial Narrow" w:hAnsi="Arial Narrow"/>
+              </w:rPr>
+              <w:t>i</w:t>
+            </w:r>
+            <w:r>
+              <w:rPr>
+                <w:rFonts w:ascii="Arial Narrow" w:hAnsi="Arial Narrow"/>
+              </w:rPr>
+              <w:t xml:space="preserve"> terhitung sejak penahanan, tembusan surat perintah penahanan atau penetapan hakin harus diberikan kepada keluarga atau wali tersangka atau orang y</w:t>
+            </w:r>
+            <w:r>
+              <w:rPr>
+                <w:rFonts w:ascii="Arial Narrow" w:hAnsi="Arial Narrow"/>
+              </w:rPr>
+              <w:t>ang ditunjuk oleh tersangka;</w:t>
             </w:r>
           </w:p>
         </w:tc>
@@ -5257,7 +3159,6 @@
             <w:pPr>
               <w:rPr>
                 <w:rFonts w:ascii="Arial Narrow" w:hAnsi="Arial Narrow"/>
-                <w:lang w:val="fi-FI"/>
               </w:rPr>
             </w:pPr>
           </w:p>
@@ -5270,7 +3171,6 @@
             <w:pPr>
               <w:rPr>
                 <w:rFonts w:ascii="Arial Narrow" w:hAnsi="Arial Narrow"/>
-                <w:lang w:val="fi-FI"/>
               </w:rPr>
             </w:pPr>
           </w:p>
@@ -5283,54 +3183,34 @@
             <w:pPr>
               <w:rPr>
                 <w:rFonts w:ascii="Arial Narrow" w:hAnsi="Arial Narrow"/>
-                <w:lang w:val="fi-FI"/>
-              </w:rPr>
-            </w:pPr>
-          </w:p>
-        </w:tc>
-        <w:tc>
-          <w:tcPr>
-            <w:tcW w:w="450" w:type="dxa"/>
-          </w:tcPr>
-          <w:p>
-            <w:pPr>
-              <w:rPr>
-                <w:rFonts w:ascii="Arial Narrow" w:hAnsi="Arial Narrow"/>
-              </w:rPr>
-            </w:pPr>
-            <w:r>
-              <w:rPr>
-                <w:rFonts w:ascii="Arial Narrow" w:hAnsi="Arial Narrow"/>
-              </w:rPr>
-              <w:t>b.</w:t>
-            </w:r>
-          </w:p>
-        </w:tc>
-        <w:tc>
-          <w:tcPr>
-            <w:tcW w:w="6322" w:type="dxa"/>
-            <w:gridSpan w:val="3"/>
-          </w:tcPr>
-          <w:p>
-            <w:pPr>
-              <w:rPr>
-                <w:rFonts w:ascii="Arial Narrow" w:hAnsi="Arial Narrow"/>
-                <w:lang w:val="fi-FI"/>
-              </w:rPr>
-            </w:pPr>
-            <w:r>
-              <w:rPr>
-                <w:rFonts w:ascii="Arial Narrow" w:hAnsi="Arial Narrow"/>
-                <w:lang w:val="fi-FI"/>
-              </w:rPr>
-              <w:t>rumah tempat tinggal/kediaman te</w:t>
-            </w:r>
-            <w:r>
-              <w:rPr>
-                <w:rFonts w:ascii="Arial Narrow" w:hAnsi="Arial Narrow"/>
-                <w:lang w:val="fi-FI"/>
-              </w:rPr>
-              <w:t>rsangka di .....;</w:t>
+              </w:rPr>
+            </w:pPr>
+            <w:r>
+              <w:rPr>
+                <w:rFonts w:ascii="Arial Narrow" w:hAnsi="Arial Narrow"/>
+              </w:rPr>
+              <w:t>5.</w:t>
+            </w:r>
+          </w:p>
+        </w:tc>
+        <w:tc>
+          <w:tcPr>
+            <w:tcW w:w="6772" w:type="dxa"/>
+            <w:gridSpan w:val="4"/>
+          </w:tcPr>
+          <w:p>
+            <w:pPr>
+              <w:rPr>
+                <w:rFonts w:ascii="Arial Narrow" w:hAnsi="Arial Narrow"/>
+                <w:lang w:val="fi-FI"/>
+              </w:rPr>
+            </w:pPr>
+            <w:r>
+              <w:rPr>
+                <w:rFonts w:ascii="Arial Narrow" w:hAnsi="Arial Narrow"/>
+                <w:lang w:val="fi-FI"/>
+              </w:rPr>
+              <w:t>melaksanakan perintah ini dengan saksama dan penuh rasa tanggung jawab dan membuat Berita Acara Penahanan serta melaporkan kepada Atasan Penyidik</w:t>
             </w:r>
           </w:p>
         </w:tc>
@@ -5344,643 +3224,14 @@
             <w:pPr>
               <w:rPr>
                 <w:rFonts w:ascii="Arial Narrow" w:hAnsi="Arial Narrow"/>
-                <w:lang w:val="fi-FI"/>
-              </w:rPr>
-            </w:pPr>
-          </w:p>
-        </w:tc>
-        <w:tc>
-          <w:tcPr>
-            <w:tcW w:w="360" w:type="dxa"/>
-          </w:tcPr>
-          <w:p>
-            <w:pPr>
-              <w:rPr>
-                <w:rFonts w:ascii="Arial Narrow" w:hAnsi="Arial Narrow"/>
-                <w:lang w:val="fi-FI"/>
-              </w:rPr>
-            </w:pPr>
-          </w:p>
-        </w:tc>
-        <w:tc>
-          <w:tcPr>
-            <w:tcW w:w="450" w:type="dxa"/>
-          </w:tcPr>
-          <w:p>
-            <w:pPr>
-              <w:rPr>
-                <w:rFonts w:ascii="Arial Narrow" w:hAnsi="Arial Narrow"/>
-                <w:lang w:val="fi-FI"/>
-              </w:rPr>
-            </w:pPr>
-          </w:p>
-        </w:tc>
-        <w:tc>
-          <w:tcPr>
-            <w:tcW w:w="450" w:type="dxa"/>
-          </w:tcPr>
-          <w:p>
-            <w:pPr>
-              <w:rPr>
-                <w:rFonts w:ascii="Arial Narrow" w:hAnsi="Arial Narrow"/>
-              </w:rPr>
-            </w:pPr>
-            <w:r>
-              <w:rPr>
-                <w:rFonts w:ascii="Arial Narrow" w:hAnsi="Arial Narrow"/>
-              </w:rPr>
-              <w:t>c.</w:t>
-            </w:r>
-          </w:p>
-        </w:tc>
-        <w:tc>
-          <w:tcPr>
-            <w:tcW w:w="6322" w:type="dxa"/>
-            <w:gridSpan w:val="3"/>
-          </w:tcPr>
-          <w:p>
-            <w:pPr>
-              <w:rPr>
-                <w:rFonts w:ascii="Arial Narrow" w:hAnsi="Arial Narrow"/>
-                <w:lang w:val="fi-FI"/>
-              </w:rPr>
-            </w:pPr>
-            <w:r>
-              <w:rPr>
-                <w:rFonts w:ascii="Arial Narrow" w:hAnsi="Arial Narrow"/>
-                <w:lang w:val="fi-FI"/>
-              </w:rPr>
-              <w:t>kota tempat tinggal/kediaman t</w:t>
-            </w:r>
-            <w:r>
-              <w:rPr>
-                <w:rFonts w:ascii="Arial Narrow" w:hAnsi="Arial Narrow"/>
-                <w:lang w:val="fi-FI"/>
-              </w:rPr>
-              <w:t>ersangka di ...</w:t>
-            </w:r>
-          </w:p>
-        </w:tc>
-      </w:tr>
-      <w:tr>
-        <w:tc>
-          <w:tcPr>
-            <w:tcW w:w="1530" w:type="dxa"/>
-          </w:tcPr>
-          <w:p>
-            <w:pPr>
-              <w:rPr>
-                <w:rFonts w:ascii="Arial Narrow" w:hAnsi="Arial Narrow"/>
-                <w:lang w:val="fi-FI"/>
-              </w:rPr>
-            </w:pPr>
-          </w:p>
-        </w:tc>
-        <w:tc>
-          <w:tcPr>
-            <w:tcW w:w="360" w:type="dxa"/>
-          </w:tcPr>
-          <w:p>
-            <w:pPr>
-              <w:rPr>
-                <w:rFonts w:ascii="Arial Narrow" w:hAnsi="Arial Narrow"/>
-                <w:lang w:val="fi-FI"/>
-              </w:rPr>
-            </w:pPr>
-          </w:p>
-        </w:tc>
-        <w:tc>
-          <w:tcPr>
-            <w:tcW w:w="450" w:type="dxa"/>
-          </w:tcPr>
-          <w:p>
-            <w:pPr>
-              <w:rPr>
-                <w:rFonts w:ascii="Arial Narrow" w:hAnsi="Arial Narrow"/>
-              </w:rPr>
-            </w:pPr>
-            <w:r>
-              <w:rPr>
-                <w:rFonts w:ascii="Arial Narrow" w:hAnsi="Arial Narrow"/>
-              </w:rPr>
-              <w:t>3.</w:t>
-            </w:r>
-          </w:p>
-        </w:tc>
-        <w:tc>
-          <w:tcPr>
-            <w:tcW w:w="6772" w:type="dxa"/>
-            <w:gridSpan w:val="4"/>
-          </w:tcPr>
-          <w:p>
-            <w:pPr>
-              <w:rPr>
-                <w:rFonts w:ascii="Arial Narrow" w:hAnsi="Arial Narrow"/>
-                <w:lang w:val="fi-FI"/>
-              </w:rPr>
-            </w:pPr>
-            <w:r>
-              <w:rPr>
-                <w:rFonts w:ascii="Arial Narrow" w:hAnsi="Arial Narrow"/>
-                <w:lang w:val="fi-FI"/>
-              </w:rPr>
-              <w:t>dalam waktu 1 (satu) haru s</w:t>
-            </w:r>
-            <w:r>
-              <w:rPr>
-                <w:rFonts w:ascii="Arial Narrow" w:hAnsi="Arial Narrow"/>
-                <w:lang w:val="fi-FI"/>
-              </w:rPr>
-              <w:t>etelah perintah penahanan tersebut dijalankan, tersangka harus mulai diperiksa oleh penyidik;</w:t>
-            </w:r>
-          </w:p>
-        </w:tc>
-      </w:tr>
-      <w:tr>
-        <w:tc>
-          <w:tcPr>
-            <w:tcW w:w="1530" w:type="dxa"/>
-          </w:tcPr>
-          <w:p>
-            <w:pPr>
-              <w:rPr>
-                <w:rFonts w:ascii="Arial Narrow" w:hAnsi="Arial Narrow"/>
-                <w:lang w:val="fi-FI"/>
-              </w:rPr>
-            </w:pPr>
-          </w:p>
-        </w:tc>
-        <w:tc>
-          <w:tcPr>
-            <w:tcW w:w="360" w:type="dxa"/>
-          </w:tcPr>
-          <w:p>
-            <w:pPr>
-              <w:rPr>
-                <w:rFonts w:ascii="Arial Narrow" w:hAnsi="Arial Narrow"/>
-                <w:lang w:val="fi-FI"/>
-              </w:rPr>
-            </w:pPr>
-          </w:p>
-        </w:tc>
-        <w:tc>
-          <w:tcPr>
-            <w:tcW w:w="450" w:type="dxa"/>
-          </w:tcPr>
-          <w:p>
-            <w:pPr>
-              <w:rPr>
-                <w:rFonts w:ascii="Arial Narrow" w:hAnsi="Arial Narrow"/>
-              </w:rPr>
-            </w:pPr>
-            <w:r>
-              <w:rPr>
-                <w:rFonts w:ascii="Arial Narrow" w:hAnsi="Arial Narrow"/>
-              </w:rPr>
-              <w:t xml:space="preserve">4. </w:t>
-            </w:r>
-          </w:p>
-        </w:tc>
-        <w:tc>
-          <w:tcPr>
-            <w:tcW w:w="6772" w:type="dxa"/>
-            <w:gridSpan w:val="4"/>
-          </w:tcPr>
-          <w:p>
-            <w:pPr>
-              <w:rPr>
-                <w:rFonts w:ascii="Arial Narrow" w:hAnsi="Arial Narrow"/>
-              </w:rPr>
-            </w:pPr>
-            <w:proofErr w:type="spellStart"/>
-            <w:r>
-              <w:rPr>
-                <w:rFonts w:ascii="Arial Narrow" w:hAnsi="Arial Narrow"/>
-              </w:rPr>
-              <w:t>dalam</w:t>
-            </w:r>
-            <w:proofErr w:type="spellEnd"/>
-            <w:r>
-              <w:rPr>
-                <w:rFonts w:ascii="Arial Narrow" w:hAnsi="Arial Narrow"/>
-              </w:rPr>
-              <w:t xml:space="preserve"> </w:t>
-            </w:r>
-            <w:proofErr w:type="spellStart"/>
-            <w:r>
-              <w:rPr>
-                <w:rFonts w:ascii="Arial Narrow" w:hAnsi="Arial Narrow"/>
-              </w:rPr>
-              <w:t>waktu</w:t>
-            </w:r>
-            <w:proofErr w:type="spellEnd"/>
-            <w:r>
-              <w:rPr>
-                <w:rFonts w:ascii="Arial Narrow" w:hAnsi="Arial Narrow"/>
-              </w:rPr>
-              <w:t xml:space="preserve"> paling lama 1 (</w:t>
-            </w:r>
-            <w:proofErr w:type="spellStart"/>
-            <w:r>
-              <w:rPr>
-                <w:rFonts w:ascii="Arial Narrow" w:hAnsi="Arial Narrow"/>
-              </w:rPr>
-              <w:t>satu</w:t>
-            </w:r>
-            <w:proofErr w:type="spellEnd"/>
-            <w:r>
-              <w:rPr>
-                <w:rFonts w:ascii="Arial Narrow" w:hAnsi="Arial Narrow"/>
-              </w:rPr>
-              <w:t xml:space="preserve">) </w:t>
-            </w:r>
-            <w:proofErr w:type="spellStart"/>
-            <w:r>
-              <w:rPr>
-                <w:rFonts w:ascii="Arial Narrow" w:hAnsi="Arial Narrow"/>
-              </w:rPr>
-              <w:t>haru</w:t>
-            </w:r>
-            <w:proofErr w:type="spellEnd"/>
-            <w:r>
-              <w:rPr>
-                <w:rFonts w:ascii="Arial Narrow" w:hAnsi="Arial Narrow"/>
-              </w:rPr>
-              <w:t xml:space="preserve"> </w:t>
-            </w:r>
-            <w:proofErr w:type="spellStart"/>
-            <w:r>
-              <w:rPr>
-                <w:rFonts w:ascii="Arial Narrow" w:hAnsi="Arial Narrow"/>
-              </w:rPr>
-              <w:t>terhitung</w:t>
-            </w:r>
-            <w:proofErr w:type="spellEnd"/>
-            <w:r>
-              <w:rPr>
-                <w:rFonts w:ascii="Arial Narrow" w:hAnsi="Arial Narrow"/>
-              </w:rPr>
-              <w:t xml:space="preserve"> </w:t>
-            </w:r>
-            <w:proofErr w:type="spellStart"/>
-            <w:r>
-              <w:rPr>
-                <w:rFonts w:ascii="Arial Narrow" w:hAnsi="Arial Narrow"/>
-              </w:rPr>
-              <w:t>sejak</w:t>
-            </w:r>
-            <w:proofErr w:type="spellEnd"/>
-            <w:r>
-              <w:rPr>
-                <w:rFonts w:ascii="Arial Narrow" w:hAnsi="Arial Narrow"/>
-              </w:rPr>
-              <w:t xml:space="preserve"> </w:t>
-            </w:r>
-            <w:proofErr w:type="spellStart"/>
-            <w:r>
-              <w:rPr>
-                <w:rFonts w:ascii="Arial Narrow" w:hAnsi="Arial Narrow"/>
-              </w:rPr>
-              <w:t>penahanan</w:t>
-            </w:r>
-            <w:proofErr w:type="spellEnd"/>
-            <w:r>
-              <w:rPr>
-                <w:rFonts w:ascii="Arial Narrow" w:hAnsi="Arial Narrow"/>
-              </w:rPr>
-              <w:t xml:space="preserve">, </w:t>
-            </w:r>
-            <w:proofErr w:type="spellStart"/>
-            <w:r>
-              <w:rPr>
-                <w:rFonts w:ascii="Arial Narrow" w:hAnsi="Arial Narrow"/>
-              </w:rPr>
-              <w:t>tembusan</w:t>
-            </w:r>
-            <w:proofErr w:type="spellEnd"/>
-            <w:r>
-              <w:rPr>
-                <w:rFonts w:ascii="Arial Narrow" w:hAnsi="Arial Narrow"/>
-              </w:rPr>
-              <w:t xml:space="preserve"> </w:t>
-            </w:r>
-            <w:proofErr w:type="spellStart"/>
-            <w:r>
-              <w:rPr>
-                <w:rFonts w:ascii="Arial Narrow" w:hAnsi="Arial Narrow"/>
-              </w:rPr>
-              <w:t>surat</w:t>
-            </w:r>
-            <w:proofErr w:type="spellEnd"/>
-            <w:r>
-              <w:rPr>
-                <w:rFonts w:ascii="Arial Narrow" w:hAnsi="Arial Narrow"/>
-              </w:rPr>
-              <w:t xml:space="preserve"> </w:t>
-            </w:r>
-            <w:proofErr w:type="spellStart"/>
-            <w:r>
-              <w:rPr>
-                <w:rFonts w:ascii="Arial Narrow" w:hAnsi="Arial Narrow"/>
-              </w:rPr>
-              <w:t>perintah</w:t>
-            </w:r>
-            <w:proofErr w:type="spellEnd"/>
-            <w:r>
-              <w:rPr>
-                <w:rFonts w:ascii="Arial Narrow" w:hAnsi="Arial Narrow"/>
-              </w:rPr>
-              <w:t xml:space="preserve"> </w:t>
-            </w:r>
-            <w:proofErr w:type="spellStart"/>
-            <w:r>
-              <w:rPr>
-                <w:rFonts w:ascii="Arial Narrow" w:hAnsi="Arial Narrow"/>
-              </w:rPr>
-              <w:t>penahanan</w:t>
-            </w:r>
-            <w:proofErr w:type="spellEnd"/>
-            <w:r>
-              <w:rPr>
-                <w:rFonts w:ascii="Arial Narrow" w:hAnsi="Arial Narrow"/>
-              </w:rPr>
-              <w:t xml:space="preserve"> </w:t>
-            </w:r>
-            <w:proofErr w:type="spellStart"/>
-            <w:r>
-              <w:rPr>
-                <w:rFonts w:ascii="Arial Narrow" w:hAnsi="Arial Narrow"/>
-              </w:rPr>
-              <w:t>atau</w:t>
-            </w:r>
-            <w:proofErr w:type="spellEnd"/>
-            <w:r>
-              <w:rPr>
-                <w:rFonts w:ascii="Arial Narrow" w:hAnsi="Arial Narrow"/>
-              </w:rPr>
-              <w:t xml:space="preserve"> </w:t>
-            </w:r>
-            <w:proofErr w:type="spellStart"/>
-            <w:r>
-              <w:rPr>
-                <w:rFonts w:ascii="Arial Narrow" w:hAnsi="Arial Narrow"/>
-              </w:rPr>
-              <w:t>penetapan</w:t>
-            </w:r>
-            <w:proofErr w:type="spellEnd"/>
-            <w:r>
-              <w:rPr>
-                <w:rFonts w:ascii="Arial Narrow" w:hAnsi="Arial Narrow"/>
-              </w:rPr>
-              <w:t xml:space="preserve"> </w:t>
-            </w:r>
-            <w:proofErr w:type="spellStart"/>
-            <w:r>
-              <w:rPr>
-                <w:rFonts w:ascii="Arial Narrow" w:hAnsi="Arial Narrow"/>
-              </w:rPr>
-              <w:t>hakin</w:t>
-            </w:r>
-            <w:proofErr w:type="spellEnd"/>
-            <w:r>
-              <w:rPr>
-                <w:rFonts w:ascii="Arial Narrow" w:hAnsi="Arial Narrow"/>
-              </w:rPr>
-              <w:t xml:space="preserve"> </w:t>
-            </w:r>
-            <w:proofErr w:type="spellStart"/>
-            <w:r>
-              <w:rPr>
-                <w:rFonts w:ascii="Arial Narrow" w:hAnsi="Arial Narrow"/>
-              </w:rPr>
-              <w:t>harus</w:t>
-            </w:r>
-            <w:proofErr w:type="spellEnd"/>
-            <w:r>
-              <w:rPr>
-                <w:rFonts w:ascii="Arial Narrow" w:hAnsi="Arial Narrow"/>
-              </w:rPr>
-              <w:t xml:space="preserve"> </w:t>
-            </w:r>
-            <w:proofErr w:type="spellStart"/>
-            <w:r>
-              <w:rPr>
-                <w:rFonts w:ascii="Arial Narrow" w:hAnsi="Arial Narrow"/>
-              </w:rPr>
-              <w:t>diberikan</w:t>
-            </w:r>
-            <w:proofErr w:type="spellEnd"/>
-            <w:r>
-              <w:rPr>
-                <w:rFonts w:ascii="Arial Narrow" w:hAnsi="Arial Narrow"/>
-              </w:rPr>
-              <w:t xml:space="preserve"> </w:t>
-            </w:r>
-            <w:proofErr w:type="spellStart"/>
-            <w:r>
-              <w:rPr>
-                <w:rFonts w:ascii="Arial Narrow" w:hAnsi="Arial Narrow"/>
-              </w:rPr>
-              <w:t>kepada</w:t>
-            </w:r>
-            <w:proofErr w:type="spellEnd"/>
-            <w:r>
-              <w:rPr>
-                <w:rFonts w:ascii="Arial Narrow" w:hAnsi="Arial Narrow"/>
-              </w:rPr>
-              <w:t xml:space="preserve"> </w:t>
-            </w:r>
-            <w:proofErr w:type="spellStart"/>
-            <w:r>
-              <w:rPr>
-                <w:rFonts w:ascii="Arial Narrow" w:hAnsi="Arial Narrow"/>
-              </w:rPr>
-              <w:t>keluarga</w:t>
-            </w:r>
-            <w:proofErr w:type="spellEnd"/>
-            <w:r>
-              <w:rPr>
-                <w:rFonts w:ascii="Arial Narrow" w:hAnsi="Arial Narrow"/>
-              </w:rPr>
-              <w:t xml:space="preserve"> </w:t>
-            </w:r>
-            <w:proofErr w:type="spellStart"/>
-            <w:r>
-              <w:rPr>
-                <w:rFonts w:ascii="Arial Narrow" w:hAnsi="Arial Narrow"/>
-              </w:rPr>
-              <w:t>atau</w:t>
-            </w:r>
-            <w:proofErr w:type="spellEnd"/>
-            <w:r>
-              <w:rPr>
-                <w:rFonts w:ascii="Arial Narrow" w:hAnsi="Arial Narrow"/>
-              </w:rPr>
-              <w:t xml:space="preserve"> </w:t>
-            </w:r>
-            <w:proofErr w:type="spellStart"/>
-            <w:r>
-              <w:rPr>
-                <w:rFonts w:ascii="Arial Narrow" w:hAnsi="Arial Narrow"/>
-              </w:rPr>
-              <w:t>wali</w:t>
-            </w:r>
-            <w:proofErr w:type="spellEnd"/>
-            <w:r>
-              <w:rPr>
-                <w:rFonts w:ascii="Arial Narrow" w:hAnsi="Arial Narrow"/>
-              </w:rPr>
-              <w:t xml:space="preserve"> </w:t>
-            </w:r>
-            <w:proofErr w:type="spellStart"/>
-            <w:r>
-              <w:rPr>
-                <w:rFonts w:ascii="Arial Narrow" w:hAnsi="Arial Narrow"/>
-              </w:rPr>
-              <w:t>tersangka</w:t>
-            </w:r>
-            <w:proofErr w:type="spellEnd"/>
-            <w:r>
-              <w:rPr>
-                <w:rFonts w:ascii="Arial Narrow" w:hAnsi="Arial Narrow"/>
-              </w:rPr>
-              <w:t xml:space="preserve"> </w:t>
-            </w:r>
-            <w:proofErr w:type="spellStart"/>
-            <w:r>
-              <w:rPr>
-                <w:rFonts w:ascii="Arial Narrow" w:hAnsi="Arial Narrow"/>
-              </w:rPr>
-              <w:t>atau</w:t>
-            </w:r>
-            <w:proofErr w:type="spellEnd"/>
-            <w:r>
-              <w:rPr>
-                <w:rFonts w:ascii="Arial Narrow" w:hAnsi="Arial Narrow"/>
-              </w:rPr>
-              <w:t xml:space="preserve"> orang y</w:t>
-            </w:r>
-            <w:r>
-              <w:rPr>
-                <w:rFonts w:ascii="Arial Narrow" w:hAnsi="Arial Narrow"/>
-              </w:rPr>
-              <w:t xml:space="preserve">ang </w:t>
-            </w:r>
-            <w:proofErr w:type="spellStart"/>
-            <w:r>
-              <w:rPr>
-                <w:rFonts w:ascii="Arial Narrow" w:hAnsi="Arial Narrow"/>
-              </w:rPr>
-              <w:t>ditunjuk</w:t>
-            </w:r>
-            <w:proofErr w:type="spellEnd"/>
-            <w:r>
-              <w:rPr>
-                <w:rFonts w:ascii="Arial Narrow" w:hAnsi="Arial Narrow"/>
-              </w:rPr>
-              <w:t xml:space="preserve"> oleh </w:t>
-            </w:r>
-            <w:proofErr w:type="spellStart"/>
-            <w:r>
-              <w:rPr>
-                <w:rFonts w:ascii="Arial Narrow" w:hAnsi="Arial Narrow"/>
-              </w:rPr>
-              <w:t>tersangka</w:t>
-            </w:r>
-            <w:proofErr w:type="spellEnd"/>
-            <w:r>
-              <w:rPr>
-                <w:rFonts w:ascii="Arial Narrow" w:hAnsi="Arial Narrow"/>
-              </w:rPr>
-              <w:t>;</w:t>
-            </w:r>
-          </w:p>
-        </w:tc>
-      </w:tr>
-      <w:tr>
-        <w:tc>
-          <w:tcPr>
-            <w:tcW w:w="1530" w:type="dxa"/>
-          </w:tcPr>
-          <w:p>
-            <w:pPr>
-              <w:rPr>
-                <w:rFonts w:ascii="Arial Narrow" w:hAnsi="Arial Narrow"/>
-              </w:rPr>
-            </w:pPr>
-          </w:p>
-        </w:tc>
-        <w:tc>
-          <w:tcPr>
-            <w:tcW w:w="360" w:type="dxa"/>
-          </w:tcPr>
-          <w:p>
-            <w:pPr>
-              <w:rPr>
-                <w:rFonts w:ascii="Arial Narrow" w:hAnsi="Arial Narrow"/>
-              </w:rPr>
-            </w:pPr>
-          </w:p>
-        </w:tc>
-        <w:tc>
-          <w:tcPr>
-            <w:tcW w:w="450" w:type="dxa"/>
-          </w:tcPr>
-          <w:p>
-            <w:pPr>
-              <w:rPr>
-                <w:rFonts w:ascii="Arial Narrow" w:hAnsi="Arial Narrow"/>
-              </w:rPr>
-            </w:pPr>
-            <w:r>
-              <w:rPr>
-                <w:rFonts w:ascii="Arial Narrow" w:hAnsi="Arial Narrow"/>
-              </w:rPr>
-              <w:t>5.</w:t>
-            </w:r>
-          </w:p>
-        </w:tc>
-        <w:tc>
-          <w:tcPr>
-            <w:tcW w:w="6772" w:type="dxa"/>
-            <w:gridSpan w:val="4"/>
-          </w:tcPr>
-          <w:p>
-            <w:pPr>
-              <w:rPr>
-                <w:rFonts w:ascii="Arial Narrow" w:hAnsi="Arial Narrow"/>
-                <w:lang w:val="fi-FI"/>
-              </w:rPr>
-            </w:pPr>
-            <w:r>
-              <w:rPr>
-                <w:rFonts w:ascii="Arial Narrow" w:hAnsi="Arial Narrow"/>
-                <w:lang w:val="fi-FI"/>
-              </w:rPr>
-              <w:t>melaksanakan perintah ini dengan saksama dan penuh rasa tanggung jawab dan membuat Berita Acara Penahanan serta melaporkan kepada Atasan Penyidik</w:t>
-            </w:r>
-          </w:p>
-        </w:tc>
-      </w:tr>
-      <w:tr>
-        <w:tc>
-          <w:tcPr>
-            <w:tcW w:w="1530" w:type="dxa"/>
-          </w:tcPr>
-          <w:p>
-            <w:pPr>
-              <w:rPr>
-                <w:rFonts w:ascii="Arial Narrow" w:hAnsi="Arial Narrow"/>
-              </w:rPr>
-            </w:pPr>
-            <w:proofErr w:type="spellStart"/>
+              </w:rPr>
+            </w:pPr>
             <w:r>
               <w:rPr>
                 <w:rFonts w:ascii="Arial Narrow" w:hAnsi="Arial Narrow"/>
               </w:rPr>
               <w:t>Selesai</w:t>
             </w:r>
-            <w:proofErr w:type="spellEnd"/>
           </w:p>
         </w:tc>
         <w:tc>
@@ -6299,21 +3550,7 @@
               <w:rPr>
                 <w:rFonts w:ascii="Arial Narrow" w:hAnsi="Arial Narrow"/>
               </w:rPr>
-              <w:t>${</w:t>
-            </w:r>
-            <w:proofErr w:type="spellStart"/>
-            <w:r>
-              <w:rPr>
-                <w:rFonts w:ascii="Arial Narrow" w:hAnsi="Arial Narrow"/>
-              </w:rPr>
-              <w:t>signatoryHeadText</w:t>
-            </w:r>
-            <w:proofErr w:type="spellEnd"/>
-            <w:r>
-              <w:rPr>
-                <w:rFonts w:ascii="Arial Narrow" w:hAnsi="Arial Narrow"/>
-              </w:rPr>
-              <w:t>}</w:t>
+              <w:t>${signatoryHeadText}</w:t>
             </w:r>
           </w:p>
         </w:tc>
@@ -6387,7 +3624,6 @@
               </w:rPr>
               <w:t>${</w:t>
             </w:r>
-            <w:proofErr w:type="spellStart"/>
             <w:r>
               <w:rPr>
                 <w:rFonts w:ascii="Arial Narrow" w:hAnsi="Arial Narrow"/>
@@ -6406,7 +3642,6 @@
               </w:rPr>
               <w:t>HeadText</w:t>
             </w:r>
-            <w:proofErr w:type="spellEnd"/>
             <w:r>
               <w:rPr>
                 <w:rFonts w:ascii="Arial Narrow" w:hAnsi="Arial Narrow"/>
@@ -6602,21 +3837,7 @@
               <w:rPr>
                 <w:rFonts w:ascii="Arial Narrow" w:hAnsi="Arial Narrow"/>
               </w:rPr>
-              <w:t>${</w:t>
-            </w:r>
-            <w:proofErr w:type="spellStart"/>
-            <w:r>
-              <w:rPr>
-                <w:rFonts w:ascii="Arial Narrow" w:hAnsi="Arial Narrow"/>
-              </w:rPr>
-              <w:t>signatoryName</w:t>
-            </w:r>
-            <w:proofErr w:type="spellEnd"/>
-            <w:r>
-              <w:rPr>
-                <w:rFonts w:ascii="Arial Narrow" w:hAnsi="Arial Narrow"/>
-              </w:rPr>
-              <w:t>}</w:t>
+              <w:t>${signatoryName}</w:t>
             </w:r>
           </w:p>
         </w:tc>
@@ -6667,21 +3888,7 @@
               <w:rPr>
                 <w:rFonts w:ascii="Arial Narrow" w:hAnsi="Arial Narrow"/>
               </w:rPr>
-              <w:t>${</w:t>
-            </w:r>
-            <w:proofErr w:type="spellStart"/>
-            <w:r>
-              <w:rPr>
-                <w:rFonts w:ascii="Arial Narrow" w:hAnsi="Arial Narrow"/>
-              </w:rPr>
-              <w:t>signatoryName</w:t>
-            </w:r>
-            <w:proofErr w:type="spellEnd"/>
-            <w:r>
-              <w:rPr>
-                <w:rFonts w:ascii="Arial Narrow" w:hAnsi="Arial Narrow"/>
-              </w:rPr>
-              <w:t>}</w:t>
+              <w:t>${signatoryName}</w:t>
             </w:r>
           </w:p>
         </w:tc>
@@ -6711,7 +3918,6 @@
               </w:rPr>
               <w:t>${</w:t>
             </w:r>
-            <w:proofErr w:type="spellStart"/>
             <w:r>
               <w:rPr>
                 <w:rFonts w:ascii="Arial Narrow" w:eastAsia="Arial Narrow" w:hAnsi="Arial Narrow"/>
@@ -6720,7 +3926,6 @@
               </w:rPr>
               <w:t>signatoryRankName</w:t>
             </w:r>
-            <w:proofErr w:type="spellEnd"/>
             <w:r>
               <w:rPr>
                 <w:rFonts w:ascii="Arial Narrow" w:eastAsia="Arial Narrow" w:hAnsi="Arial Narrow"/>
@@ -6729,7 +3934,6 @@
               </w:rPr>
               <w:t>} NRP ${</w:t>
             </w:r>
-            <w:proofErr w:type="spellStart"/>
             <w:r>
               <w:rPr>
                 <w:rFonts w:ascii="Arial Narrow" w:eastAsia="Arial Narrow" w:hAnsi="Arial Narrow"/>
@@ -6738,7 +3942,6 @@
               </w:rPr>
               <w:t>signatoryRegisterNumber</w:t>
             </w:r>
-            <w:proofErr w:type="spellEnd"/>
             <w:r>
               <w:rPr>
                 <w:rFonts w:ascii="Arial Narrow" w:eastAsia="Arial Narrow" w:hAnsi="Arial Narrow"/>
@@ -6800,7 +4003,6 @@
               </w:rPr>
               <w:t>${</w:t>
             </w:r>
-            <w:proofErr w:type="spellStart"/>
             <w:r>
               <w:rPr>
                 <w:rFonts w:ascii="Arial Narrow" w:eastAsia="Arial Narrow" w:hAnsi="Arial Narrow"/>
@@ -6809,7 +4011,6 @@
               </w:rPr>
               <w:t>signatoryRankName</w:t>
             </w:r>
-            <w:proofErr w:type="spellEnd"/>
             <w:r>
               <w:rPr>
                 <w:rFonts w:ascii="Arial Narrow" w:eastAsia="Arial Narrow" w:hAnsi="Arial Narrow"/>
@@ -6818,7 +4019,6 @@
               </w:rPr>
               <w:t>} NRP ${</w:t>
             </w:r>
-            <w:proofErr w:type="spellStart"/>
             <w:r>
               <w:rPr>
                 <w:rFonts w:ascii="Arial Narrow" w:eastAsia="Arial Narrow" w:hAnsi="Arial Narrow"/>
@@ -6827,7 +4027,6 @@
               </w:rPr>
               <w:t>signatoryRegisterNumber</w:t>
             </w:r>
-            <w:proofErr w:type="spellEnd"/>
             <w:r>
               <w:rPr>
                 <w:rFonts w:ascii="Arial Narrow" w:eastAsia="Arial Narrow" w:hAnsi="Arial Narrow"/>
@@ -6912,7 +4111,56 @@
                 <w:rFonts w:ascii="Arial Narrow" w:hAnsi="Arial Narrow"/>
                 <w:lang w:val="fi-FI"/>
               </w:rPr>
-              <w:t>----- Pada hari ini ... tanggal ...</w:t>
+              <w:t xml:space="preserve">----- Pada hari ini </w:t>
+            </w:r>
+            <w:r>
+              <w:rPr>
+                <w:rFonts w:ascii="Arial Narrow" w:hAnsi="Arial Narrow"/>
+                <w:lang w:val="fi-FI"/>
+              </w:rPr>
+              <w:t>${download</w:t>
+            </w:r>
+            <w:r>
+              <w:rPr>
+                <w:rFonts w:ascii="Arial Narrow" w:hAnsi="Arial Narrow"/>
+                <w:lang w:val="fi-FI"/>
+              </w:rPr>
+              <w:t>Day</w:t>
+            </w:r>
+            <w:r>
+              <w:rPr>
+                <w:rFonts w:ascii="Arial Narrow" w:hAnsi="Arial Narrow"/>
+                <w:lang w:val="fi-FI"/>
+              </w:rPr>
+              <w:t>}</w:t>
+            </w:r>
+            <w:r>
+              <w:rPr>
+                <w:rFonts w:ascii="Arial Narrow" w:hAnsi="Arial Narrow"/>
+                <w:lang w:val="fi-FI"/>
+              </w:rPr>
+              <w:t xml:space="preserve"> tanggal </w:t>
+            </w:r>
+            <w:r>
+              <w:rPr>
+                <w:rFonts w:ascii="Arial Narrow" w:hAnsi="Arial Narrow"/>
+                <w:lang w:val="fi-FI"/>
+              </w:rPr>
+              <w:t>${download</w:t>
+            </w:r>
+            <w:r>
+              <w:rPr>
+                <w:rFonts w:ascii="Arial Narrow" w:hAnsi="Arial Narrow"/>
+                <w:lang w:val="fi-FI"/>
+              </w:rPr>
+              <w:t>Date</w:t>
+            </w:r>
+            <w:r>
+              <w:rPr>
+                <w:rFonts w:ascii="Arial Narrow" w:hAnsi="Arial Narrow"/>
+                <w:lang w:val="fi-FI"/>
+              </w:rPr>
+              <w:t>}</w:t>
             </w:r>
             <w:r>
               <w:rPr>
@@ -7393,21 +4641,7 @@
               <w:rPr>
                 <w:rFonts w:ascii="Arial Narrow" w:hAnsi="Arial Narrow"/>
               </w:rPr>
-              <w:t>${</w:t>
-            </w:r>
-            <w:proofErr w:type="spellStart"/>
-            <w:r>
-              <w:rPr>
-                <w:rFonts w:ascii="Arial Narrow" w:hAnsi="Arial Narrow"/>
-              </w:rPr>
-              <w:t>signatoryName</w:t>
-            </w:r>
-            <w:proofErr w:type="spellEnd"/>
-            <w:r>
-              <w:rPr>
-                <w:rFonts w:ascii="Arial Narrow" w:hAnsi="Arial Narrow"/>
-              </w:rPr>
-              <w:t>}</w:t>
+              <w:t>${signatoryName}</w:t>
             </w:r>
           </w:p>
         </w:tc>
@@ -7481,7 +4715,6 @@
               </w:rPr>
               <w:t>${</w:t>
             </w:r>
-            <w:proofErr w:type="spellStart"/>
             <w:r>
               <w:rPr>
                 <w:rFonts w:ascii="Arial Narrow" w:eastAsia="Arial Narrow" w:hAnsi="Arial Narrow"/>
@@ -7490,7 +4723,6 @@
               </w:rPr>
               <w:t>signatoryRankName</w:t>
             </w:r>
-            <w:proofErr w:type="spellEnd"/>
             <w:r>
               <w:rPr>
                 <w:rFonts w:ascii="Arial Narrow" w:eastAsia="Arial Narrow" w:hAnsi="Arial Narrow"/>
@@ -7499,7 +4731,6 @@
               </w:rPr>
               <w:t>} NRP ${</w:t>
             </w:r>
-            <w:proofErr w:type="spellStart"/>
             <w:r>
               <w:rPr>
                 <w:rFonts w:ascii="Arial Narrow" w:eastAsia="Arial Narrow" w:hAnsi="Arial Narrow"/>
@@ -7508,7 +4739,6 @@
               </w:rPr>
               <w:t>signatoryRegisterNumber</w:t>
             </w:r>
-            <w:proofErr w:type="spellEnd"/>
             <w:r>
               <w:rPr>
                 <w:rFonts w:ascii="Arial Narrow" w:eastAsia="Arial Narrow" w:hAnsi="Arial Narrow"/>

</xml_diff>

<commit_message>
Update Surat Perintah Penahanan
</commit_message>
<xml_diff>
--- a/public/word-template/surat_perintah_penahanan.docx
+++ b/public/word-template/surat_perintah_penahanan.docx
@@ -107,7 +107,7 @@
           <w:noProof/>
         </w:rPr>
         <w:drawing>
-          <wp:inline distT="0" distB="0" distL="0" distR="0" wp14:anchorId="7944377A" wp14:editId="2CD6D9AA">
+          <wp:inline distT="0" distB="0" distL="0" distR="0" wp14:anchorId="7944377A" wp14:editId="343D2488">
             <wp:extent cx="738127" cy="690404"/>
             <wp:effectExtent l="0" t="0" r="5080" b="0"/>
             <wp:docPr id="6" name="Picture 6"/>
@@ -376,169 +376,7 @@
               <w:rPr>
                 <w:rFonts w:ascii="Arial Narrow" w:hAnsi="Arial Narrow"/>
               </w:rPr>
-              <w:t xml:space="preserve">bahwa dalam rangka kepentingan </w:t>
-            </w:r>
-            <w:r>
-              <w:rPr>
-                <w:rFonts w:ascii="Arial Narrow" w:hAnsi="Arial Narrow"/>
-              </w:rPr>
-              <w:t>penyidikan dan berdasarkan hasil pemeriksaan, tersangk</w:t>
-            </w:r>
-            <w:r>
-              <w:rPr>
-                <w:rFonts w:ascii="Arial Narrow" w:hAnsi="Arial Narrow"/>
-              </w:rPr>
-              <w:t xml:space="preserve">a diduga melakukan tindak pidana berdasarkan minimal 2 (dua) </w:t>
-            </w:r>
-            <w:r>
-              <w:rPr>
-                <w:rFonts w:ascii="Arial Narrow" w:hAnsi="Arial Narrow"/>
-              </w:rPr>
-              <w:t>alat bukti yang sah, jika tersangka: mengabaikan panggilan penyidik</w:t>
-            </w:r>
-            <w:r>
-              <w:rPr>
-                <w:rFonts w:ascii="Arial Narrow" w:hAnsi="Arial Narrow"/>
-              </w:rPr>
-              <w:t xml:space="preserve"> sebanyak 2 (dua) kali berturut-turut tanpa alasan yang sah atau memberikan informasi tidak sesuai fakta pada saat pemeriksaan atau menghambat pros</w:t>
-            </w:r>
-            <w:r>
-              <w:rPr>
-                <w:rFonts w:ascii="Arial Narrow" w:hAnsi="Arial Narrow"/>
-              </w:rPr>
-              <w:t xml:space="preserve">es pemeriksaan atau berupaya melarikan </w:t>
-            </w:r>
-            <w:r>
-              <w:rPr>
-                <w:rFonts w:ascii="Arial Narrow" w:hAnsi="Arial Narrow"/>
-              </w:rPr>
-              <w:t xml:space="preserve">diri atau berupaya merusak dan menghilangkan </w:t>
-            </w:r>
-            <w:r>
-              <w:rPr>
-                <w:rFonts w:ascii="Arial Narrow" w:hAnsi="Arial Narrow"/>
-              </w:rPr>
-              <w:t>barang bukti atau</w:t>
-            </w:r>
-            <w:r>
-              <w:rPr>
-                <w:rFonts w:ascii="Arial Narrow" w:hAnsi="Arial Narrow"/>
-              </w:rPr>
-              <w:t xml:space="preserve"> melakukan </w:t>
-            </w:r>
-            <w:r>
-              <w:rPr>
-                <w:rFonts w:ascii="Arial Narrow" w:hAnsi="Arial Narrow"/>
-              </w:rPr>
-              <w:t xml:space="preserve">ulang tindak pidana atau terancam keselamatannya atas persetujuaan </w:t>
-            </w:r>
-            <w:r>
-              <w:rPr>
-                <w:rFonts w:ascii="Arial Narrow" w:hAnsi="Arial Narrow"/>
-              </w:rPr>
-              <w:t xml:space="preserve">atau </w:t>
-            </w:r>
-            <w:r>
-              <w:rPr>
-                <w:rFonts w:ascii="Arial Narrow" w:hAnsi="Arial Narrow"/>
-              </w:rPr>
-              <w:t>permintaa</w:t>
-            </w:r>
-            <w:r>
-              <w:rPr>
-                <w:rFonts w:ascii="Arial Narrow" w:hAnsi="Arial Narrow"/>
-              </w:rPr>
-              <w:t xml:space="preserve">n tersangka atau </w:t>
-            </w:r>
-            <w:r>
-              <w:rPr>
-                <w:rFonts w:ascii="Arial Narrow" w:hAnsi="Arial Narrow"/>
-              </w:rPr>
-              <w:t xml:space="preserve">mempengaruhi saksi </w:t>
-            </w:r>
-            <w:r>
-              <w:rPr>
-                <w:rFonts w:ascii="Arial Narrow" w:hAnsi="Arial Narrow"/>
-              </w:rPr>
-              <w:t>untuk</w:t>
-            </w:r>
-            <w:r>
-              <w:rPr>
-                <w:rFonts w:ascii="Arial Narrow" w:hAnsi="Arial Narrow"/>
-              </w:rPr>
-              <w:t xml:space="preserve"> tidak mengatakan sebenarnya, tersangka yang diduga </w:t>
-            </w:r>
-            <w:r>
-              <w:rPr>
-                <w:rFonts w:ascii="Arial Narrow" w:hAnsi="Arial Narrow"/>
-              </w:rPr>
-              <w:t xml:space="preserve">melakukan tindak pidana </w:t>
-            </w:r>
-            <w:r>
-              <w:rPr>
-                <w:rFonts w:ascii="Arial Narrow" w:hAnsi="Arial Narrow"/>
-              </w:rPr>
-              <w:t xml:space="preserve">atau melakukan percobaan </w:t>
-            </w:r>
-            <w:r>
-              <w:rPr>
-                <w:rFonts w:ascii="Arial Narrow" w:hAnsi="Arial Narrow"/>
-              </w:rPr>
-              <w:t xml:space="preserve">atau pembantuan melakukan tindak pidana yang diancam dengan pidana </w:t>
-            </w:r>
-            <w:r>
-              <w:rPr>
-                <w:rFonts w:ascii="Arial Narrow" w:hAnsi="Arial Narrow"/>
-              </w:rPr>
-              <w:t>…. Tahun atau lebih atau ti</w:t>
-            </w:r>
-            <w:r>
-              <w:rPr>
-                <w:rFonts w:ascii="Arial Narrow" w:hAnsi="Arial Narrow"/>
-              </w:rPr>
-              <w:t>nda</w:t>
-            </w:r>
-            <w:r>
-              <w:rPr>
-                <w:rFonts w:ascii="Arial Narrow" w:hAnsi="Arial Narrow"/>
-              </w:rPr>
-              <w:t>k p</w:t>
-            </w:r>
-            <w:r>
-              <w:rPr>
-                <w:rFonts w:ascii="Arial Narrow" w:hAnsi="Arial Narrow"/>
-              </w:rPr>
-              <w:t>i</w:t>
-            </w:r>
-            <w:r>
-              <w:rPr>
-                <w:rFonts w:ascii="Arial Narrow" w:hAnsi="Arial Narrow"/>
-              </w:rPr>
-              <w:t xml:space="preserve">dana yang diatur khusus sesuai dengan Pasal </w:t>
-            </w:r>
-            <w:r>
-              <w:rPr>
-                <w:rFonts w:ascii="Arial Narrow" w:hAnsi="Arial Narrow"/>
-              </w:rPr>
-              <w:t xml:space="preserve">100 ayat (2) </w:t>
-            </w:r>
-            <w:r>
-              <w:rPr>
-                <w:rFonts w:ascii="Arial Narrow" w:hAnsi="Arial Narrow"/>
-              </w:rPr>
-              <w:t>KUHAP, dipandang per</w:t>
-            </w:r>
-            <w:r>
-              <w:rPr>
-                <w:rFonts w:ascii="Arial Narrow" w:hAnsi="Arial Narrow"/>
-              </w:rPr>
-              <w:t>lu</w:t>
-            </w:r>
-            <w:r>
-              <w:rPr>
-                <w:rFonts w:ascii="Arial Narrow" w:hAnsi="Arial Narrow"/>
-              </w:rPr>
-              <w:t xml:space="preserve"> mengeluarkan surat perintah.</w:t>
+              <w:t>bahwa dalam rangka kepentingan penyidikan dan berdasarkan hasil pemeriksaan, tersangka diduga melakukan tindak pidana berdasarkan minimal 2 (dua) alat bukti yang sah, jika tersangka: mengabaikan panggilan penyidik sebanyak 2 (dua) kali berturut-turut tanpa alasanyang sah atau memberikan informasi tidak sesuai fakta pada saat pemeriksaan atau menghambat proses pemeriksaan atau berupaya melarikan diri atau berupaya merusak dan menghilangkan barang bukti atau melakukan ulang tindak pidana atau terancam keselamatannya atas persetujuan atau permintaan tersangka atau mempengaruhi saksi untuk tidak mengatakan sebenarnya, tersangka yang diduga melakuan tindak pidana atau melakukan percobaan atau pembantuan melakukan tindak pidana yang diancam dengan pidana penjara 5 (lima) tahun atau lebih atau tindak pidana yang diatur khusus sesuai dengan Pasal 100 ayat (2) KUHAP, dipandang perlu mengeluarkan surat perintah.</w:t>
             </w:r>
           </w:p>
         </w:tc>
@@ -2975,6 +2813,44 @@
                 <w:lang w:val="fi-FI"/>
               </w:rPr>
               <w:t>${tempat_penahanan}</w:t>
+            </w:r>
+          </w:p>
+          <w:p>
+            <w:pPr>
+              <w:rPr>
+                <w:rFonts w:ascii="Arial Narrow" w:hAnsi="Arial Narrow"/>
+                <w:lang w:val="fi-FI"/>
+              </w:rPr>
+            </w:pPr>
+            <w:r>
+              <w:rPr>
+                <w:rFonts w:ascii="Arial Narrow" w:hAnsi="Arial Narrow"/>
+              </w:rPr>
+              <w:t xml:space="preserve">untuk selama 20 hari terhitung mulai tanggal </w:t>
+            </w:r>
+            <w:r>
+              <w:rPr>
+                <w:rFonts w:ascii="Arial Narrow" w:hAnsi="Arial Narrow"/>
+              </w:rPr>
+              <w:t>${detentionStartDate}</w:t>
+            </w:r>
+            <w:r>
+              <w:rPr>
+                <w:rFonts w:ascii="Arial Narrow" w:hAnsi="Arial Narrow"/>
+              </w:rPr>
+              <w:t xml:space="preserve"> s.d. </w:t>
+            </w:r>
+            <w:r>
+              <w:rPr>
+                <w:rFonts w:ascii="Arial Narrow" w:hAnsi="Arial Narrow"/>
+              </w:rPr>
+              <w:t>${detentionEndDate}</w:t>
+            </w:r>
+            <w:r>
+              <w:rPr>
+                <w:rFonts w:ascii="Arial Narrow" w:hAnsi="Arial Narrow"/>
+              </w:rPr>
+              <w:t>;</w:t>
             </w:r>
           </w:p>
         </w:tc>
@@ -5802,7 +5678,6 @@
   <w:style w:type="character" w:default="1" w:styleId="DefaultParagraphFont">
     <w:name w:val="Default Paragraph Font"/>
     <w:uiPriority w:val="1"/>
-    <w:semiHidden/>
     <w:unhideWhenUsed/>
   </w:style>
   <w:style w:type="table" w:default="1" w:styleId="TableNormal">

</xml_diff>

<commit_message>
Update Surat Perintah Penangguhan Penahanan
</commit_message>
<xml_diff>
--- a/public/word-template/surat_perintah_penahanan.docx
+++ b/public/word-template/surat_perintah_penahanan.docx
@@ -149,7 +149,7 @@
           <w:noProof/>
         </w:rPr>
         <w:drawing>
-          <wp:inline distT="0" distB="0" distL="0" distR="0" wp14:anchorId="7944377A" wp14:editId="49B04BDC">
+          <wp:inline distT="0" distB="0" distL="0" distR="0" wp14:anchorId="7944377A" wp14:editId="74C8B587">
             <wp:extent cx="738127" cy="690404"/>
             <wp:effectExtent l="0" t="0" r="5080" b="0"/>
             <wp:docPr id="6" name="Picture 6"/>
@@ -203,6 +203,7 @@
           <w:insideH w:val="none" w:sz="0" w:space="0" w:color="auto"/>
           <w:insideV w:val="none" w:sz="0" w:space="0" w:color="auto"/>
         </w:tblBorders>
+        <w:tblLayout w:type="fixed"/>
         <w:tblCellMar>
           <w:left w:w="0" w:type="dxa"/>
           <w:right w:w="0" w:type="dxa"/>
@@ -239,6 +240,7 @@
                 <w:insideH w:val="none" w:sz="0" w:space="0" w:color="auto"/>
                 <w:insideV w:val="none" w:sz="0" w:space="0" w:color="auto"/>
               </w:tblBorders>
+              <w:tblLayout w:type="fixed"/>
               <w:tblCellMar>
                 <w:left w:w="0" w:type="dxa"/>
                 <w:right w:w="0" w:type="dxa"/>
@@ -3391,6 +3393,7 @@
                 <w:insideH w:val="none" w:sz="0" w:space="0" w:color="auto"/>
                 <w:insideV w:val="none" w:sz="0" w:space="0" w:color="auto"/>
               </w:tblBorders>
+              <w:tblLayout w:type="fixed"/>
               <w:tblCellMar>
                 <w:left w:w="0" w:type="dxa"/>
                 <w:right w:w="0" w:type="dxa"/>
@@ -3444,6 +3447,7 @@
                       <w:insideH w:val="none" w:sz="0" w:space="0" w:color="auto"/>
                       <w:insideV w:val="none" w:sz="0" w:space="0" w:color="auto"/>
                     </w:tblBorders>
+                    <w:tblLayout w:type="fixed"/>
                     <w:tblCellMar>
                       <w:left w:w="0" w:type="dxa"/>
                       <w:right w:w="0" w:type="dxa"/>
@@ -3457,7 +3461,7 @@
                   <w:tr>
                     <w:tc>
                       <w:tcPr>
-                        <w:tcW w:w="0" w:type="auto"/>
+                        <w:tcW w:w="624" w:type="dxa"/>
                         <w:vMerge w:val="restart"/>
                       </w:tcPr>
                       <w:tbl>
@@ -3472,6 +3476,7 @@
                             <w:insideH w:val="none" w:sz="0" w:space="0" w:color="auto"/>
                             <w:insideV w:val="none" w:sz="0" w:space="0" w:color="auto"/>
                           </w:tblBorders>
+                          <w:tblLayout w:type="fixed"/>
                           <w:tblCellMar>
                             <w:left w:w="0" w:type="dxa"/>
                             <w:right w:w="0" w:type="dxa"/>
@@ -3479,7 +3484,7 @@
                           <w:tblLook w:val="04A0" w:firstRow="1" w:lastRow="0" w:firstColumn="1" w:lastColumn="0" w:noHBand="0" w:noVBand="1"/>
                         </w:tblPr>
                         <w:tblGrid>
-                          <w:gridCol w:w="624"/>
+                          <w:gridCol w:w="447"/>
                         </w:tblGrid>
                         <w:tr>
                           <w:trPr>
@@ -3515,7 +3520,7 @@
                     </w:tc>
                     <w:tc>
                       <w:tcPr>
-                        <w:tcW w:w="0" w:type="auto"/>
+                        <w:tcW w:w="4870" w:type="dxa"/>
                         <w:tcBorders>
                           <w:bottom w:val="single" w:sz="4" w:space="0" w:color="auto"/>
                         </w:tcBorders>
@@ -3635,7 +3640,7 @@
                     </w:trPr>
                     <w:tc>
                       <w:tcPr>
-                        <w:tcW w:w="0" w:type="auto"/>
+                        <w:tcW w:w="624" w:type="dxa"/>
                         <w:vMerge/>
                       </w:tcPr>
                       <w:p>
@@ -3648,7 +3653,7 @@
                     </w:tc>
                     <w:tc>
                       <w:tcPr>
-                        <w:tcW w:w="0" w:type="auto"/>
+                        <w:tcW w:w="4870" w:type="dxa"/>
                         <w:tcBorders>
                           <w:top w:val="single" w:sz="4" w:space="0" w:color="auto"/>
                         </w:tcBorders>
@@ -6109,7 +6114,7 @@
     <w:tbl>
       <w:tblPr>
         <w:tblStyle w:val="TableGrid"/>
-        <w:tblW w:w="9135" w:type="dxa"/>
+        <w:tblW w:w="0" w:type="auto"/>
         <w:tblBorders>
           <w:top w:val="none" w:sz="0" w:space="0" w:color="auto"/>
           <w:left w:val="none" w:sz="0" w:space="0" w:color="auto"/>
@@ -6118,6 +6123,7 @@
           <w:insideH w:val="none" w:sz="0" w:space="0" w:color="auto"/>
           <w:insideV w:val="none" w:sz="0" w:space="0" w:color="auto"/>
         </w:tblBorders>
+        <w:tblLayout w:type="fixed"/>
         <w:tblCellMar>
           <w:left w:w="0" w:type="dxa"/>
           <w:right w:w="0" w:type="dxa"/>
@@ -6693,6 +6699,7 @@
                 <w:insideH w:val="none" w:sz="0" w:space="0" w:color="auto"/>
                 <w:insideV w:val="none" w:sz="0" w:space="0" w:color="auto"/>
               </w:tblBorders>
+              <w:tblLayout w:type="fixed"/>
               <w:tblCellMar>
                 <w:left w:w="0" w:type="dxa"/>
                 <w:right w:w="0" w:type="dxa"/>
@@ -6708,7 +6715,7 @@
               </w:trPr>
               <w:tc>
                 <w:tcPr>
-                  <w:tcW w:w="0" w:type="auto"/>
+                  <w:tcW w:w="1565" w:type="dxa"/>
                 </w:tcPr>
                 <w:p>
                   <w:pPr>
@@ -6796,6 +6803,7 @@
                 <w:insideH w:val="none" w:sz="0" w:space="0" w:color="auto"/>
                 <w:insideV w:val="none" w:sz="0" w:space="0" w:color="auto"/>
               </w:tblBorders>
+              <w:tblLayout w:type="fixed"/>
               <w:tblCellMar>
                 <w:left w:w="0" w:type="dxa"/>
                 <w:right w:w="0" w:type="dxa"/>
@@ -6811,7 +6819,7 @@
               </w:trPr>
               <w:tc>
                 <w:tcPr>
-                  <w:tcW w:w="0" w:type="auto"/>
+                  <w:tcW w:w="1565" w:type="dxa"/>
                 </w:tcPr>
                 <w:p>
                   <w:pPr>
@@ -7591,6 +7599,7 @@
                 <w:insideH w:val="none" w:sz="0" w:space="0" w:color="auto"/>
                 <w:insideV w:val="none" w:sz="0" w:space="0" w:color="auto"/>
               </w:tblBorders>
+              <w:tblLayout w:type="fixed"/>
               <w:tblCellMar>
                 <w:left w:w="0" w:type="dxa"/>
                 <w:right w:w="0" w:type="dxa"/>
@@ -7606,7 +7615,7 @@
               </w:trPr>
               <w:tc>
                 <w:tcPr>
-                  <w:tcW w:w="0" w:type="auto"/>
+                  <w:tcW w:w="1565" w:type="dxa"/>
                 </w:tcPr>
                 <w:p>
                   <w:pPr>

</xml_diff>